<commit_message>
Fix formatting and clarity in player battle worksheet; adjust spacing for better readability.
</commit_message>
<xml_diff>
--- a/docs/worksheets/worksheet_tile_sounds.docx
+++ b/docs/worksheets/worksheet_tile_sounds.docx
@@ -1,31 +1,39 @@
 
 <file path=word/document.xml><?xml version="1.0" encoding="utf-8"?>
-<w:document xmlns:wpc="http://schemas.microsoft.com/office/word/2010/wordprocessingCanvas" xmlns:mc="http://schemas.openxmlformats.org/markup-compatibility/2006" xmlns:o="urn:schemas-microsoft-com:office:office" xmlns:r="http://schemas.openxmlformats.org/officeDocument/2006/relationships" xmlns:m="http://schemas.openxmlformats.org/officeDocument/2006/math" xmlns:v="urn:schemas-microsoft-com:vml" xmlns:wp14="http://schemas.microsoft.com/office/word/2010/wordprocessingDrawing" xmlns:wp="http://schemas.openxmlformats.org/drawingml/2006/wordprocessingDrawing" xmlns:w10="urn:schemas-microsoft-com:office:word" xmlns:w="http://schemas.openxmlformats.org/wordprocessingml/2006/main" xmlns:w14="http://schemas.microsoft.com/office/word/2010/wordml" xmlns:w15="http://schemas.microsoft.com/office/word/2012/wordml" xmlns:wpg="http://schemas.microsoft.com/office/word/2010/wordprocessingGroup" xmlns:wpi="http://schemas.microsoft.com/office/word/2010/wordprocessingInk" xmlns:wne="http://schemas.microsoft.com/office/word/2006/wordml" xmlns:wps="http://schemas.microsoft.com/office/word/2010/wordprocessingShape" xmlns:cx="http://schemas.microsoft.com/office/drawing/2014/chartex" xmlns:cx1="http://schemas.microsoft.com/office/drawing/2015/9/8/chartex" xmlns:cx2="http://schemas.microsoft.com/office/drawing/2015/10/21/chartex" xmlns:cx3="http://schemas.microsoft.com/office/drawing/2016/5/9/chartex" xmlns:cx4="http://schemas.microsoft.com/office/drawing/2016/5/10/chartex" xmlns:cx5="http://schemas.microsoft.com/office/drawing/2016/5/11/chartex" xmlns:cx6="http://schemas.microsoft.com/office/drawing/2016/5/12/chartex" xmlns:cx7="http://schemas.microsoft.com/office/drawing/2016/5/13/chartex" xmlns:cx8="http://schemas.microsoft.com/office/drawing/2016/5/14/chartex" xmlns:aink="http://schemas.microsoft.com/office/drawing/2016/ink" xmlns:am3d="http://schemas.microsoft.com/office/drawing/2017/model3d" xmlns:w16cex="http://schemas.microsoft.com/office/word/2018/wordml/cex" xmlns:w16cid="http://schemas.microsoft.com/office/word/2016/wordml/cid" xmlns:w16="http://schemas.microsoft.com/office/word/2018/wordml" xmlns:w16sdtdh="http://schemas.microsoft.com/office/word/2020/wordml/sdtdatahash" xmlns:w16se="http://schemas.microsoft.com/office/word/2015/wordml/symex" mc:Ignorable="w14 w15 wp14">
+<w:document xmlns:wpc="http://schemas.microsoft.com/office/word/2010/wordprocessingCanvas" xmlns:cx="http://schemas.microsoft.com/office/drawing/2014/chartex" xmlns:cx1="http://schemas.microsoft.com/office/drawing/2015/9/8/chartex" xmlns:cx2="http://schemas.microsoft.com/office/drawing/2015/10/21/chartex" xmlns:cx3="http://schemas.microsoft.com/office/drawing/2016/5/9/chartex" xmlns:cx4="http://schemas.microsoft.com/office/drawing/2016/5/10/chartex" xmlns:cx5="http://schemas.microsoft.com/office/drawing/2016/5/11/chartex" xmlns:cx6="http://schemas.microsoft.com/office/drawing/2016/5/12/chartex" xmlns:cx7="http://schemas.microsoft.com/office/drawing/2016/5/13/chartex" xmlns:cx8="http://schemas.microsoft.com/office/drawing/2016/5/14/chartex" xmlns:mc="http://schemas.openxmlformats.org/markup-compatibility/2006" xmlns:aink="http://schemas.microsoft.com/office/drawing/2016/ink" xmlns:am3d="http://schemas.microsoft.com/office/drawing/2017/model3d" xmlns:o="urn:schemas-microsoft-com:office:office" xmlns:oel="http://schemas.microsoft.com/office/2019/extlst" xmlns:r="http://schemas.openxmlformats.org/officeDocument/2006/relationships" xmlns:m="http://schemas.openxmlformats.org/officeDocument/2006/math" xmlns:v="urn:schemas-microsoft-com:vml" xmlns:wp14="http://schemas.microsoft.com/office/word/2010/wordprocessingDrawing" xmlns:wp="http://schemas.openxmlformats.org/drawingml/2006/wordprocessingDrawing" xmlns:w10="urn:schemas-microsoft-com:office:word" xmlns:w="http://schemas.openxmlformats.org/wordprocessingml/2006/main" xmlns:w14="http://schemas.microsoft.com/office/word/2010/wordml" xmlns:w15="http://schemas.microsoft.com/office/word/2012/wordml" xmlns:w16cex="http://schemas.microsoft.com/office/word/2018/wordml/cex" xmlns:w16cid="http://schemas.microsoft.com/office/word/2016/wordml/cid" xmlns:w16="http://schemas.microsoft.com/office/word/2018/wordml" xmlns:w16du="http://schemas.microsoft.com/office/word/2023/wordml/word16du" xmlns:w16sdtdh="http://schemas.microsoft.com/office/word/2020/wordml/sdtdatahash" xmlns:w16sdtfl="http://schemas.microsoft.com/office/word/2024/wordml/sdtformatlock" xmlns:w16se="http://schemas.microsoft.com/office/word/2015/wordml/symex" xmlns:wpg="http://schemas.microsoft.com/office/word/2010/wordprocessingGroup" xmlns:wpi="http://schemas.microsoft.com/office/word/2010/wordprocessingInk" xmlns:wne="http://schemas.microsoft.com/office/word/2006/wordml" xmlns:wps="http://schemas.microsoft.com/office/word/2010/wordprocessingShape" mc:Ignorable="w14 w15 w16se w16cid w16 w16cex w16sdtdh w16sdtfl w16du wp14">
   <w:body>
     <w:p>
       <w:pPr>
         <w:pStyle w:val="Heading1"/>
-        <w:spacing w:after="120" w:before="0"/>
-      </w:pPr>
-      <w:r>
-        <w:t xml:space="preserve">Worksheet - Add Sound Effects To Tiles (Easy)</w:t>
-      </w:r>
-    </w:p>
-    <w:p>
-      <w:pPr>
         <w:spacing w:after="120"/>
       </w:pPr>
       <w:r>
-        <w:t xml:space="preserve">The game already plays a chime when a star is collected. You will copy that pattern to give the hazard tile a sound of its own - then you can add sounds to anything.</w:t>
+        <w:t xml:space="preserve">Worksheet - Add Sound Effects </w:t>
+      </w:r>
+      <w:proofErr w:type="gramStart"/>
+      <w:r>
+        <w:t>To</w:t>
+      </w:r>
+      <w:proofErr w:type="gramEnd"/>
+      <w:r>
+        <w:t xml:space="preserve"> Tiles (Easy)</w:t>
+      </w:r>
+    </w:p>
+    <w:p>
+      <w:pPr>
+        <w:spacing w:after="120"/>
+      </w:pPr>
+      <w:r>
+        <w:t>The game already plays a chime when a star is collected. You will copy that pattern to give the hazard tile a sound of its own - then you can add sounds to anything.</w:t>
       </w:r>
     </w:p>
     <w:p>
       <w:pPr>
         <w:pStyle w:val="Heading2"/>
-        <w:spacing w:after="120" w:before="240"/>
-      </w:pPr>
-      <w:r>
-        <w:t xml:space="preserve">Part A - Get A Sound File</w:t>
+        <w:spacing w:before="240" w:after="120"/>
+      </w:pPr>
+      <w:r>
+        <w:t>Part A - Get A Sound File</w:t>
       </w:r>
     </w:p>
     <w:p>
@@ -45,7 +53,7 @@
           <w:b/>
           <w:bCs/>
         </w:rPr>
-        <w:t xml:space="preserve">kenney.nl/assets/digital-audio</w:t>
+        <w:t>kenney.nl/assets/digital-audio</w:t>
       </w:r>
       <w:r>
         <w:t xml:space="preserve"> and click </w:t>
@@ -55,10 +63,10 @@
           <w:b/>
           <w:bCs/>
         </w:rPr>
-        <w:t xml:space="preserve">Download</w:t>
-      </w:r>
-      <w:r>
-        <w:t xml:space="preserve">. (All Kenney sounds are CC0: free to use, no credit needed.)</w:t>
+        <w:t>Download</w:t>
+      </w:r>
+      <w:r>
+        <w:t>. (All Kenney sounds are CC0: free to use, no credit needed.)</w:t>
       </w:r>
     </w:p>
     <w:p>
@@ -75,25 +83,36 @@
       </w:r>
       <w:r>
         <w:rPr>
-          <w:rFonts w:ascii="Consolas" w:cs="Consolas" w:eastAsia="Consolas" w:hAnsi="Consolas"/>
-          <w:sz w:val="18"/>
-          <w:szCs w:val="18"/>
-          <w:shd w:fill="EEEEEE" w:val="clear"/>
-        </w:rPr>
-        <w:t xml:space="preserve">Audio</w:t>
+          <w:rFonts w:ascii="Consolas" w:eastAsia="Consolas" w:hAnsi="Consolas" w:cs="Consolas"/>
+          <w:sz w:val="18"/>
+          <w:szCs w:val="18"/>
+          <w:shd w:val="clear" w:color="auto" w:fill="EEEEEE"/>
+        </w:rPr>
+        <w:t>Audio</w:t>
       </w:r>
       <w:r>
         <w:t xml:space="preserve"> folder are lots of short </w:t>
       </w:r>
       <w:r>
         <w:rPr>
-          <w:rFonts w:ascii="Consolas" w:cs="Consolas" w:eastAsia="Consolas" w:hAnsi="Consolas"/>
-          <w:sz w:val="18"/>
-          <w:szCs w:val="18"/>
-          <w:shd w:fill="EEEEEE" w:val="clear"/>
-        </w:rPr>
-        <w:t xml:space="preserve">.ogg</w:t>
-      </w:r>
+          <w:rFonts w:ascii="Consolas" w:eastAsia="Consolas" w:hAnsi="Consolas" w:cs="Consolas"/>
+          <w:sz w:val="18"/>
+          <w:szCs w:val="18"/>
+          <w:shd w:val="clear" w:color="auto" w:fill="EEEEEE"/>
+        </w:rPr>
+        <w:t>.</w:t>
+      </w:r>
+      <w:proofErr w:type="spellStart"/>
+      <w:r>
+        <w:rPr>
+          <w:rFonts w:ascii="Consolas" w:eastAsia="Consolas" w:hAnsi="Consolas" w:cs="Consolas"/>
+          <w:sz w:val="18"/>
+          <w:szCs w:val="18"/>
+          <w:shd w:val="clear" w:color="auto" w:fill="EEEEEE"/>
+        </w:rPr>
+        <w:t>ogg</w:t>
+      </w:r>
+      <w:proofErr w:type="spellEnd"/>
       <w:r>
         <w:t xml:space="preserve"> sounds.</w:t>
       </w:r>
@@ -112,12 +131,12 @@
       </w:r>
       <w:r>
         <w:rPr>
-          <w:rFonts w:ascii="Consolas" w:cs="Consolas" w:eastAsia="Consolas" w:hAnsi="Consolas"/>
-          <w:sz w:val="18"/>
-          <w:szCs w:val="18"/>
-          <w:shd w:fill="EEEEEE" w:val="clear"/>
-        </w:rPr>
-        <w:t xml:space="preserve">lowDown.ogg</w:t>
+          <w:rFonts w:ascii="Consolas" w:eastAsia="Consolas" w:hAnsi="Consolas" w:cs="Consolas"/>
+          <w:sz w:val="18"/>
+          <w:szCs w:val="18"/>
+          <w:shd w:val="clear" w:color="auto" w:fill="EEEEEE"/>
+        </w:rPr>
+        <w:t>lowDown.ogg</w:t>
       </w:r>
       <w:r>
         <w:t xml:space="preserve"> works well. (Double-click a file in Windows to hear it.)</w:t>
@@ -133,12 +152,12 @@
         <w:spacing w:after="60"/>
       </w:pPr>
       <w:r>
-        <w:t xml:space="preserve">In Windows Explorer, copy your chosen file into the project folder:</w:t>
-      </w:r>
-    </w:p>
-    <w:p>
-      <w:pPr>
-        <w:shd w:fill="F2F2F2" w:val="clear"/>
+        <w:t>In Windows Explorer, copy your chosen file into the project folder:</w:t>
+      </w:r>
+    </w:p>
+    <w:p>
+      <w:pPr>
+        <w:shd w:val="clear" w:color="auto" w:fill="F2F2F2"/>
         <w:tabs>
           <w:tab w:val="left" w:pos="240"/>
           <w:tab w:val="left" w:pos="480"/>
@@ -153,16 +172,16 @@
           <w:tab w:val="left" w:pos="2640"/>
           <w:tab w:val="left" w:pos="2880"/>
         </w:tabs>
-        <w:spacing w:after="160" w:before="0" w:line="240"/>
+        <w:spacing w:after="160"/>
         <w:ind w:left="720"/>
       </w:pPr>
       <w:r>
         <w:rPr>
-          <w:rFonts w:ascii="Consolas" w:cs="Consolas" w:eastAsia="Consolas" w:hAnsi="Consolas"/>
-          <w:sz w:val="16"/>
-          <w:szCs w:val="16"/>
-        </w:rPr>
-        <w:t xml:space="preserve">assets\sounds\</w:t>
+          <w:rFonts w:ascii="Consolas" w:eastAsia="Consolas" w:hAnsi="Consolas" w:cs="Consolas"/>
+          <w:sz w:val="16"/>
+          <w:szCs w:val="16"/>
+        </w:rPr>
+        <w:t>assets\sounds\</w:t>
       </w:r>
     </w:p>
     <w:p>
@@ -175,15 +194,15 @@
       </w:r>
       <w:r>
         <w:rPr>
-          <w:rFonts w:ascii="Consolas" w:cs="Consolas" w:eastAsia="Consolas" w:hAnsi="Consolas"/>
-          <w:sz w:val="18"/>
-          <w:szCs w:val="18"/>
-          <w:shd w:fill="EEEEEE" w:val="clear"/>
-        </w:rPr>
-        <w:t xml:space="preserve">hazard.ogg</w:t>
-      </w:r>
-      <w:r>
-        <w:t xml:space="preserve">.</w:t>
+          <w:rFonts w:ascii="Consolas" w:eastAsia="Consolas" w:hAnsi="Consolas" w:cs="Consolas"/>
+          <w:sz w:val="18"/>
+          <w:szCs w:val="18"/>
+          <w:shd w:val="clear" w:color="auto" w:fill="EEEEEE"/>
+        </w:rPr>
+        <w:t>hazard.ogg</w:t>
+      </w:r>
+      <w:r>
+        <w:t>.</w:t>
       </w:r>
     </w:p>
     <w:p>
@@ -200,46 +219,71 @@
       </w:r>
       <w:r>
         <w:rPr>
-          <w:rFonts w:ascii="Consolas" w:cs="Consolas" w:eastAsia="Consolas" w:hAnsi="Consolas"/>
-          <w:sz w:val="18"/>
-          <w:szCs w:val="18"/>
-          <w:shd w:fill="EEEEEE" w:val="clear"/>
-        </w:rPr>
-        <w:t xml:space="preserve">hazard.ogg</w:t>
+          <w:rFonts w:ascii="Consolas" w:eastAsia="Consolas" w:hAnsi="Consolas" w:cs="Consolas"/>
+          <w:sz w:val="18"/>
+          <w:szCs w:val="18"/>
+          <w:shd w:val="clear" w:color="auto" w:fill="EEEEEE"/>
+        </w:rPr>
+        <w:t>hazard.ogg</w:t>
       </w:r>
       <w:r>
         <w:t xml:space="preserve"> appear in the </w:t>
       </w:r>
+      <w:proofErr w:type="spellStart"/>
       <w:r>
         <w:rPr>
           <w:b/>
           <w:bCs/>
         </w:rPr>
-        <w:t xml:space="preserve">FileSystem dock</w:t>
+        <w:t>FileSystem</w:t>
+      </w:r>
+      <w:proofErr w:type="spellEnd"/>
+      <w:r>
+        <w:rPr>
+          <w:b/>
+          <w:bCs/>
+        </w:rPr>
+        <w:t xml:space="preserve"> dock</w:t>
       </w:r>
       <w:r>
         <w:t xml:space="preserve"> under </w:t>
       </w:r>
       <w:r>
         <w:rPr>
-          <w:rFonts w:ascii="Consolas" w:cs="Consolas" w:eastAsia="Consolas" w:hAnsi="Consolas"/>
-          <w:sz w:val="18"/>
-          <w:szCs w:val="18"/>
-          <w:shd w:fill="EEEEEE" w:val="clear"/>
-        </w:rPr>
-        <w:t xml:space="preserve">assets/sounds</w:t>
-      </w:r>
-      <w:r>
-        <w:t xml:space="preserve">.</w:t>
+          <w:rFonts w:ascii="Consolas" w:eastAsia="Consolas" w:hAnsi="Consolas" w:cs="Consolas"/>
+          <w:sz w:val="18"/>
+          <w:szCs w:val="18"/>
+          <w:shd w:val="clear" w:color="auto" w:fill="EEEEEE"/>
+        </w:rPr>
+        <w:t>assets/sounds</w:t>
+      </w:r>
+      <w:r>
+        <w:t>.</w:t>
       </w:r>
     </w:p>
     <w:p>
       <w:pPr>
         <w:pStyle w:val="Heading2"/>
-        <w:spacing w:after="120" w:before="240"/>
-      </w:pPr>
-      <w:r>
-        <w:t xml:space="preserve">Part B - Add A Sound Player To The Scene</w:t>
+        <w:spacing w:before="240" w:after="120"/>
+      </w:pPr>
+      <w:r>
+        <w:t xml:space="preserve">Part B - Add A Sound Player </w:t>
+      </w:r>
+      <w:proofErr w:type="gramStart"/>
+      <w:r>
+        <w:t>To</w:t>
+      </w:r>
+      <w:proofErr w:type="gramEnd"/>
+      <w:r>
+        <w:t xml:space="preserve"> </w:t>
+      </w:r>
+      <w:proofErr w:type="gramStart"/>
+      <w:r>
+        <w:t>The</w:t>
+      </w:r>
+      <w:proofErr w:type="gramEnd"/>
+      <w:r>
+        <w:t xml:space="preserve"> Scene</w:t>
       </w:r>
     </w:p>
     <w:p>
@@ -256,15 +300,34 @@
       </w:r>
       <w:r>
         <w:rPr>
-          <w:rFonts w:ascii="Consolas" w:cs="Consolas" w:eastAsia="Consolas" w:hAnsi="Consolas"/>
-          <w:sz w:val="18"/>
-          <w:szCs w:val="18"/>
-          <w:shd w:fill="EEEEEE" w:val="clear"/>
-        </w:rPr>
-        <w:t xml:space="preserve">scenes/Main.tscn</w:t>
-      </w:r>
-      <w:r>
-        <w:t xml:space="preserve"> (double-click it in the FileSystem dock).</w:t>
+          <w:rFonts w:ascii="Consolas" w:eastAsia="Consolas" w:hAnsi="Consolas" w:cs="Consolas"/>
+          <w:sz w:val="18"/>
+          <w:szCs w:val="18"/>
+          <w:shd w:val="clear" w:color="auto" w:fill="EEEEEE"/>
+        </w:rPr>
+        <w:t>scenes/</w:t>
+      </w:r>
+      <w:proofErr w:type="spellStart"/>
+      <w:r>
+        <w:rPr>
+          <w:rFonts w:ascii="Consolas" w:eastAsia="Consolas" w:hAnsi="Consolas" w:cs="Consolas"/>
+          <w:sz w:val="18"/>
+          <w:szCs w:val="18"/>
+          <w:shd w:val="clear" w:color="auto" w:fill="EEEEEE"/>
+        </w:rPr>
+        <w:t>Main.tscn</w:t>
+      </w:r>
+      <w:proofErr w:type="spellEnd"/>
+      <w:r>
+        <w:t xml:space="preserve"> (double-click it in the </w:t>
+      </w:r>
+      <w:proofErr w:type="spellStart"/>
+      <w:r>
+        <w:t>FileSystem</w:t>
+      </w:r>
+      <w:proofErr w:type="spellEnd"/>
+      <w:r>
+        <w:t xml:space="preserve"> dock).</w:t>
       </w:r>
     </w:p>
     <w:p>
@@ -284,7 +347,7 @@
           <w:b/>
           <w:bCs/>
         </w:rPr>
-        <w:t xml:space="preserve">Scene dock</w:t>
+        <w:t>Scene dock</w:t>
       </w:r>
       <w:r>
         <w:t xml:space="preserve">, right-click the top node </w:t>
@@ -294,7 +357,7 @@
           <w:b/>
           <w:bCs/>
         </w:rPr>
-        <w:t xml:space="preserve">Main</w:t>
+        <w:t>Main</w:t>
       </w:r>
       <w:r>
         <w:t xml:space="preserve"> and choose </w:t>
@@ -304,7 +367,7 @@
           <w:b/>
           <w:bCs/>
         </w:rPr>
-        <w:t xml:space="preserve">Add Child Node...</w:t>
+        <w:t>Add Child Node...</w:t>
       </w:r>
     </w:p>
     <w:p>
@@ -319,25 +382,29 @@
       <w:r>
         <w:t xml:space="preserve">Search for </w:t>
       </w:r>
-      <w:r>
-        <w:rPr>
-          <w:rFonts w:ascii="Consolas" w:cs="Consolas" w:eastAsia="Consolas" w:hAnsi="Consolas"/>
-          <w:sz w:val="18"/>
-          <w:szCs w:val="18"/>
-          <w:shd w:fill="EEEEEE" w:val="clear"/>
-        </w:rPr>
-        <w:t xml:space="preserve">AudioStreamPlayer</w:t>
-      </w:r>
+      <w:proofErr w:type="spellStart"/>
+      <w:r>
+        <w:rPr>
+          <w:rFonts w:ascii="Consolas" w:eastAsia="Consolas" w:hAnsi="Consolas" w:cs="Consolas"/>
+          <w:sz w:val="18"/>
+          <w:szCs w:val="18"/>
+          <w:shd w:val="clear" w:color="auto" w:fill="EEEEEE"/>
+        </w:rPr>
+        <w:t>AudioStreamPlayer</w:t>
+      </w:r>
+      <w:proofErr w:type="spellEnd"/>
       <w:r>
         <w:t xml:space="preserve"> - pick the plain </w:t>
       </w:r>
+      <w:proofErr w:type="spellStart"/>
       <w:r>
         <w:rPr>
           <w:b/>
           <w:bCs/>
         </w:rPr>
-        <w:t xml:space="preserve">AudioStreamPlayer</w:t>
-      </w:r>
+        <w:t>AudioStreamPlayer</w:t>
+      </w:r>
+      <w:proofErr w:type="spellEnd"/>
       <w:r>
         <w:t xml:space="preserve"> (NOT the 2D or 3D one) and click </w:t>
       </w:r>
@@ -346,10 +413,10 @@
           <w:b/>
           <w:bCs/>
         </w:rPr>
-        <w:t xml:space="preserve">Create</w:t>
-      </w:r>
-      <w:r>
-        <w:t xml:space="preserve">.</w:t>
+        <w:t>Create</w:t>
+      </w:r>
+      <w:r>
+        <w:t>.</w:t>
       </w:r>
     </w:p>
     <w:p>
@@ -362,12 +429,12 @@
         <w:spacing w:after="60"/>
       </w:pPr>
       <w:r>
-        <w:t xml:space="preserve">Rename the new node to exactly:</w:t>
-      </w:r>
-    </w:p>
-    <w:p>
-      <w:pPr>
-        <w:shd w:fill="F2F2F2" w:val="clear"/>
+        <w:t>Rename the new node to exactly:</w:t>
+      </w:r>
+    </w:p>
+    <w:p>
+      <w:pPr>
+        <w:shd w:val="clear" w:color="auto" w:fill="F2F2F2"/>
         <w:tabs>
           <w:tab w:val="left" w:pos="240"/>
           <w:tab w:val="left" w:pos="480"/>
@@ -382,17 +449,19 @@
           <w:tab w:val="left" w:pos="2640"/>
           <w:tab w:val="left" w:pos="2880"/>
         </w:tabs>
-        <w:spacing w:after="160" w:before="0" w:line="240"/>
+        <w:spacing w:after="160"/>
         <w:ind w:left="720"/>
       </w:pPr>
-      <w:r>
-        <w:rPr>
-          <w:rFonts w:ascii="Consolas" w:cs="Consolas" w:eastAsia="Consolas" w:hAnsi="Consolas"/>
-          <w:sz w:val="16"/>
-          <w:szCs w:val="16"/>
-        </w:rPr>
-        <w:t xml:space="preserve">HazardSound</w:t>
-      </w:r>
+      <w:proofErr w:type="spellStart"/>
+      <w:r>
+        <w:rPr>
+          <w:rFonts w:ascii="Consolas" w:eastAsia="Consolas" w:hAnsi="Consolas" w:cs="Consolas"/>
+          <w:sz w:val="16"/>
+          <w:szCs w:val="16"/>
+        </w:rPr>
+        <w:t>HazardSound</w:t>
+      </w:r>
+      <w:proofErr w:type="spellEnd"/>
     </w:p>
     <w:p>
       <w:pPr>
@@ -406,15 +475,17 @@
       <w:r>
         <w:t xml:space="preserve">With </w:t>
       </w:r>
-      <w:r>
-        <w:rPr>
-          <w:rFonts w:ascii="Consolas" w:cs="Consolas" w:eastAsia="Consolas" w:hAnsi="Consolas"/>
-          <w:sz w:val="18"/>
-          <w:szCs w:val="18"/>
-          <w:shd w:fill="EEEEEE" w:val="clear"/>
-        </w:rPr>
-        <w:t xml:space="preserve">HazardSound</w:t>
-      </w:r>
+      <w:proofErr w:type="spellStart"/>
+      <w:r>
+        <w:rPr>
+          <w:rFonts w:ascii="Consolas" w:eastAsia="Consolas" w:hAnsi="Consolas" w:cs="Consolas"/>
+          <w:sz w:val="18"/>
+          <w:szCs w:val="18"/>
+          <w:shd w:val="clear" w:color="auto" w:fill="EEEEEE"/>
+        </w:rPr>
+        <w:t>HazardSound</w:t>
+      </w:r>
+      <w:proofErr w:type="spellEnd"/>
       <w:r>
         <w:t xml:space="preserve"> selected, find the </w:t>
       </w:r>
@@ -423,7 +494,7 @@
           <w:b/>
           <w:bCs/>
         </w:rPr>
-        <w:t xml:space="preserve">Stream</w:t>
+        <w:t>Stream</w:t>
       </w:r>
       <w:r>
         <w:t xml:space="preserve"> property at the top of the </w:t>
@@ -433,44 +504,52 @@
           <w:b/>
           <w:bCs/>
         </w:rPr>
-        <w:t xml:space="preserve">Inspector</w:t>
+        <w:t>Inspector</w:t>
       </w:r>
       <w:r>
         <w:t xml:space="preserve">. Drag </w:t>
       </w:r>
       <w:r>
         <w:rPr>
-          <w:rFonts w:ascii="Consolas" w:cs="Consolas" w:eastAsia="Consolas" w:hAnsi="Consolas"/>
-          <w:sz w:val="18"/>
-          <w:szCs w:val="18"/>
-          <w:shd w:fill="EEEEEE" w:val="clear"/>
-        </w:rPr>
-        <w:t xml:space="preserve">hazard.ogg</w:t>
-      </w:r>
-      <w:r>
-        <w:t xml:space="preserve"> from the FileSystem dock and drop it onto the Stream box. (Or click the dropdown arrow next to Stream and choose </w:t>
+          <w:rFonts w:ascii="Consolas" w:eastAsia="Consolas" w:hAnsi="Consolas" w:cs="Consolas"/>
+          <w:sz w:val="18"/>
+          <w:szCs w:val="18"/>
+          <w:shd w:val="clear" w:color="auto" w:fill="EEEEEE"/>
+        </w:rPr>
+        <w:t>hazard.ogg</w:t>
+      </w:r>
+      <w:r>
+        <w:t xml:space="preserve"> from the </w:t>
+      </w:r>
+      <w:proofErr w:type="spellStart"/>
+      <w:r>
+        <w:t>FileSystem</w:t>
+      </w:r>
+      <w:proofErr w:type="spellEnd"/>
+      <w:r>
+        <w:t xml:space="preserve"> dock and drop it onto the Stream box. (Or click the dropdown arrow next to Stream and choose </w:t>
       </w:r>
       <w:r>
         <w:rPr>
           <w:b/>
           <w:bCs/>
         </w:rPr>
-        <w:t xml:space="preserve">Quick Load</w:t>
+        <w:t>Quick Load</w:t>
       </w:r>
       <w:r>
         <w:t xml:space="preserve">, then pick </w:t>
       </w:r>
       <w:r>
         <w:rPr>
-          <w:rFonts w:ascii="Consolas" w:cs="Consolas" w:eastAsia="Consolas" w:hAnsi="Consolas"/>
-          <w:sz w:val="18"/>
-          <w:szCs w:val="18"/>
-          <w:shd w:fill="EEEEEE" w:val="clear"/>
-        </w:rPr>
-        <w:t xml:space="preserve">hazard.ogg</w:t>
-      </w:r>
-      <w:r>
-        <w:t xml:space="preserve">.)</w:t>
+          <w:rFonts w:ascii="Consolas" w:eastAsia="Consolas" w:hAnsi="Consolas" w:cs="Consolas"/>
+          <w:sz w:val="18"/>
+          <w:szCs w:val="18"/>
+          <w:shd w:val="clear" w:color="auto" w:fill="EEEEEE"/>
+        </w:rPr>
+        <w:t>hazard.ogg</w:t>
+      </w:r>
+      <w:r>
+        <w:t>.)</w:t>
       </w:r>
     </w:p>
     <w:p>
@@ -485,13 +564,15 @@
       <w:r>
         <w:t xml:space="preserve">There is already a node like this in the scene: click </w:t>
       </w:r>
+      <w:proofErr w:type="spellStart"/>
       <w:r>
         <w:rPr>
           <w:b/>
           <w:bCs/>
         </w:rPr>
-        <w:t xml:space="preserve">StarSound</w:t>
-      </w:r>
+        <w:t>StarSound</w:t>
+      </w:r>
+      <w:proofErr w:type="spellEnd"/>
       <w:r>
         <w:t xml:space="preserve"> in the Scene dock to compare - yours should look the same.</w:t>
       </w:r>
@@ -508,15 +589,17 @@
       <w:r>
         <w:t xml:space="preserve">Want to hear it? With </w:t>
       </w:r>
-      <w:r>
-        <w:rPr>
-          <w:rFonts w:ascii="Consolas" w:cs="Consolas" w:eastAsia="Consolas" w:hAnsi="Consolas"/>
-          <w:sz w:val="18"/>
-          <w:szCs w:val="18"/>
-          <w:shd w:fill="EEEEEE" w:val="clear"/>
-        </w:rPr>
-        <w:t xml:space="preserve">HazardSound</w:t>
-      </w:r>
+      <w:proofErr w:type="spellStart"/>
+      <w:r>
+        <w:rPr>
+          <w:rFonts w:ascii="Consolas" w:eastAsia="Consolas" w:hAnsi="Consolas" w:cs="Consolas"/>
+          <w:sz w:val="18"/>
+          <w:szCs w:val="18"/>
+          <w:shd w:val="clear" w:color="auto" w:fill="EEEEEE"/>
+        </w:rPr>
+        <w:t>HazardSound</w:t>
+      </w:r>
+      <w:proofErr w:type="spellEnd"/>
       <w:r>
         <w:t xml:space="preserve"> selected, tick the </w:t>
       </w:r>
@@ -525,7 +608,7 @@
           <w:b/>
           <w:bCs/>
         </w:rPr>
-        <w:t xml:space="preserve">Playing</w:t>
+        <w:t>Playing</w:t>
       </w:r>
       <w:r>
         <w:t xml:space="preserve"> option in the Inspector - it auditions the sound right in the editor, with this node's volume and pitch applied. Untick it afterwards.</w:t>
@@ -540,13 +623,15 @@
         </w:numPr>
         <w:spacing w:after="60"/>
       </w:pPr>
+      <w:proofErr w:type="spellStart"/>
       <w:r>
         <w:rPr>
           <w:b/>
           <w:bCs/>
         </w:rPr>
-        <w:t xml:space="preserve">Ctrl+S</w:t>
-      </w:r>
+        <w:t>Ctrl+S</w:t>
+      </w:r>
+      <w:proofErr w:type="spellEnd"/>
       <w:r>
         <w:t xml:space="preserve"> to save.</w:t>
       </w:r>
@@ -554,10 +639,34 @@
     <w:p>
       <w:pPr>
         <w:pStyle w:val="Heading2"/>
-        <w:spacing w:after="120" w:before="240"/>
-      </w:pPr>
-      <w:r>
-        <w:t xml:space="preserve">Part C - Play The Sound From The Script</w:t>
+        <w:spacing w:before="240" w:after="120"/>
+      </w:pPr>
+      <w:r>
+        <w:t xml:space="preserve">Part C - Play </w:t>
+      </w:r>
+      <w:proofErr w:type="gramStart"/>
+      <w:r>
+        <w:t>The</w:t>
+      </w:r>
+      <w:proofErr w:type="gramEnd"/>
+      <w:r>
+        <w:t xml:space="preserve"> Sound </w:t>
+      </w:r>
+      <w:proofErr w:type="gramStart"/>
+      <w:r>
+        <w:t>From</w:t>
+      </w:r>
+      <w:proofErr w:type="gramEnd"/>
+      <w:r>
+        <w:t xml:space="preserve"> </w:t>
+      </w:r>
+      <w:proofErr w:type="gramStart"/>
+      <w:r>
+        <w:t>The</w:t>
+      </w:r>
+      <w:proofErr w:type="gramEnd"/>
+      <w:r>
+        <w:t xml:space="preserve"> Script</w:t>
       </w:r>
     </w:p>
     <w:p>
@@ -574,15 +683,15 @@
       </w:r>
       <w:r>
         <w:rPr>
-          <w:rFonts w:ascii="Consolas" w:cs="Consolas" w:eastAsia="Consolas" w:hAnsi="Consolas"/>
-          <w:sz w:val="18"/>
-          <w:szCs w:val="18"/>
-          <w:shd w:fill="EEEEEE" w:val="clear"/>
-        </w:rPr>
-        <w:t xml:space="preserve">scripts/game_manager.gd</w:t>
-      </w:r>
-      <w:r>
-        <w:t xml:space="preserve">.</w:t>
+          <w:rFonts w:ascii="Consolas" w:eastAsia="Consolas" w:hAnsi="Consolas" w:cs="Consolas"/>
+          <w:sz w:val="18"/>
+          <w:szCs w:val="18"/>
+          <w:shd w:val="clear" w:color="auto" w:fill="EEEEEE"/>
+        </w:rPr>
+        <w:t>scripts/game_manager.gd</w:t>
+      </w:r>
+      <w:r>
+        <w:t>.</w:t>
       </w:r>
     </w:p>
     <w:p>
@@ -597,32 +706,36 @@
       <w:r>
         <w:t xml:space="preserve">Press </w:t>
       </w:r>
+      <w:proofErr w:type="spellStart"/>
       <w:r>
         <w:rPr>
           <w:b/>
           <w:bCs/>
         </w:rPr>
-        <w:t xml:space="preserve">Ctrl+F</w:t>
-      </w:r>
+        <w:t>Ctrl+F</w:t>
+      </w:r>
+      <w:proofErr w:type="spellEnd"/>
       <w:r>
         <w:t xml:space="preserve"> and search for </w:t>
       </w:r>
-      <w:r>
-        <w:rPr>
-          <w:rFonts w:ascii="Consolas" w:cs="Consolas" w:eastAsia="Consolas" w:hAnsi="Consolas"/>
-          <w:sz w:val="18"/>
-          <w:szCs w:val="18"/>
-          <w:shd w:fill="EEEEEE" w:val="clear"/>
-        </w:rPr>
-        <w:t xml:space="preserve">star_sound</w:t>
-      </w:r>
-      <w:r>
-        <w:t xml:space="preserve">. You will find this near the top:</w:t>
-      </w:r>
-    </w:p>
-    <w:p>
-      <w:pPr>
-        <w:shd w:fill="F2F2F2" w:val="clear"/>
+      <w:proofErr w:type="spellStart"/>
+      <w:r>
+        <w:rPr>
+          <w:rFonts w:ascii="Consolas" w:eastAsia="Consolas" w:hAnsi="Consolas" w:cs="Consolas"/>
+          <w:sz w:val="18"/>
+          <w:szCs w:val="18"/>
+          <w:shd w:val="clear" w:color="auto" w:fill="EEEEEE"/>
+        </w:rPr>
+        <w:t>star_sound</w:t>
+      </w:r>
+      <w:proofErr w:type="spellEnd"/>
+      <w:r>
+        <w:t>. You will find this near the top:</w:t>
+      </w:r>
+    </w:p>
+    <w:p>
+      <w:pPr>
+        <w:shd w:val="clear" w:color="auto" w:fill="F2F2F2"/>
         <w:tabs>
           <w:tab w:val="left" w:pos="240"/>
           <w:tab w:val="left" w:pos="480"/>
@@ -637,21 +750,20 @@
           <w:tab w:val="left" w:pos="2640"/>
           <w:tab w:val="left" w:pos="2880"/>
         </w:tabs>
-        <w:spacing w:after="0" w:before="0" w:line="240"/>
         <w:ind w:left="720"/>
       </w:pPr>
       <w:r>
         <w:rPr>
-          <w:rFonts w:ascii="Consolas" w:cs="Consolas" w:eastAsia="Consolas" w:hAnsi="Consolas"/>
-          <w:sz w:val="16"/>
-          <w:szCs w:val="16"/>
-        </w:rPr>
-        <w:t xml:space="preserve"># STUDENT EXTENSION SPACE: adding sound effects to tiles?</w:t>
-      </w:r>
-    </w:p>
-    <w:p>
-      <w:pPr>
-        <w:shd w:fill="F2F2F2" w:val="clear"/>
+          <w:rFonts w:ascii="Consolas" w:eastAsia="Consolas" w:hAnsi="Consolas" w:cs="Consolas"/>
+          <w:sz w:val="16"/>
+          <w:szCs w:val="16"/>
+        </w:rPr>
+        <w:t># STUDENT EXTENSION SPACE: adding sound effects to tiles?</w:t>
+      </w:r>
+    </w:p>
+    <w:p>
+      <w:pPr>
+        <w:shd w:val="clear" w:color="auto" w:fill="F2F2F2"/>
         <w:tabs>
           <w:tab w:val="left" w:pos="240"/>
           <w:tab w:val="left" w:pos="480"/>
@@ -666,21 +778,56 @@
           <w:tab w:val="left" w:pos="2640"/>
           <w:tab w:val="left" w:pos="2880"/>
         </w:tabs>
-        <w:spacing w:after="0" w:before="0" w:line="240"/>
         <w:ind w:left="720"/>
       </w:pPr>
       <w:r>
         <w:rPr>
-          <w:rFonts w:ascii="Consolas" w:cs="Consolas" w:eastAsia="Consolas" w:hAnsi="Consolas"/>
-          <w:sz w:val="16"/>
-          <w:szCs w:val="16"/>
-        </w:rPr>
-        <w:t xml:space="preserve"># Add your new AudioStreamPlayer variables right below star_sound.</w:t>
-      </w:r>
-    </w:p>
-    <w:p>
-      <w:pPr>
-        <w:shd w:fill="F2F2F2" w:val="clear"/>
+          <w:rFonts w:ascii="Consolas" w:eastAsia="Consolas" w:hAnsi="Consolas" w:cs="Consolas"/>
+          <w:sz w:val="16"/>
+          <w:szCs w:val="16"/>
+        </w:rPr>
+        <w:t xml:space="preserve"># Add your new </w:t>
+      </w:r>
+      <w:proofErr w:type="spellStart"/>
+      <w:r>
+        <w:rPr>
+          <w:rFonts w:ascii="Consolas" w:eastAsia="Consolas" w:hAnsi="Consolas" w:cs="Consolas"/>
+          <w:sz w:val="16"/>
+          <w:szCs w:val="16"/>
+        </w:rPr>
+        <w:t>AudioStreamPlayer</w:t>
+      </w:r>
+      <w:proofErr w:type="spellEnd"/>
+      <w:r>
+        <w:rPr>
+          <w:rFonts w:ascii="Consolas" w:eastAsia="Consolas" w:hAnsi="Consolas" w:cs="Consolas"/>
+          <w:sz w:val="16"/>
+          <w:szCs w:val="16"/>
+        </w:rPr>
+        <w:t xml:space="preserve"> variables right below </w:t>
+      </w:r>
+      <w:proofErr w:type="spellStart"/>
+      <w:r>
+        <w:rPr>
+          <w:rFonts w:ascii="Consolas" w:eastAsia="Consolas" w:hAnsi="Consolas" w:cs="Consolas"/>
+          <w:sz w:val="16"/>
+          <w:szCs w:val="16"/>
+        </w:rPr>
+        <w:t>star_sound</w:t>
+      </w:r>
+      <w:proofErr w:type="spellEnd"/>
+      <w:r>
+        <w:rPr>
+          <w:rFonts w:ascii="Consolas" w:eastAsia="Consolas" w:hAnsi="Consolas" w:cs="Consolas"/>
+          <w:sz w:val="16"/>
+          <w:szCs w:val="16"/>
+        </w:rPr>
+        <w:t>.</w:t>
+      </w:r>
+    </w:p>
+    <w:p>
+      <w:pPr>
+        <w:shd w:val="clear" w:color="auto" w:fill="F2F2F2"/>
         <w:tabs>
           <w:tab w:val="left" w:pos="240"/>
           <w:tab w:val="left" w:pos="480"/>
@@ -695,17 +842,63 @@
           <w:tab w:val="left" w:pos="2640"/>
           <w:tab w:val="left" w:pos="2880"/>
         </w:tabs>
-        <w:spacing w:after="160" w:before="0" w:line="240"/>
+        <w:spacing w:after="160"/>
         <w:ind w:left="720"/>
       </w:pPr>
       <w:r>
         <w:rPr>
-          <w:rFonts w:ascii="Consolas" w:cs="Consolas" w:eastAsia="Consolas" w:hAnsi="Consolas"/>
-          <w:sz w:val="16"/>
-          <w:szCs w:val="16"/>
-        </w:rPr>
-        <w:t xml:space="preserve">@onready var star_sound: AudioStreamPlayer = $StarSound</w:t>
-      </w:r>
+          <w:rFonts w:ascii="Consolas" w:eastAsia="Consolas" w:hAnsi="Consolas" w:cs="Consolas"/>
+          <w:sz w:val="16"/>
+          <w:szCs w:val="16"/>
+        </w:rPr>
+        <w:t xml:space="preserve">@onready var </w:t>
+      </w:r>
+      <w:proofErr w:type="spellStart"/>
+      <w:r>
+        <w:rPr>
+          <w:rFonts w:ascii="Consolas" w:eastAsia="Consolas" w:hAnsi="Consolas" w:cs="Consolas"/>
+          <w:sz w:val="16"/>
+          <w:szCs w:val="16"/>
+        </w:rPr>
+        <w:t>star_sound</w:t>
+      </w:r>
+      <w:proofErr w:type="spellEnd"/>
+      <w:r>
+        <w:rPr>
+          <w:rFonts w:ascii="Consolas" w:eastAsia="Consolas" w:hAnsi="Consolas" w:cs="Consolas"/>
+          <w:sz w:val="16"/>
+          <w:szCs w:val="16"/>
+        </w:rPr>
+        <w:t xml:space="preserve">: </w:t>
+      </w:r>
+      <w:proofErr w:type="spellStart"/>
+      <w:r>
+        <w:rPr>
+          <w:rFonts w:ascii="Consolas" w:eastAsia="Consolas" w:hAnsi="Consolas" w:cs="Consolas"/>
+          <w:sz w:val="16"/>
+          <w:szCs w:val="16"/>
+        </w:rPr>
+        <w:t>AudioStreamPlayer</w:t>
+      </w:r>
+      <w:proofErr w:type="spellEnd"/>
+      <w:r>
+        <w:rPr>
+          <w:rFonts w:ascii="Consolas" w:eastAsia="Consolas" w:hAnsi="Consolas" w:cs="Consolas"/>
+          <w:sz w:val="16"/>
+          <w:szCs w:val="16"/>
+        </w:rPr>
+        <w:t xml:space="preserve"> = $</w:t>
+      </w:r>
+      <w:proofErr w:type="spellStart"/>
+      <w:r>
+        <w:rPr>
+          <w:rFonts w:ascii="Consolas" w:eastAsia="Consolas" w:hAnsi="Consolas" w:cs="Consolas"/>
+          <w:sz w:val="16"/>
+          <w:szCs w:val="16"/>
+        </w:rPr>
+        <w:t>StarSound</w:t>
+      </w:r>
+      <w:proofErr w:type="spellEnd"/>
     </w:p>
     <w:p>
       <w:pPr>
@@ -713,12 +906,12 @@
         <w:ind w:left="720"/>
       </w:pPr>
       <w:r>
-        <w:t xml:space="preserve">That comment is talking about you! Add your new node below it:</w:t>
-      </w:r>
-    </w:p>
-    <w:p>
-      <w:pPr>
-        <w:shd w:fill="F2F2F2" w:val="clear"/>
+        <w:t>That comment is talking about you! Add your new node below it:</w:t>
+      </w:r>
+    </w:p>
+    <w:p>
+      <w:pPr>
+        <w:shd w:val="clear" w:color="auto" w:fill="F2F2F2"/>
         <w:tabs>
           <w:tab w:val="left" w:pos="240"/>
           <w:tab w:val="left" w:pos="480"/>
@@ -733,17 +926,63 @@
           <w:tab w:val="left" w:pos="2640"/>
           <w:tab w:val="left" w:pos="2880"/>
         </w:tabs>
-        <w:spacing w:after="160" w:before="0" w:line="240"/>
+        <w:spacing w:after="160"/>
         <w:ind w:left="720"/>
       </w:pPr>
       <w:r>
         <w:rPr>
-          <w:rFonts w:ascii="Consolas" w:cs="Consolas" w:eastAsia="Consolas" w:hAnsi="Consolas"/>
-          <w:sz w:val="16"/>
-          <w:szCs w:val="16"/>
-        </w:rPr>
-        <w:t xml:space="preserve">@onready var hazard_sound: AudioStreamPlayer = $HazardSound</w:t>
-      </w:r>
+          <w:rFonts w:ascii="Consolas" w:eastAsia="Consolas" w:hAnsi="Consolas" w:cs="Consolas"/>
+          <w:sz w:val="16"/>
+          <w:szCs w:val="16"/>
+        </w:rPr>
+        <w:t xml:space="preserve">@onready var </w:t>
+      </w:r>
+      <w:proofErr w:type="spellStart"/>
+      <w:r>
+        <w:rPr>
+          <w:rFonts w:ascii="Consolas" w:eastAsia="Consolas" w:hAnsi="Consolas" w:cs="Consolas"/>
+          <w:sz w:val="16"/>
+          <w:szCs w:val="16"/>
+        </w:rPr>
+        <w:t>hazard_sound</w:t>
+      </w:r>
+      <w:proofErr w:type="spellEnd"/>
+      <w:r>
+        <w:rPr>
+          <w:rFonts w:ascii="Consolas" w:eastAsia="Consolas" w:hAnsi="Consolas" w:cs="Consolas"/>
+          <w:sz w:val="16"/>
+          <w:szCs w:val="16"/>
+        </w:rPr>
+        <w:t xml:space="preserve">: </w:t>
+      </w:r>
+      <w:proofErr w:type="spellStart"/>
+      <w:r>
+        <w:rPr>
+          <w:rFonts w:ascii="Consolas" w:eastAsia="Consolas" w:hAnsi="Consolas" w:cs="Consolas"/>
+          <w:sz w:val="16"/>
+          <w:szCs w:val="16"/>
+        </w:rPr>
+        <w:t>AudioStreamPlayer</w:t>
+      </w:r>
+      <w:proofErr w:type="spellEnd"/>
+      <w:r>
+        <w:rPr>
+          <w:rFonts w:ascii="Consolas" w:eastAsia="Consolas" w:hAnsi="Consolas" w:cs="Consolas"/>
+          <w:sz w:val="16"/>
+          <w:szCs w:val="16"/>
+        </w:rPr>
+        <w:t xml:space="preserve"> = $</w:t>
+      </w:r>
+      <w:proofErr w:type="spellStart"/>
+      <w:r>
+        <w:rPr>
+          <w:rFonts w:ascii="Consolas" w:eastAsia="Consolas" w:hAnsi="Consolas" w:cs="Consolas"/>
+          <w:sz w:val="16"/>
+          <w:szCs w:val="16"/>
+        </w:rPr>
+        <w:t>HazardSound</w:t>
+      </w:r>
+      <w:proofErr w:type="spellEnd"/>
     </w:p>
     <w:p>
       <w:pPr>
@@ -757,36 +996,69 @@
       <w:r>
         <w:t xml:space="preserve">Press </w:t>
       </w:r>
+      <w:proofErr w:type="spellStart"/>
       <w:r>
         <w:rPr>
           <w:b/>
           <w:bCs/>
         </w:rPr>
-        <w:t xml:space="preserve">Ctrl+F</w:t>
-      </w:r>
+        <w:t>Ctrl+F</w:t>
+      </w:r>
+      <w:proofErr w:type="spellEnd"/>
       <w:r>
         <w:t xml:space="preserve"> and search for </w:t>
       </w:r>
       <w:r>
         <w:rPr>
-          <w:rFonts w:ascii="Consolas" w:cs="Consolas" w:eastAsia="Consolas" w:hAnsi="Consolas"/>
-          <w:sz w:val="18"/>
-          <w:szCs w:val="18"/>
-          <w:shd w:fill="EEEEEE" w:val="clear"/>
-        </w:rPr>
-        <w:t xml:space="preserve">HAZARD</w:t>
+          <w:rFonts w:ascii="Consolas" w:eastAsia="Consolas" w:hAnsi="Consolas" w:cs="Consolas"/>
+          <w:sz w:val="18"/>
+          <w:szCs w:val="18"/>
+          <w:shd w:val="clear" w:color="auto" w:fill="EEEEEE"/>
+        </w:rPr>
+        <w:t>HAZARD</w:t>
       </w:r>
       <w:r>
         <w:t xml:space="preserve">. Choose the match inside </w:t>
       </w:r>
-      <w:r>
-        <w:rPr>
-          <w:rFonts w:ascii="Consolas" w:cs="Consolas" w:eastAsia="Consolas" w:hAnsi="Consolas"/>
-          <w:sz w:val="18"/>
-          <w:szCs w:val="18"/>
-          <w:shd w:fill="EEEEEE" w:val="clear"/>
-        </w:rPr>
-        <w:t xml:space="preserve">resolve_landed_tile()</w:t>
+      <w:proofErr w:type="spellStart"/>
+      <w:r>
+        <w:rPr>
+          <w:rFonts w:ascii="Consolas" w:eastAsia="Consolas" w:hAnsi="Consolas" w:cs="Consolas"/>
+          <w:sz w:val="18"/>
+          <w:szCs w:val="18"/>
+          <w:shd w:val="clear" w:color="auto" w:fill="EEEEEE"/>
+        </w:rPr>
+        <w:t>resolve_landed_</w:t>
+      </w:r>
+      <w:proofErr w:type="gramStart"/>
+      <w:r>
+        <w:rPr>
+          <w:rFonts w:ascii="Consolas" w:eastAsia="Consolas" w:hAnsi="Consolas" w:cs="Consolas"/>
+          <w:sz w:val="18"/>
+          <w:szCs w:val="18"/>
+          <w:shd w:val="clear" w:color="auto" w:fill="EEEEEE"/>
+        </w:rPr>
+        <w:t>tile</w:t>
+      </w:r>
+      <w:proofErr w:type="spellEnd"/>
+      <w:r>
+        <w:rPr>
+          <w:rFonts w:ascii="Consolas" w:eastAsia="Consolas" w:hAnsi="Consolas" w:cs="Consolas"/>
+          <w:sz w:val="18"/>
+          <w:szCs w:val="18"/>
+          <w:shd w:val="clear" w:color="auto" w:fill="EEEEEE"/>
+        </w:rPr>
+        <w:t>(</w:t>
+      </w:r>
+      <w:proofErr w:type="gramEnd"/>
+      <w:r>
+        <w:rPr>
+          <w:rFonts w:ascii="Consolas" w:eastAsia="Consolas" w:hAnsi="Consolas" w:cs="Consolas"/>
+          <w:sz w:val="18"/>
+          <w:szCs w:val="18"/>
+          <w:shd w:val="clear" w:color="auto" w:fill="EEEEEE"/>
+        </w:rPr>
+        <w:t>)</w:t>
       </w:r>
       <w:r>
         <w:t xml:space="preserve"> - it looks like this:</w:t>
@@ -794,7 +1066,7 @@
     </w:p>
     <w:p>
       <w:pPr>
-        <w:shd w:fill="F2F2F2" w:val="clear"/>
+        <w:shd w:val="clear" w:color="auto" w:fill="F2F2F2"/>
         <w:tabs>
           <w:tab w:val="left" w:pos="240"/>
           <w:tab w:val="left" w:pos="480"/>
@@ -809,12 +1081,11 @@
           <w:tab w:val="left" w:pos="2640"/>
           <w:tab w:val="left" w:pos="2880"/>
         </w:tabs>
-        <w:spacing w:after="0" w:before="0" w:line="240"/>
         <w:ind w:left="720"/>
       </w:pPr>
       <w:r>
         <w:rPr>
-          <w:rFonts w:ascii="Consolas" w:cs="Consolas" w:eastAsia="Consolas" w:hAnsi="Consolas"/>
+          <w:rFonts w:ascii="Consolas" w:eastAsia="Consolas" w:hAnsi="Consolas" w:cs="Consolas"/>
           <w:sz w:val="16"/>
           <w:szCs w:val="16"/>
         </w:rPr>
@@ -822,24 +1093,36 @@
       </w:r>
       <w:r>
         <w:rPr>
-          <w:rFonts w:ascii="Consolas" w:cs="Consolas" w:eastAsia="Consolas" w:hAnsi="Consolas"/>
+          <w:rFonts w:ascii="Consolas" w:eastAsia="Consolas" w:hAnsi="Consolas" w:cs="Consolas"/>
           <w:sz w:val="16"/>
           <w:szCs w:val="16"/>
         </w:rPr>
         <w:tab/>
       </w:r>
-      <w:r>
-        <w:rPr>
-          <w:rFonts w:ascii="Consolas" w:cs="Consolas" w:eastAsia="Consolas" w:hAnsi="Consolas"/>
-          <w:sz w:val="16"/>
-          <w:szCs w:val="16"/>
-        </w:rPr>
-        <w:t xml:space="preserve">BoardPosition.TileType.HAZARD:</w:t>
-      </w:r>
-    </w:p>
-    <w:p>
-      <w:pPr>
-        <w:shd w:fill="F2F2F2" w:val="clear"/>
+      <w:proofErr w:type="spellStart"/>
+      <w:proofErr w:type="gramStart"/>
+      <w:r>
+        <w:rPr>
+          <w:rFonts w:ascii="Consolas" w:eastAsia="Consolas" w:hAnsi="Consolas" w:cs="Consolas"/>
+          <w:sz w:val="16"/>
+          <w:szCs w:val="16"/>
+        </w:rPr>
+        <w:t>BoardPosition.TileType.HAZARD</w:t>
+      </w:r>
+      <w:proofErr w:type="spellEnd"/>
+      <w:proofErr w:type="gramEnd"/>
+      <w:r>
+        <w:rPr>
+          <w:rFonts w:ascii="Consolas" w:eastAsia="Consolas" w:hAnsi="Consolas" w:cs="Consolas"/>
+          <w:sz w:val="16"/>
+          <w:szCs w:val="16"/>
+        </w:rPr>
+        <w:t>:</w:t>
+      </w:r>
+    </w:p>
+    <w:p>
+      <w:pPr>
+        <w:shd w:val="clear" w:color="auto" w:fill="F2F2F2"/>
         <w:tabs>
           <w:tab w:val="left" w:pos="240"/>
           <w:tab w:val="left" w:pos="480"/>
@@ -854,12 +1137,11 @@
           <w:tab w:val="left" w:pos="2640"/>
           <w:tab w:val="left" w:pos="2880"/>
         </w:tabs>
-        <w:spacing w:after="0" w:before="0" w:line="240"/>
         <w:ind w:left="720"/>
       </w:pPr>
       <w:r>
         <w:rPr>
-          <w:rFonts w:ascii="Consolas" w:cs="Consolas" w:eastAsia="Consolas" w:hAnsi="Consolas"/>
+          <w:rFonts w:ascii="Consolas" w:eastAsia="Consolas" w:hAnsi="Consolas" w:cs="Consolas"/>
           <w:sz w:val="16"/>
           <w:szCs w:val="16"/>
         </w:rPr>
@@ -867,7 +1149,7 @@
       </w:r>
       <w:r>
         <w:rPr>
-          <w:rFonts w:ascii="Consolas" w:cs="Consolas" w:eastAsia="Consolas" w:hAnsi="Consolas"/>
+          <w:rFonts w:ascii="Consolas" w:eastAsia="Consolas" w:hAnsi="Consolas" w:cs="Consolas"/>
           <w:sz w:val="16"/>
           <w:szCs w:val="16"/>
         </w:rPr>
@@ -875,24 +1157,35 @@
       </w:r>
       <w:r>
         <w:rPr>
-          <w:rFonts w:ascii="Consolas" w:cs="Consolas" w:eastAsia="Consolas" w:hAnsi="Consolas"/>
+          <w:rFonts w:ascii="Consolas" w:eastAsia="Consolas" w:hAnsi="Consolas" w:cs="Consolas"/>
           <w:sz w:val="16"/>
           <w:szCs w:val="16"/>
         </w:rPr>
         <w:tab/>
-      </w:r>
-      <w:r>
-        <w:rPr>
-          <w:rFonts w:ascii="Consolas" w:cs="Consolas" w:eastAsia="Consolas" w:hAnsi="Consolas"/>
-          <w:sz w:val="16"/>
-          <w:szCs w:val="16"/>
-        </w:rPr>
-        <w:t xml:space="preserve"># STUDENT EXTENSION SPACE: the Battle To Dodge Hazards worksheet starts here.</w:t>
-      </w:r>
-    </w:p>
-    <w:p>
-      <w:pPr>
-        <w:shd w:fill="F2F2F2" w:val="clear"/>
+        <w:t xml:space="preserve"># STUDENT EXTENSION SPACE: the Battle </w:t>
+      </w:r>
+      <w:proofErr w:type="gramStart"/>
+      <w:r>
+        <w:rPr>
+          <w:rFonts w:ascii="Consolas" w:eastAsia="Consolas" w:hAnsi="Consolas" w:cs="Consolas"/>
+          <w:sz w:val="16"/>
+          <w:szCs w:val="16"/>
+        </w:rPr>
+        <w:t>To</w:t>
+      </w:r>
+      <w:proofErr w:type="gramEnd"/>
+      <w:r>
+        <w:rPr>
+          <w:rFonts w:ascii="Consolas" w:eastAsia="Consolas" w:hAnsi="Consolas" w:cs="Consolas"/>
+          <w:sz w:val="16"/>
+          <w:szCs w:val="16"/>
+        </w:rPr>
+        <w:t xml:space="preserve"> Dodge Hazards worksheet starts here.</w:t>
+      </w:r>
+    </w:p>
+    <w:p>
+      <w:pPr>
+        <w:shd w:val="clear" w:color="auto" w:fill="F2F2F2"/>
         <w:tabs>
           <w:tab w:val="left" w:pos="240"/>
           <w:tab w:val="left" w:pos="480"/>
@@ -907,12 +1200,11 @@
           <w:tab w:val="left" w:pos="2640"/>
           <w:tab w:val="left" w:pos="2880"/>
         </w:tabs>
-        <w:spacing w:after="0" w:before="0" w:line="240"/>
         <w:ind w:left="720"/>
       </w:pPr>
       <w:r>
         <w:rPr>
-          <w:rFonts w:ascii="Consolas" w:cs="Consolas" w:eastAsia="Consolas" w:hAnsi="Consolas"/>
+          <w:rFonts w:ascii="Consolas" w:eastAsia="Consolas" w:hAnsi="Consolas" w:cs="Consolas"/>
           <w:sz w:val="16"/>
           <w:szCs w:val="16"/>
         </w:rPr>
@@ -920,7 +1212,7 @@
       </w:r>
       <w:r>
         <w:rPr>
-          <w:rFonts w:ascii="Consolas" w:cs="Consolas" w:eastAsia="Consolas" w:hAnsi="Consolas"/>
+          <w:rFonts w:ascii="Consolas" w:eastAsia="Consolas" w:hAnsi="Consolas" w:cs="Consolas"/>
           <w:sz w:val="16"/>
           <w:szCs w:val="16"/>
         </w:rPr>
@@ -928,24 +1220,74 @@
       </w:r>
       <w:r>
         <w:rPr>
-          <w:rFonts w:ascii="Consolas" w:cs="Consolas" w:eastAsia="Consolas" w:hAnsi="Consolas"/>
+          <w:rFonts w:ascii="Consolas" w:eastAsia="Consolas" w:hAnsi="Consolas" w:cs="Consolas"/>
           <w:sz w:val="16"/>
           <w:szCs w:val="16"/>
         </w:rPr>
         <w:tab/>
       </w:r>
-      <w:r>
-        <w:rPr>
-          <w:rFonts w:ascii="Consolas" w:cs="Consolas" w:eastAsia="Consolas" w:hAnsi="Consolas"/>
-          <w:sz w:val="16"/>
-          <w:szCs w:val="16"/>
-        </w:rPr>
-        <w:t xml:space="preserve">player.lives = max(0, player.lives - 1)</w:t>
-      </w:r>
-    </w:p>
-    <w:p>
-      <w:pPr>
-        <w:shd w:fill="F2F2F2" w:val="clear"/>
+      <w:proofErr w:type="spellStart"/>
+      <w:proofErr w:type="gramStart"/>
+      <w:r>
+        <w:rPr>
+          <w:rFonts w:ascii="Consolas" w:eastAsia="Consolas" w:hAnsi="Consolas" w:cs="Consolas"/>
+          <w:sz w:val="16"/>
+          <w:szCs w:val="16"/>
+        </w:rPr>
+        <w:t>player.lives</w:t>
+      </w:r>
+      <w:proofErr w:type="spellEnd"/>
+      <w:proofErr w:type="gramEnd"/>
+      <w:r>
+        <w:rPr>
+          <w:rFonts w:ascii="Consolas" w:eastAsia="Consolas" w:hAnsi="Consolas" w:cs="Consolas"/>
+          <w:sz w:val="16"/>
+          <w:szCs w:val="16"/>
+        </w:rPr>
+        <w:t xml:space="preserve"> = </w:t>
+      </w:r>
+      <w:proofErr w:type="gramStart"/>
+      <w:r>
+        <w:rPr>
+          <w:rFonts w:ascii="Consolas" w:eastAsia="Consolas" w:hAnsi="Consolas" w:cs="Consolas"/>
+          <w:sz w:val="16"/>
+          <w:szCs w:val="16"/>
+        </w:rPr>
+        <w:t>max(</w:t>
+      </w:r>
+      <w:proofErr w:type="gramEnd"/>
+      <w:r>
+        <w:rPr>
+          <w:rFonts w:ascii="Consolas" w:eastAsia="Consolas" w:hAnsi="Consolas" w:cs="Consolas"/>
+          <w:sz w:val="16"/>
+          <w:szCs w:val="16"/>
+        </w:rPr>
+        <w:t xml:space="preserve">0, </w:t>
+      </w:r>
+      <w:proofErr w:type="spellStart"/>
+      <w:proofErr w:type="gramStart"/>
+      <w:r>
+        <w:rPr>
+          <w:rFonts w:ascii="Consolas" w:eastAsia="Consolas" w:hAnsi="Consolas" w:cs="Consolas"/>
+          <w:sz w:val="16"/>
+          <w:szCs w:val="16"/>
+        </w:rPr>
+        <w:t>player.lives</w:t>
+      </w:r>
+      <w:proofErr w:type="spellEnd"/>
+      <w:proofErr w:type="gramEnd"/>
+      <w:r>
+        <w:rPr>
+          <w:rFonts w:ascii="Consolas" w:eastAsia="Consolas" w:hAnsi="Consolas" w:cs="Consolas"/>
+          <w:sz w:val="16"/>
+          <w:szCs w:val="16"/>
+        </w:rPr>
+        <w:t xml:space="preserve"> - 1)</w:t>
+      </w:r>
+    </w:p>
+    <w:p>
+      <w:pPr>
+        <w:shd w:val="clear" w:color="auto" w:fill="F2F2F2"/>
         <w:tabs>
           <w:tab w:val="left" w:pos="240"/>
           <w:tab w:val="left" w:pos="480"/>
@@ -960,20 +1302,21 @@
           <w:tab w:val="left" w:pos="2640"/>
           <w:tab w:val="left" w:pos="2880"/>
         </w:tabs>
-        <w:spacing w:after="160" w:before="0" w:line="240"/>
+        <w:spacing w:after="160"/>
         <w:ind w:left="720"/>
       </w:pPr>
       <w:r>
         <w:rPr>
-          <w:rFonts w:ascii="Consolas" w:cs="Consolas" w:eastAsia="Consolas" w:hAnsi="Consolas"/>
-          <w:sz w:val="16"/>
-          <w:szCs w:val="16"/>
-        </w:rPr>
+          <w:rFonts w:ascii="Consolas" w:eastAsia="Consolas" w:hAnsi="Consolas" w:cs="Consolas"/>
+          <w:sz w:val="16"/>
+          <w:szCs w:val="16"/>
+        </w:rPr>
+        <w:lastRenderedPageBreak/>
         <w:tab/>
       </w:r>
       <w:r>
         <w:rPr>
-          <w:rFonts w:ascii="Consolas" w:cs="Consolas" w:eastAsia="Consolas" w:hAnsi="Consolas"/>
+          <w:rFonts w:ascii="Consolas" w:eastAsia="Consolas" w:hAnsi="Consolas" w:cs="Consolas"/>
           <w:sz w:val="16"/>
           <w:szCs w:val="16"/>
         </w:rPr>
@@ -981,20 +1324,50 @@
       </w:r>
       <w:r>
         <w:rPr>
-          <w:rFonts w:ascii="Consolas" w:cs="Consolas" w:eastAsia="Consolas" w:hAnsi="Consolas"/>
+          <w:rFonts w:ascii="Consolas" w:eastAsia="Consolas" w:hAnsi="Consolas" w:cs="Consolas"/>
           <w:sz w:val="16"/>
           <w:szCs w:val="16"/>
         </w:rPr>
         <w:tab/>
       </w:r>
-      <w:r>
-        <w:rPr>
-          <w:rFonts w:ascii="Consolas" w:cs="Consolas" w:eastAsia="Consolas" w:hAnsi="Consolas"/>
-          <w:sz w:val="16"/>
-          <w:szCs w:val="16"/>
-        </w:rPr>
-        <w:t xml:space="preserve">status_label.text = "%s hit a hazard and lost a life." % player.player_name</w:t>
-      </w:r>
+      <w:proofErr w:type="spellStart"/>
+      <w:r>
+        <w:rPr>
+          <w:rFonts w:ascii="Consolas" w:eastAsia="Consolas" w:hAnsi="Consolas" w:cs="Consolas"/>
+          <w:sz w:val="16"/>
+          <w:szCs w:val="16"/>
+        </w:rPr>
+        <w:t>status_label.text</w:t>
+      </w:r>
+      <w:proofErr w:type="spellEnd"/>
+      <w:r>
+        <w:rPr>
+          <w:rFonts w:ascii="Consolas" w:eastAsia="Consolas" w:hAnsi="Consolas" w:cs="Consolas"/>
+          <w:sz w:val="16"/>
+          <w:szCs w:val="16"/>
+        </w:rPr>
+        <w:t xml:space="preserve"> = "%s hit a hazard and lost a life." % </w:t>
+      </w:r>
+      <w:proofErr w:type="spellStart"/>
+      <w:proofErr w:type="gramStart"/>
+      <w:r>
+        <w:rPr>
+          <w:rFonts w:ascii="Consolas" w:eastAsia="Consolas" w:hAnsi="Consolas" w:cs="Consolas"/>
+          <w:sz w:val="16"/>
+          <w:szCs w:val="16"/>
+        </w:rPr>
+        <w:t>player.player</w:t>
+      </w:r>
+      <w:proofErr w:type="gramEnd"/>
+      <w:r>
+        <w:rPr>
+          <w:rFonts w:ascii="Consolas" w:eastAsia="Consolas" w:hAnsi="Consolas" w:cs="Consolas"/>
+          <w:sz w:val="16"/>
+          <w:szCs w:val="16"/>
+        </w:rPr>
+        <w:t>_name</w:t>
+      </w:r>
+      <w:proofErr w:type="spellEnd"/>
     </w:p>
     <w:p>
       <w:pPr>
@@ -1002,12 +1375,12 @@
         <w:ind w:left="720"/>
       </w:pPr>
       <w:r>
-        <w:t xml:space="preserve">Add one line so it becomes:</w:t>
-      </w:r>
-    </w:p>
-    <w:p>
-      <w:pPr>
-        <w:shd w:fill="F2F2F2" w:val="clear"/>
+        <w:t>Add one line so it becomes:</w:t>
+      </w:r>
+    </w:p>
+    <w:p>
+      <w:pPr>
+        <w:shd w:val="clear" w:color="auto" w:fill="F2F2F2"/>
         <w:tabs>
           <w:tab w:val="left" w:pos="240"/>
           <w:tab w:val="left" w:pos="480"/>
@@ -1022,12 +1395,11 @@
           <w:tab w:val="left" w:pos="2640"/>
           <w:tab w:val="left" w:pos="2880"/>
         </w:tabs>
-        <w:spacing w:after="0" w:before="0" w:line="240"/>
         <w:ind w:left="720"/>
       </w:pPr>
       <w:r>
         <w:rPr>
-          <w:rFonts w:ascii="Consolas" w:cs="Consolas" w:eastAsia="Consolas" w:hAnsi="Consolas"/>
+          <w:rFonts w:ascii="Consolas" w:eastAsia="Consolas" w:hAnsi="Consolas" w:cs="Consolas"/>
           <w:sz w:val="16"/>
           <w:szCs w:val="16"/>
         </w:rPr>
@@ -1035,24 +1407,36 @@
       </w:r>
       <w:r>
         <w:rPr>
-          <w:rFonts w:ascii="Consolas" w:cs="Consolas" w:eastAsia="Consolas" w:hAnsi="Consolas"/>
+          <w:rFonts w:ascii="Consolas" w:eastAsia="Consolas" w:hAnsi="Consolas" w:cs="Consolas"/>
           <w:sz w:val="16"/>
           <w:szCs w:val="16"/>
         </w:rPr>
         <w:tab/>
       </w:r>
-      <w:r>
-        <w:rPr>
-          <w:rFonts w:ascii="Consolas" w:cs="Consolas" w:eastAsia="Consolas" w:hAnsi="Consolas"/>
-          <w:sz w:val="16"/>
-          <w:szCs w:val="16"/>
-        </w:rPr>
-        <w:t xml:space="preserve">BoardPosition.TileType.HAZARD:</w:t>
-      </w:r>
-    </w:p>
-    <w:p>
-      <w:pPr>
-        <w:shd w:fill="F2F2F2" w:val="clear"/>
+      <w:proofErr w:type="spellStart"/>
+      <w:proofErr w:type="gramStart"/>
+      <w:r>
+        <w:rPr>
+          <w:rFonts w:ascii="Consolas" w:eastAsia="Consolas" w:hAnsi="Consolas" w:cs="Consolas"/>
+          <w:sz w:val="16"/>
+          <w:szCs w:val="16"/>
+        </w:rPr>
+        <w:t>BoardPosition.TileType.HAZARD</w:t>
+      </w:r>
+      <w:proofErr w:type="spellEnd"/>
+      <w:proofErr w:type="gramEnd"/>
+      <w:r>
+        <w:rPr>
+          <w:rFonts w:ascii="Consolas" w:eastAsia="Consolas" w:hAnsi="Consolas" w:cs="Consolas"/>
+          <w:sz w:val="16"/>
+          <w:szCs w:val="16"/>
+        </w:rPr>
+        <w:t>:</w:t>
+      </w:r>
+    </w:p>
+    <w:p>
+      <w:pPr>
+        <w:shd w:val="clear" w:color="auto" w:fill="F2F2F2"/>
         <w:tabs>
           <w:tab w:val="left" w:pos="240"/>
           <w:tab w:val="left" w:pos="480"/>
@@ -1067,12 +1451,11 @@
           <w:tab w:val="left" w:pos="2640"/>
           <w:tab w:val="left" w:pos="2880"/>
         </w:tabs>
-        <w:spacing w:after="0" w:before="0" w:line="240"/>
         <w:ind w:left="720"/>
       </w:pPr>
       <w:r>
         <w:rPr>
-          <w:rFonts w:ascii="Consolas" w:cs="Consolas" w:eastAsia="Consolas" w:hAnsi="Consolas"/>
+          <w:rFonts w:ascii="Consolas" w:eastAsia="Consolas" w:hAnsi="Consolas" w:cs="Consolas"/>
           <w:sz w:val="16"/>
           <w:szCs w:val="16"/>
         </w:rPr>
@@ -1080,7 +1463,7 @@
       </w:r>
       <w:r>
         <w:rPr>
-          <w:rFonts w:ascii="Consolas" w:cs="Consolas" w:eastAsia="Consolas" w:hAnsi="Consolas"/>
+          <w:rFonts w:ascii="Consolas" w:eastAsia="Consolas" w:hAnsi="Consolas" w:cs="Consolas"/>
           <w:sz w:val="16"/>
           <w:szCs w:val="16"/>
         </w:rPr>
@@ -1088,24 +1471,35 @@
       </w:r>
       <w:r>
         <w:rPr>
-          <w:rFonts w:ascii="Consolas" w:cs="Consolas" w:eastAsia="Consolas" w:hAnsi="Consolas"/>
+          <w:rFonts w:ascii="Consolas" w:eastAsia="Consolas" w:hAnsi="Consolas" w:cs="Consolas"/>
           <w:sz w:val="16"/>
           <w:szCs w:val="16"/>
         </w:rPr>
         <w:tab/>
-      </w:r>
-      <w:r>
-        <w:rPr>
-          <w:rFonts w:ascii="Consolas" w:cs="Consolas" w:eastAsia="Consolas" w:hAnsi="Consolas"/>
-          <w:sz w:val="16"/>
-          <w:szCs w:val="16"/>
-        </w:rPr>
-        <w:t xml:space="preserve"># STUDENT EXTENSION SPACE: the Battle To Dodge Hazards worksheet starts here.</w:t>
-      </w:r>
-    </w:p>
-    <w:p>
-      <w:pPr>
-        <w:shd w:fill="F2F2F2" w:val="clear"/>
+        <w:t xml:space="preserve"># STUDENT EXTENSION SPACE: the Battle </w:t>
+      </w:r>
+      <w:proofErr w:type="gramStart"/>
+      <w:r>
+        <w:rPr>
+          <w:rFonts w:ascii="Consolas" w:eastAsia="Consolas" w:hAnsi="Consolas" w:cs="Consolas"/>
+          <w:sz w:val="16"/>
+          <w:szCs w:val="16"/>
+        </w:rPr>
+        <w:t>To</w:t>
+      </w:r>
+      <w:proofErr w:type="gramEnd"/>
+      <w:r>
+        <w:rPr>
+          <w:rFonts w:ascii="Consolas" w:eastAsia="Consolas" w:hAnsi="Consolas" w:cs="Consolas"/>
+          <w:sz w:val="16"/>
+          <w:szCs w:val="16"/>
+        </w:rPr>
+        <w:t xml:space="preserve"> Dodge Hazards worksheet starts here.</w:t>
+      </w:r>
+    </w:p>
+    <w:p>
+      <w:pPr>
+        <w:shd w:val="clear" w:color="auto" w:fill="F2F2F2"/>
         <w:tabs>
           <w:tab w:val="left" w:pos="240"/>
           <w:tab w:val="left" w:pos="480"/>
@@ -1120,12 +1514,11 @@
           <w:tab w:val="left" w:pos="2640"/>
           <w:tab w:val="left" w:pos="2880"/>
         </w:tabs>
-        <w:spacing w:after="0" w:before="0" w:line="240"/>
         <w:ind w:left="720"/>
       </w:pPr>
       <w:r>
         <w:rPr>
-          <w:rFonts w:ascii="Consolas" w:cs="Consolas" w:eastAsia="Consolas" w:hAnsi="Consolas"/>
+          <w:rFonts w:ascii="Consolas" w:eastAsia="Consolas" w:hAnsi="Consolas" w:cs="Consolas"/>
           <w:sz w:val="16"/>
           <w:szCs w:val="16"/>
         </w:rPr>
@@ -1133,7 +1526,7 @@
       </w:r>
       <w:r>
         <w:rPr>
-          <w:rFonts w:ascii="Consolas" w:cs="Consolas" w:eastAsia="Consolas" w:hAnsi="Consolas"/>
+          <w:rFonts w:ascii="Consolas" w:eastAsia="Consolas" w:hAnsi="Consolas" w:cs="Consolas"/>
           <w:sz w:val="16"/>
           <w:szCs w:val="16"/>
         </w:rPr>
@@ -1141,24 +1534,74 @@
       </w:r>
       <w:r>
         <w:rPr>
-          <w:rFonts w:ascii="Consolas" w:cs="Consolas" w:eastAsia="Consolas" w:hAnsi="Consolas"/>
+          <w:rFonts w:ascii="Consolas" w:eastAsia="Consolas" w:hAnsi="Consolas" w:cs="Consolas"/>
           <w:sz w:val="16"/>
           <w:szCs w:val="16"/>
         </w:rPr>
         <w:tab/>
       </w:r>
-      <w:r>
-        <w:rPr>
-          <w:rFonts w:ascii="Consolas" w:cs="Consolas" w:eastAsia="Consolas" w:hAnsi="Consolas"/>
-          <w:sz w:val="16"/>
-          <w:szCs w:val="16"/>
-        </w:rPr>
-        <w:t xml:space="preserve">player.lives = max(0, player.lives - 1)</w:t>
-      </w:r>
-    </w:p>
-    <w:p>
-      <w:pPr>
-        <w:shd w:fill="F2F2F2" w:val="clear"/>
+      <w:proofErr w:type="spellStart"/>
+      <w:proofErr w:type="gramStart"/>
+      <w:r>
+        <w:rPr>
+          <w:rFonts w:ascii="Consolas" w:eastAsia="Consolas" w:hAnsi="Consolas" w:cs="Consolas"/>
+          <w:sz w:val="16"/>
+          <w:szCs w:val="16"/>
+        </w:rPr>
+        <w:t>player.lives</w:t>
+      </w:r>
+      <w:proofErr w:type="spellEnd"/>
+      <w:proofErr w:type="gramEnd"/>
+      <w:r>
+        <w:rPr>
+          <w:rFonts w:ascii="Consolas" w:eastAsia="Consolas" w:hAnsi="Consolas" w:cs="Consolas"/>
+          <w:sz w:val="16"/>
+          <w:szCs w:val="16"/>
+        </w:rPr>
+        <w:t xml:space="preserve"> = </w:t>
+      </w:r>
+      <w:proofErr w:type="gramStart"/>
+      <w:r>
+        <w:rPr>
+          <w:rFonts w:ascii="Consolas" w:eastAsia="Consolas" w:hAnsi="Consolas" w:cs="Consolas"/>
+          <w:sz w:val="16"/>
+          <w:szCs w:val="16"/>
+        </w:rPr>
+        <w:t>max(</w:t>
+      </w:r>
+      <w:proofErr w:type="gramEnd"/>
+      <w:r>
+        <w:rPr>
+          <w:rFonts w:ascii="Consolas" w:eastAsia="Consolas" w:hAnsi="Consolas" w:cs="Consolas"/>
+          <w:sz w:val="16"/>
+          <w:szCs w:val="16"/>
+        </w:rPr>
+        <w:t xml:space="preserve">0, </w:t>
+      </w:r>
+      <w:proofErr w:type="spellStart"/>
+      <w:proofErr w:type="gramStart"/>
+      <w:r>
+        <w:rPr>
+          <w:rFonts w:ascii="Consolas" w:eastAsia="Consolas" w:hAnsi="Consolas" w:cs="Consolas"/>
+          <w:sz w:val="16"/>
+          <w:szCs w:val="16"/>
+        </w:rPr>
+        <w:t>player.lives</w:t>
+      </w:r>
+      <w:proofErr w:type="spellEnd"/>
+      <w:proofErr w:type="gramEnd"/>
+      <w:r>
+        <w:rPr>
+          <w:rFonts w:ascii="Consolas" w:eastAsia="Consolas" w:hAnsi="Consolas" w:cs="Consolas"/>
+          <w:sz w:val="16"/>
+          <w:szCs w:val="16"/>
+        </w:rPr>
+        <w:t xml:space="preserve"> - 1)</w:t>
+      </w:r>
+    </w:p>
+    <w:p>
+      <w:pPr>
+        <w:shd w:val="clear" w:color="auto" w:fill="F2F2F2"/>
         <w:tabs>
           <w:tab w:val="left" w:pos="240"/>
           <w:tab w:val="left" w:pos="480"/>
@@ -1173,12 +1616,11 @@
           <w:tab w:val="left" w:pos="2640"/>
           <w:tab w:val="left" w:pos="2880"/>
         </w:tabs>
-        <w:spacing w:after="0" w:before="0" w:line="240"/>
         <w:ind w:left="720"/>
       </w:pPr>
       <w:r>
         <w:rPr>
-          <w:rFonts w:ascii="Consolas" w:cs="Consolas" w:eastAsia="Consolas" w:hAnsi="Consolas"/>
+          <w:rFonts w:ascii="Consolas" w:eastAsia="Consolas" w:hAnsi="Consolas" w:cs="Consolas"/>
           <w:sz w:val="16"/>
           <w:szCs w:val="16"/>
         </w:rPr>
@@ -1186,7 +1628,7 @@
       </w:r>
       <w:r>
         <w:rPr>
-          <w:rFonts w:ascii="Consolas" w:cs="Consolas" w:eastAsia="Consolas" w:hAnsi="Consolas"/>
+          <w:rFonts w:ascii="Consolas" w:eastAsia="Consolas" w:hAnsi="Consolas" w:cs="Consolas"/>
           <w:sz w:val="16"/>
           <w:szCs w:val="16"/>
         </w:rPr>
@@ -1194,24 +1636,44 @@
       </w:r>
       <w:r>
         <w:rPr>
-          <w:rFonts w:ascii="Consolas" w:cs="Consolas" w:eastAsia="Consolas" w:hAnsi="Consolas"/>
+          <w:rFonts w:ascii="Consolas" w:eastAsia="Consolas" w:hAnsi="Consolas" w:cs="Consolas"/>
           <w:sz w:val="16"/>
           <w:szCs w:val="16"/>
         </w:rPr>
         <w:tab/>
       </w:r>
-      <w:r>
-        <w:rPr>
-          <w:rFonts w:ascii="Consolas" w:cs="Consolas" w:eastAsia="Consolas" w:hAnsi="Consolas"/>
-          <w:sz w:val="16"/>
-          <w:szCs w:val="16"/>
-        </w:rPr>
-        <w:t xml:space="preserve">hazard_sound.play()</w:t>
-      </w:r>
-    </w:p>
-    <w:p>
-      <w:pPr>
-        <w:shd w:fill="F2F2F2" w:val="clear"/>
+      <w:proofErr w:type="spellStart"/>
+      <w:r>
+        <w:rPr>
+          <w:rFonts w:ascii="Consolas" w:eastAsia="Consolas" w:hAnsi="Consolas" w:cs="Consolas"/>
+          <w:sz w:val="16"/>
+          <w:szCs w:val="16"/>
+        </w:rPr>
+        <w:t>hazard_</w:t>
+      </w:r>
+      <w:proofErr w:type="gramStart"/>
+      <w:r>
+        <w:rPr>
+          <w:rFonts w:ascii="Consolas" w:eastAsia="Consolas" w:hAnsi="Consolas" w:cs="Consolas"/>
+          <w:sz w:val="16"/>
+          <w:szCs w:val="16"/>
+        </w:rPr>
+        <w:t>sound.play</w:t>
+      </w:r>
+      <w:proofErr w:type="spellEnd"/>
+      <w:proofErr w:type="gramEnd"/>
+      <w:r>
+        <w:rPr>
+          <w:rFonts w:ascii="Consolas" w:eastAsia="Consolas" w:hAnsi="Consolas" w:cs="Consolas"/>
+          <w:sz w:val="16"/>
+          <w:szCs w:val="16"/>
+        </w:rPr>
+        <w:t>()</w:t>
+      </w:r>
+    </w:p>
+    <w:p>
+      <w:pPr>
+        <w:shd w:val="clear" w:color="auto" w:fill="F2F2F2"/>
         <w:tabs>
           <w:tab w:val="left" w:pos="240"/>
           <w:tab w:val="left" w:pos="480"/>
@@ -1226,12 +1688,12 @@
           <w:tab w:val="left" w:pos="2640"/>
           <w:tab w:val="left" w:pos="2880"/>
         </w:tabs>
-        <w:spacing w:after="160" w:before="0" w:line="240"/>
+        <w:spacing w:after="160"/>
         <w:ind w:left="720"/>
       </w:pPr>
       <w:r>
         <w:rPr>
-          <w:rFonts w:ascii="Consolas" w:cs="Consolas" w:eastAsia="Consolas" w:hAnsi="Consolas"/>
+          <w:rFonts w:ascii="Consolas" w:eastAsia="Consolas" w:hAnsi="Consolas" w:cs="Consolas"/>
           <w:sz w:val="16"/>
           <w:szCs w:val="16"/>
         </w:rPr>
@@ -1239,7 +1701,7 @@
       </w:r>
       <w:r>
         <w:rPr>
-          <w:rFonts w:ascii="Consolas" w:cs="Consolas" w:eastAsia="Consolas" w:hAnsi="Consolas"/>
+          <w:rFonts w:ascii="Consolas" w:eastAsia="Consolas" w:hAnsi="Consolas" w:cs="Consolas"/>
           <w:sz w:val="16"/>
           <w:szCs w:val="16"/>
         </w:rPr>
@@ -1247,20 +1709,50 @@
       </w:r>
       <w:r>
         <w:rPr>
-          <w:rFonts w:ascii="Consolas" w:cs="Consolas" w:eastAsia="Consolas" w:hAnsi="Consolas"/>
+          <w:rFonts w:ascii="Consolas" w:eastAsia="Consolas" w:hAnsi="Consolas" w:cs="Consolas"/>
           <w:sz w:val="16"/>
           <w:szCs w:val="16"/>
         </w:rPr>
         <w:tab/>
       </w:r>
-      <w:r>
-        <w:rPr>
-          <w:rFonts w:ascii="Consolas" w:cs="Consolas" w:eastAsia="Consolas" w:hAnsi="Consolas"/>
-          <w:sz w:val="16"/>
-          <w:szCs w:val="16"/>
-        </w:rPr>
-        <w:t xml:space="preserve">status_label.text = "%s hit a hazard and lost a life." % player.player_name</w:t>
-      </w:r>
+      <w:proofErr w:type="spellStart"/>
+      <w:r>
+        <w:rPr>
+          <w:rFonts w:ascii="Consolas" w:eastAsia="Consolas" w:hAnsi="Consolas" w:cs="Consolas"/>
+          <w:sz w:val="16"/>
+          <w:szCs w:val="16"/>
+        </w:rPr>
+        <w:t>status_label.text</w:t>
+      </w:r>
+      <w:proofErr w:type="spellEnd"/>
+      <w:r>
+        <w:rPr>
+          <w:rFonts w:ascii="Consolas" w:eastAsia="Consolas" w:hAnsi="Consolas" w:cs="Consolas"/>
+          <w:sz w:val="16"/>
+          <w:szCs w:val="16"/>
+        </w:rPr>
+        <w:t xml:space="preserve"> = "%s hit a hazard and lost a life." % </w:t>
+      </w:r>
+      <w:proofErr w:type="spellStart"/>
+      <w:proofErr w:type="gramStart"/>
+      <w:r>
+        <w:rPr>
+          <w:rFonts w:ascii="Consolas" w:eastAsia="Consolas" w:hAnsi="Consolas" w:cs="Consolas"/>
+          <w:sz w:val="16"/>
+          <w:szCs w:val="16"/>
+        </w:rPr>
+        <w:t>player.player</w:t>
+      </w:r>
+      <w:proofErr w:type="gramEnd"/>
+      <w:r>
+        <w:rPr>
+          <w:rFonts w:ascii="Consolas" w:eastAsia="Consolas" w:hAnsi="Consolas" w:cs="Consolas"/>
+          <w:sz w:val="16"/>
+          <w:szCs w:val="16"/>
+        </w:rPr>
+        <w:t>_name</w:t>
+      </w:r>
+      <w:proofErr w:type="spellEnd"/>
     </w:p>
     <w:p>
       <w:pPr>
@@ -1271,13 +1763,15 @@
         </w:numPr>
         <w:spacing w:after="60"/>
       </w:pPr>
+      <w:proofErr w:type="spellStart"/>
       <w:r>
         <w:rPr>
           <w:b/>
           <w:bCs/>
         </w:rPr>
-        <w:t xml:space="preserve">Ctrl+S</w:t>
-      </w:r>
+        <w:t>Ctrl+S</w:t>
+      </w:r>
+      <w:proofErr w:type="spellEnd"/>
       <w:r>
         <w:t xml:space="preserve"> to save.</w:t>
       </w:r>
@@ -1294,7 +1788,7 @@
           <w:b/>
           <w:bCs/>
         </w:rPr>
-        <w:t xml:space="preserve">CHECKPOINT:</w:t>
+        <w:t>CHECKPOINT:</w:t>
       </w:r>
       <w:r>
         <w:t xml:space="preserve"> Press </w:t>
@@ -1304,7 +1798,7 @@
           <w:b/>
           <w:bCs/>
         </w:rPr>
-        <w:t xml:space="preserve">F5</w:t>
+        <w:t>F5</w:t>
       </w:r>
       <w:r>
         <w:t xml:space="preserve"> and play until someone lands on a red hazard tile. You should hear your sound. (Tip: use the square-swap at the start of a turn to drag a hazard into a player's path.)</w:t>
@@ -1313,10 +1807,10 @@
     <w:p>
       <w:pPr>
         <w:pStyle w:val="Heading2"/>
-        <w:spacing w:after="120" w:before="240"/>
-      </w:pPr>
-      <w:r>
-        <w:t xml:space="preserve">Part D - Keep Going!</w:t>
+        <w:spacing w:before="240" w:after="120"/>
+      </w:pPr>
+      <w:r>
+        <w:t>Part D - Keep Going!</w:t>
       </w:r>
     </w:p>
     <w:p>
@@ -1326,17 +1820,48 @@
       <w:r>
         <w:t xml:space="preserve">Repeat parts A-C for more sounds. Good targets in </w:t>
       </w:r>
-      <w:r>
-        <w:rPr>
-          <w:rFonts w:ascii="Consolas" w:cs="Consolas" w:eastAsia="Consolas" w:hAnsi="Consolas"/>
-          <w:sz w:val="18"/>
-          <w:szCs w:val="18"/>
-          <w:shd w:fill="EEEEEE" w:val="clear"/>
-        </w:rPr>
-        <w:t xml:space="preserve">resolve_landed_tile()</w:t>
-      </w:r>
-      <w:r>
-        <w:t xml:space="preserve">:</w:t>
+      <w:proofErr w:type="spellStart"/>
+      <w:r>
+        <w:rPr>
+          <w:rFonts w:ascii="Consolas" w:eastAsia="Consolas" w:hAnsi="Consolas" w:cs="Consolas"/>
+          <w:sz w:val="18"/>
+          <w:szCs w:val="18"/>
+          <w:shd w:val="clear" w:color="auto" w:fill="EEEEEE"/>
+        </w:rPr>
+        <w:t>resolve_landed_</w:t>
+      </w:r>
+      <w:proofErr w:type="gramStart"/>
+      <w:r>
+        <w:rPr>
+          <w:rFonts w:ascii="Consolas" w:eastAsia="Consolas" w:hAnsi="Consolas" w:cs="Consolas"/>
+          <w:sz w:val="18"/>
+          <w:szCs w:val="18"/>
+          <w:shd w:val="clear" w:color="auto" w:fill="EEEEEE"/>
+        </w:rPr>
+        <w:t>tile</w:t>
+      </w:r>
+      <w:proofErr w:type="spellEnd"/>
+      <w:r>
+        <w:rPr>
+          <w:rFonts w:ascii="Consolas" w:eastAsia="Consolas" w:hAnsi="Consolas" w:cs="Consolas"/>
+          <w:sz w:val="18"/>
+          <w:szCs w:val="18"/>
+          <w:shd w:val="clear" w:color="auto" w:fill="EEEEEE"/>
+        </w:rPr>
+        <w:t>(</w:t>
+      </w:r>
+      <w:proofErr w:type="gramEnd"/>
+      <w:r>
+        <w:rPr>
+          <w:rFonts w:ascii="Consolas" w:eastAsia="Consolas" w:hAnsi="Consolas" w:cs="Consolas"/>
+          <w:sz w:val="18"/>
+          <w:szCs w:val="18"/>
+          <w:shd w:val="clear" w:color="auto" w:fill="EEEEEE"/>
+        </w:rPr>
+        <w:t>)</w:t>
+      </w:r>
+      <w:r>
+        <w:t>:</w:t>
       </w:r>
     </w:p>
     <w:p>
@@ -1353,24 +1878,24 @@
       </w:r>
       <w:r>
         <w:rPr>
-          <w:rFonts w:ascii="Consolas" w:cs="Consolas" w:eastAsia="Consolas" w:hAnsi="Consolas"/>
-          <w:sz w:val="18"/>
-          <w:szCs w:val="18"/>
-          <w:shd w:fill="EEEEEE" w:val="clear"/>
-        </w:rPr>
-        <w:t xml:space="preserve">JUMP</w:t>
+          <w:rFonts w:ascii="Consolas" w:eastAsia="Consolas" w:hAnsi="Consolas" w:cs="Consolas"/>
+          <w:sz w:val="18"/>
+          <w:szCs w:val="18"/>
+          <w:shd w:val="clear" w:color="auto" w:fill="EEEEEE"/>
+        </w:rPr>
+        <w:t>JUMP</w:t>
       </w:r>
       <w:r>
         <w:t xml:space="preserve"> branch - a whoosh for portals (</w:t>
       </w:r>
       <w:r>
         <w:rPr>
-          <w:rFonts w:ascii="Consolas" w:cs="Consolas" w:eastAsia="Consolas" w:hAnsi="Consolas"/>
-          <w:sz w:val="18"/>
-          <w:szCs w:val="18"/>
-          <w:shd w:fill="EEEEEE" w:val="clear"/>
-        </w:rPr>
-        <w:t xml:space="preserve">phaseJump1.ogg</w:t>
+          <w:rFonts w:ascii="Consolas" w:eastAsia="Consolas" w:hAnsi="Consolas" w:cs="Consolas"/>
+          <w:sz w:val="18"/>
+          <w:szCs w:val="18"/>
+          <w:shd w:val="clear" w:color="auto" w:fill="EEEEEE"/>
+        </w:rPr>
+        <w:t>phaseJump1.ogg</w:t>
       </w:r>
       <w:r>
         <w:t xml:space="preserve"> is great).</w:t>
@@ -1390,27 +1915,27 @@
       </w:r>
       <w:r>
         <w:rPr>
-          <w:rFonts w:ascii="Consolas" w:cs="Consolas" w:eastAsia="Consolas" w:hAnsi="Consolas"/>
-          <w:sz w:val="18"/>
-          <w:szCs w:val="18"/>
-          <w:shd w:fill="EEEEEE" w:val="clear"/>
-        </w:rPr>
-        <w:t xml:space="preserve">MOVE_FORWARD</w:t>
+          <w:rFonts w:ascii="Consolas" w:eastAsia="Consolas" w:hAnsi="Consolas" w:cs="Consolas"/>
+          <w:sz w:val="18"/>
+          <w:szCs w:val="18"/>
+          <w:shd w:val="clear" w:color="auto" w:fill="EEEEEE"/>
+        </w:rPr>
+        <w:t>MOVE_FORWARD</w:t>
       </w:r>
       <w:r>
         <w:t xml:space="preserve"> branch - a boost sound (</w:t>
       </w:r>
       <w:r>
         <w:rPr>
-          <w:rFonts w:ascii="Consolas" w:cs="Consolas" w:eastAsia="Consolas" w:hAnsi="Consolas"/>
-          <w:sz w:val="18"/>
-          <w:szCs w:val="18"/>
-          <w:shd w:fill="EEEEEE" w:val="clear"/>
-        </w:rPr>
-        <w:t xml:space="preserve">powerUp1.ogg</w:t>
-      </w:r>
-      <w:r>
-        <w:t xml:space="preserve">).</w:t>
+          <w:rFonts w:ascii="Consolas" w:eastAsia="Consolas" w:hAnsi="Consolas" w:cs="Consolas"/>
+          <w:sz w:val="18"/>
+          <w:szCs w:val="18"/>
+          <w:shd w:val="clear" w:color="auto" w:fill="EEEEEE"/>
+        </w:rPr>
+        <w:t>powerUp1.ogg</w:t>
+      </w:r>
+      <w:r>
+        <w:t>).</w:t>
       </w:r>
     </w:p>
     <w:p>
@@ -1427,12 +1952,12 @@
       </w:r>
       <w:r>
         <w:rPr>
-          <w:rFonts w:ascii="Consolas" w:cs="Consolas" w:eastAsia="Consolas" w:hAnsi="Consolas"/>
-          <w:sz w:val="18"/>
-          <w:szCs w:val="18"/>
-          <w:shd w:fill="EEEEEE" w:val="clear"/>
-        </w:rPr>
-        <w:t xml:space="preserve">GAIN_LIFE</w:t>
+          <w:rFonts w:ascii="Consolas" w:eastAsia="Consolas" w:hAnsi="Consolas" w:cs="Consolas"/>
+          <w:sz w:val="18"/>
+          <w:szCs w:val="18"/>
+          <w:shd w:val="clear" w:color="auto" w:fill="EEEEEE"/>
+        </w:rPr>
+        <w:t>GAIN_LIFE</w:t>
       </w:r>
       <w:r>
         <w:t xml:space="preserve"> branch - a happy sound.</w:t>
@@ -1445,29 +1970,131 @@
       <w:r>
         <w:t xml:space="preserve">And one outside it: find </w:t>
       </w:r>
-      <w:r>
-        <w:rPr>
-          <w:rFonts w:ascii="Consolas" w:cs="Consolas" w:eastAsia="Consolas" w:hAnsi="Consolas"/>
-          <w:sz w:val="18"/>
-          <w:szCs w:val="18"/>
-          <w:shd w:fill="EEEEEE" w:val="clear"/>
-        </w:rPr>
-        <w:t xml:space="preserve">roll_dice()</w:t>
+      <w:proofErr w:type="spellStart"/>
+      <w:r>
+        <w:rPr>
+          <w:rFonts w:ascii="Consolas" w:eastAsia="Consolas" w:hAnsi="Consolas" w:cs="Consolas"/>
+          <w:sz w:val="18"/>
+          <w:szCs w:val="18"/>
+          <w:shd w:val="clear" w:color="auto" w:fill="EEEEEE"/>
+        </w:rPr>
+        <w:t>roll_</w:t>
+      </w:r>
+      <w:proofErr w:type="gramStart"/>
+      <w:r>
+        <w:rPr>
+          <w:rFonts w:ascii="Consolas" w:eastAsia="Consolas" w:hAnsi="Consolas" w:cs="Consolas"/>
+          <w:sz w:val="18"/>
+          <w:szCs w:val="18"/>
+          <w:shd w:val="clear" w:color="auto" w:fill="EEEEEE"/>
+        </w:rPr>
+        <w:t>dice</w:t>
+      </w:r>
+      <w:proofErr w:type="spellEnd"/>
+      <w:r>
+        <w:rPr>
+          <w:rFonts w:ascii="Consolas" w:eastAsia="Consolas" w:hAnsi="Consolas" w:cs="Consolas"/>
+          <w:sz w:val="18"/>
+          <w:szCs w:val="18"/>
+          <w:shd w:val="clear" w:color="auto" w:fill="EEEEEE"/>
+        </w:rPr>
+        <w:t>(</w:t>
+      </w:r>
+      <w:proofErr w:type="gramEnd"/>
+      <w:r>
+        <w:rPr>
+          <w:rFonts w:ascii="Consolas" w:eastAsia="Consolas" w:hAnsi="Consolas" w:cs="Consolas"/>
+          <w:sz w:val="18"/>
+          <w:szCs w:val="18"/>
+          <w:shd w:val="clear" w:color="auto" w:fill="EEEEEE"/>
+        </w:rPr>
+        <w:t>)</w:t>
       </w:r>
       <w:r>
         <w:t xml:space="preserve"> and play a click or blip right after the line </w:t>
       </w:r>
       <w:r>
         <w:rPr>
-          <w:rFonts w:ascii="Consolas" w:cs="Consolas" w:eastAsia="Consolas" w:hAnsi="Consolas"/>
-          <w:sz w:val="18"/>
-          <w:szCs w:val="18"/>
-          <w:shd w:fill="EEEEEE" w:val="clear"/>
-        </w:rPr>
-        <w:t xml:space="preserve">var roll := rng.randi_range(1, 6)</w:t>
-      </w:r>
-      <w:r>
-        <w:t xml:space="preserve">.</w:t>
+          <w:rFonts w:ascii="Consolas" w:eastAsia="Consolas" w:hAnsi="Consolas" w:cs="Consolas"/>
+          <w:sz w:val="18"/>
+          <w:szCs w:val="18"/>
+          <w:shd w:val="clear" w:color="auto" w:fill="EEEEEE"/>
+        </w:rPr>
+        <w:t xml:space="preserve">var </w:t>
+      </w:r>
+      <w:proofErr w:type="gramStart"/>
+      <w:r>
+        <w:rPr>
+          <w:rFonts w:ascii="Consolas" w:eastAsia="Consolas" w:hAnsi="Consolas" w:cs="Consolas"/>
+          <w:sz w:val="18"/>
+          <w:szCs w:val="18"/>
+          <w:shd w:val="clear" w:color="auto" w:fill="EEEEEE"/>
+        </w:rPr>
+        <w:t>roll :</w:t>
+      </w:r>
+      <w:proofErr w:type="gramEnd"/>
+      <w:r>
+        <w:rPr>
+          <w:rFonts w:ascii="Consolas" w:eastAsia="Consolas" w:hAnsi="Consolas" w:cs="Consolas"/>
+          <w:sz w:val="18"/>
+          <w:szCs w:val="18"/>
+          <w:shd w:val="clear" w:color="auto" w:fill="EEEEEE"/>
+        </w:rPr>
+        <w:t xml:space="preserve">= </w:t>
+      </w:r>
+      <w:proofErr w:type="spellStart"/>
+      <w:proofErr w:type="gramStart"/>
+      <w:r>
+        <w:rPr>
+          <w:rFonts w:ascii="Consolas" w:eastAsia="Consolas" w:hAnsi="Consolas" w:cs="Consolas"/>
+          <w:sz w:val="18"/>
+          <w:szCs w:val="18"/>
+          <w:shd w:val="clear" w:color="auto" w:fill="EEEEEE"/>
+        </w:rPr>
+        <w:t>rng.randi</w:t>
+      </w:r>
+      <w:proofErr w:type="gramEnd"/>
+      <w:r>
+        <w:rPr>
+          <w:rFonts w:ascii="Consolas" w:eastAsia="Consolas" w:hAnsi="Consolas" w:cs="Consolas"/>
+          <w:sz w:val="18"/>
+          <w:szCs w:val="18"/>
+          <w:shd w:val="clear" w:color="auto" w:fill="EEEEEE"/>
+        </w:rPr>
+        <w:t>_</w:t>
+      </w:r>
+      <w:proofErr w:type="gramStart"/>
+      <w:r>
+        <w:rPr>
+          <w:rFonts w:ascii="Consolas" w:eastAsia="Consolas" w:hAnsi="Consolas" w:cs="Consolas"/>
+          <w:sz w:val="18"/>
+          <w:szCs w:val="18"/>
+          <w:shd w:val="clear" w:color="auto" w:fill="EEEEEE"/>
+        </w:rPr>
+        <w:t>range</w:t>
+      </w:r>
+      <w:proofErr w:type="spellEnd"/>
+      <w:r>
+        <w:rPr>
+          <w:rFonts w:ascii="Consolas" w:eastAsia="Consolas" w:hAnsi="Consolas" w:cs="Consolas"/>
+          <w:sz w:val="18"/>
+          <w:szCs w:val="18"/>
+          <w:shd w:val="clear" w:color="auto" w:fill="EEEEEE"/>
+        </w:rPr>
+        <w:t>(</w:t>
+      </w:r>
+      <w:proofErr w:type="gramEnd"/>
+      <w:r>
+        <w:rPr>
+          <w:rFonts w:ascii="Consolas" w:eastAsia="Consolas" w:hAnsi="Consolas" w:cs="Consolas"/>
+          <w:sz w:val="18"/>
+          <w:szCs w:val="18"/>
+          <w:shd w:val="clear" w:color="auto" w:fill="EEEEEE"/>
+        </w:rPr>
+        <w:t>1, 6)</w:t>
+      </w:r>
+      <w:r>
+        <w:t>.</w:t>
       </w:r>
     </w:p>
     <w:p>
@@ -1479,60 +2106,78 @@
       </w:r>
       <w:r>
         <w:rPr>
-          <w:rFonts w:ascii="Consolas" w:cs="Consolas" w:eastAsia="Consolas" w:hAnsi="Consolas"/>
-          <w:sz w:val="18"/>
-          <w:szCs w:val="18"/>
-          <w:shd w:fill="EEEEEE" w:val="clear"/>
-        </w:rPr>
-        <w:t xml:space="preserve">assets/sounds</w:t>
+          <w:rFonts w:ascii="Consolas" w:eastAsia="Consolas" w:hAnsi="Consolas" w:cs="Consolas"/>
+          <w:sz w:val="18"/>
+          <w:szCs w:val="18"/>
+          <w:shd w:val="clear" w:color="auto" w:fill="EEEEEE"/>
+        </w:rPr>
+        <w:t>assets/sounds</w:t>
       </w:r>
       <w:r>
         <w:t xml:space="preserve">, an </w:t>
       </w:r>
-      <w:r>
-        <w:rPr>
-          <w:rFonts w:ascii="Consolas" w:cs="Consolas" w:eastAsia="Consolas" w:hAnsi="Consolas"/>
-          <w:sz w:val="18"/>
-          <w:szCs w:val="18"/>
-          <w:shd w:fill="EEEEEE" w:val="clear"/>
-        </w:rPr>
-        <w:t xml:space="preserve">AudioStreamPlayer</w:t>
-      </w:r>
+      <w:proofErr w:type="spellStart"/>
+      <w:r>
+        <w:rPr>
+          <w:rFonts w:ascii="Consolas" w:eastAsia="Consolas" w:hAnsi="Consolas" w:cs="Consolas"/>
+          <w:sz w:val="18"/>
+          <w:szCs w:val="18"/>
+          <w:shd w:val="clear" w:color="auto" w:fill="EEEEEE"/>
+        </w:rPr>
+        <w:t>AudioStreamPlayer</w:t>
+      </w:r>
+      <w:proofErr w:type="spellEnd"/>
       <w:r>
         <w:t xml:space="preserve"> node in </w:t>
       </w:r>
-      <w:r>
-        <w:rPr>
-          <w:rFonts w:ascii="Consolas" w:cs="Consolas" w:eastAsia="Consolas" w:hAnsi="Consolas"/>
-          <w:sz w:val="18"/>
-          <w:szCs w:val="18"/>
-          <w:shd w:fill="EEEEEE" w:val="clear"/>
-        </w:rPr>
-        <w:t xml:space="preserve">Main.tscn</w:t>
-      </w:r>
+      <w:proofErr w:type="spellStart"/>
+      <w:r>
+        <w:rPr>
+          <w:rFonts w:ascii="Consolas" w:eastAsia="Consolas" w:hAnsi="Consolas" w:cs="Consolas"/>
+          <w:sz w:val="18"/>
+          <w:szCs w:val="18"/>
+          <w:shd w:val="clear" w:color="auto" w:fill="EEEEEE"/>
+        </w:rPr>
+        <w:t>Main.tscn</w:t>
+      </w:r>
+      <w:proofErr w:type="spellEnd"/>
       <w:r>
         <w:t xml:space="preserve">, an </w:t>
       </w:r>
       <w:r>
         <w:rPr>
-          <w:rFonts w:ascii="Consolas" w:cs="Consolas" w:eastAsia="Consolas" w:hAnsi="Consolas"/>
-          <w:sz w:val="18"/>
-          <w:szCs w:val="18"/>
-          <w:shd w:fill="EEEEEE" w:val="clear"/>
-        </w:rPr>
-        <w:t xml:space="preserve">@onready</w:t>
-      </w:r>
-      <w:r>
-        <w:t xml:space="preserve"> line, and a </w:t>
-      </w:r>
-      <w:r>
-        <w:rPr>
-          <w:rFonts w:ascii="Consolas" w:cs="Consolas" w:eastAsia="Consolas" w:hAnsi="Consolas"/>
-          <w:sz w:val="18"/>
-          <w:szCs w:val="18"/>
-          <w:shd w:fill="EEEEEE" w:val="clear"/>
-        </w:rPr>
-        <w:t xml:space="preserve">.play()</w:t>
+          <w:rFonts w:ascii="Consolas" w:eastAsia="Consolas" w:hAnsi="Consolas" w:cs="Consolas"/>
+          <w:sz w:val="18"/>
+          <w:szCs w:val="18"/>
+          <w:shd w:val="clear" w:color="auto" w:fill="EEEEEE"/>
+        </w:rPr>
+        <w:t>@onready</w:t>
+      </w:r>
+      <w:r>
+        <w:t xml:space="preserve"> line, and </w:t>
+      </w:r>
+      <w:proofErr w:type="gramStart"/>
+      <w:r>
+        <w:t xml:space="preserve">a </w:t>
+      </w:r>
+      <w:r>
+        <w:rPr>
+          <w:rFonts w:ascii="Consolas" w:eastAsia="Consolas" w:hAnsi="Consolas" w:cs="Consolas"/>
+          <w:sz w:val="18"/>
+          <w:szCs w:val="18"/>
+          <w:shd w:val="clear" w:color="auto" w:fill="EEEEEE"/>
+        </w:rPr>
+        <w:t>.play</w:t>
+      </w:r>
+      <w:proofErr w:type="gramEnd"/>
+      <w:r>
+        <w:rPr>
+          <w:rFonts w:ascii="Consolas" w:eastAsia="Consolas" w:hAnsi="Consolas" w:cs="Consolas"/>
+          <w:sz w:val="18"/>
+          <w:szCs w:val="18"/>
+          <w:shd w:val="clear" w:color="auto" w:fill="EEEEEE"/>
+        </w:rPr>
+        <w:t>()</w:t>
       </w:r>
       <w:r>
         <w:t xml:space="preserve"> call.</w:t>
@@ -1541,10 +2186,10 @@
     <w:p>
       <w:pPr>
         <w:pStyle w:val="Heading2"/>
-        <w:spacing w:after="120" w:before="240"/>
-      </w:pPr>
-      <w:r>
-        <w:t xml:space="preserve">Stretch Goals</w:t>
+        <w:spacing w:before="240" w:after="120"/>
+      </w:pPr>
+      <w:r>
+        <w:t>Stretch Goals</w:t>
       </w:r>
     </w:p>
     <w:p>
@@ -1561,7 +2206,7 @@
           <w:b/>
           <w:bCs/>
         </w:rPr>
-        <w:t xml:space="preserve">Volume:</w:t>
+        <w:t>Volume:</w:t>
       </w:r>
       <w:r>
         <w:t xml:space="preserve"> if a sound is too loud, select its node and lower </w:t>
@@ -1571,22 +2216,22 @@
           <w:b/>
           <w:bCs/>
         </w:rPr>
-        <w:t xml:space="preserve">Volume dB</w:t>
+        <w:t>Volume dB</w:t>
       </w:r>
       <w:r>
         <w:t xml:space="preserve"> in the Inspector (try </w:t>
       </w:r>
       <w:r>
         <w:rPr>
-          <w:rFonts w:ascii="Consolas" w:cs="Consolas" w:eastAsia="Consolas" w:hAnsi="Consolas"/>
-          <w:sz w:val="18"/>
-          <w:szCs w:val="18"/>
-          <w:shd w:fill="EEEEEE" w:val="clear"/>
-        </w:rPr>
-        <w:t xml:space="preserve">-10</w:t>
-      </w:r>
-      <w:r>
-        <w:t xml:space="preserve">).</w:t>
+          <w:rFonts w:ascii="Consolas" w:eastAsia="Consolas" w:hAnsi="Consolas" w:cs="Consolas"/>
+          <w:sz w:val="18"/>
+          <w:szCs w:val="18"/>
+          <w:shd w:val="clear" w:color="auto" w:fill="EEEEEE"/>
+        </w:rPr>
+        <w:t>-10</w:t>
+      </w:r>
+      <w:r>
+        <w:t>).</w:t>
       </w:r>
     </w:p>
     <w:p>
@@ -1603,19 +2248,50 @@
           <w:b/>
           <w:bCs/>
         </w:rPr>
-        <w:t xml:space="preserve">A win fanfare:</w:t>
+        <w:t>A win fanfare:</w:t>
       </w:r>
       <w:r>
         <w:t xml:space="preserve"> find </w:t>
       </w:r>
-      <w:r>
-        <w:rPr>
-          <w:rFonts w:ascii="Consolas" w:cs="Consolas" w:eastAsia="Consolas" w:hAnsi="Consolas"/>
-          <w:sz w:val="18"/>
-          <w:szCs w:val="18"/>
-          <w:shd w:fill="EEEEEE" w:val="clear"/>
-        </w:rPr>
-        <w:t xml:space="preserve">check_for_winner()</w:t>
+      <w:proofErr w:type="spellStart"/>
+      <w:r>
+        <w:rPr>
+          <w:rFonts w:ascii="Consolas" w:eastAsia="Consolas" w:hAnsi="Consolas" w:cs="Consolas"/>
+          <w:sz w:val="18"/>
+          <w:szCs w:val="18"/>
+          <w:shd w:val="clear" w:color="auto" w:fill="EEEEEE"/>
+        </w:rPr>
+        <w:t>check_for_</w:t>
+      </w:r>
+      <w:proofErr w:type="gramStart"/>
+      <w:r>
+        <w:rPr>
+          <w:rFonts w:ascii="Consolas" w:eastAsia="Consolas" w:hAnsi="Consolas" w:cs="Consolas"/>
+          <w:sz w:val="18"/>
+          <w:szCs w:val="18"/>
+          <w:shd w:val="clear" w:color="auto" w:fill="EEEEEE"/>
+        </w:rPr>
+        <w:t>winner</w:t>
+      </w:r>
+      <w:proofErr w:type="spellEnd"/>
+      <w:r>
+        <w:rPr>
+          <w:rFonts w:ascii="Consolas" w:eastAsia="Consolas" w:hAnsi="Consolas" w:cs="Consolas"/>
+          <w:sz w:val="18"/>
+          <w:szCs w:val="18"/>
+          <w:shd w:val="clear" w:color="auto" w:fill="EEEEEE"/>
+        </w:rPr>
+        <w:t>(</w:t>
+      </w:r>
+      <w:proofErr w:type="gramEnd"/>
+      <w:r>
+        <w:rPr>
+          <w:rFonts w:ascii="Consolas" w:eastAsia="Consolas" w:hAnsi="Consolas" w:cs="Consolas"/>
+          <w:sz w:val="18"/>
+          <w:szCs w:val="18"/>
+          <w:shd w:val="clear" w:color="auto" w:fill="EEEEEE"/>
+        </w:rPr>
+        <w:t>)</w:t>
       </w:r>
       <w:r>
         <w:t xml:space="preserve"> and play something triumphant when the game ends.</w:t>
@@ -1635,7 +2311,7 @@
           <w:b/>
           <w:bCs/>
         </w:rPr>
-        <w:t xml:space="preserve">Random pitch:</w:t>
+        <w:t>Random pitch:</w:t>
       </w:r>
       <w:r>
         <w:t xml:space="preserve"> set </w:t>
@@ -1645,39 +2321,28 @@
           <w:b/>
           <w:bCs/>
         </w:rPr>
-        <w:t xml:space="preserve">Pitch Scale</w:t>
+        <w:t>Pitch Scale</w:t>
       </w:r>
       <w:r>
         <w:t xml:space="preserve"> in the Inspector to make a sound higher or lower.</w:t>
       </w:r>
     </w:p>
     <w:sectPr>
-      <w:pgSz w:w="11906" w:h="16838" w:orient="portrait"/>
+      <w:headerReference w:type="default" r:id="rId7"/>
+      <w:footerReference w:type="default" r:id="rId8"/>
+      <w:pgSz w:w="11906" w:h="16838"/>
       <w:pgMar w:top="1440" w:right="1440" w:bottom="1440" w:left="1440" w:header="708" w:footer="708" w:gutter="0"/>
-      <w:pgNumType/>
+      <w:cols w:space="720"/>
       <w:docGrid w:linePitch="360"/>
     </w:sectPr>
   </w:body>
 </w:document>
 </file>
 
-<file path=word/comments.xml><?xml version="1.0" encoding="utf-8"?>
-<w:comments xmlns:cx="http://schemas.microsoft.com/office/drawing/2014/chartex" xmlns:cx1="http://schemas.microsoft.com/office/drawing/2015/9/8/chartex" xmlns:cx2="http://schemas.microsoft.com/office/drawing/2015/10/21/chartex" xmlns:cx3="http://schemas.microsoft.com/office/drawing/2016/5/9/chartex" xmlns:cx4="http://schemas.microsoft.com/office/drawing/2016/5/10/chartex" xmlns:cx5="http://schemas.microsoft.com/office/drawing/2016/5/11/chartex" xmlns:cx6="http://schemas.microsoft.com/office/drawing/2016/5/12/chartex" xmlns:cx7="http://schemas.microsoft.com/office/drawing/2016/5/13/chartex" xmlns:cx8="http://schemas.microsoft.com/office/drawing/2016/5/14/chartex" xmlns:mc="http://schemas.openxmlformats.org/markup-compatibility/2006" xmlns:aink="http://schemas.microsoft.com/office/drawing/2016/ink" xmlns:am3d="http://schemas.microsoft.com/office/drawing/2017/model3d" xmlns:o="urn:schemas-microsoft-com:office:office" xmlns:r="http://schemas.openxmlformats.org/officeDocument/2006/relationships" xmlns:m="http://schemas.openxmlformats.org/officeDocument/2006/math" xmlns:v="urn:schemas-microsoft-com:vml" xmlns:wp14="http://schemas.microsoft.com/office/word/2010/wordprocessingDrawing" xmlns:wp="http://schemas.openxmlformats.org/drawingml/2006/wordprocessingDrawing" xmlns:w10="urn:schemas-microsoft-com:office:word" xmlns:w="http://schemas.openxmlformats.org/wordprocessingml/2006/main" xmlns:w14="http://schemas.microsoft.com/office/word/2010/wordml" xmlns:w15="http://schemas.microsoft.com/office/word/2012/wordml" xmlns:w16cex="http://schemas.microsoft.com/office/word/2018/wordml/cex" xmlns:w16cid="http://schemas.microsoft.com/office/word/2016/wordml/cid" xmlns:w16="http://schemas.microsoft.com/office/word/2018/wordml" xmlns:w16sdtdh="http://schemas.microsoft.com/office/word/2020/wordml/sdtdatahash" xmlns:w16se="http://schemas.microsoft.com/office/word/2015/wordml/symex" xmlns:wpg="http://schemas.microsoft.com/office/word/2010/wordprocessingGroup" xmlns:wpi="http://schemas.microsoft.com/office/word/2010/wordprocessingInk" xmlns:wne="http://schemas.microsoft.com/office/word/2006/wordml" xmlns:wps="http://schemas.microsoft.com/office/word/2010/wordprocessingShape"/>
-</file>
-
 <file path=word/endnotes.xml><?xml version="1.0" encoding="utf-8"?>
-<w:endnotes xmlns:wpc="http://schemas.microsoft.com/office/word/2010/wordprocessingCanvas" xmlns:mc="http://schemas.openxmlformats.org/markup-compatibility/2006" xmlns:o="urn:schemas-microsoft-com:office:office" xmlns:r="http://schemas.openxmlformats.org/officeDocument/2006/relationships" xmlns:m="http://schemas.openxmlformats.org/officeDocument/2006/math" xmlns:v="urn:schemas-microsoft-com:vml" xmlns:wp14="http://schemas.microsoft.com/office/word/2010/wordprocessingDrawing" xmlns:wp="http://schemas.openxmlformats.org/drawingml/2006/wordprocessingDrawing" xmlns:w10="urn:schemas-microsoft-com:office:word" xmlns:w="http://schemas.openxmlformats.org/wordprocessingml/2006/main" xmlns:w14="http://schemas.microsoft.com/office/word/2010/wordml" xmlns:w15="http://schemas.microsoft.com/office/word/2012/wordml" xmlns:wpg="http://schemas.microsoft.com/office/word/2010/wordprocessingGroup" xmlns:wpi="http://schemas.microsoft.com/office/word/2010/wordprocessingInk" xmlns:wne="http://schemas.microsoft.com/office/word/2006/wordml" xmlns:wps="http://schemas.microsoft.com/office/word/2010/wordprocessingShape" mc:Ignorable="w14 w15 wp14">
+<w:endnotes xmlns:wpc="http://schemas.microsoft.com/office/word/2010/wordprocessingCanvas" xmlns:cx="http://schemas.microsoft.com/office/drawing/2014/chartex" xmlns:cx1="http://schemas.microsoft.com/office/drawing/2015/9/8/chartex" xmlns:cx2="http://schemas.microsoft.com/office/drawing/2015/10/21/chartex" xmlns:cx3="http://schemas.microsoft.com/office/drawing/2016/5/9/chartex" xmlns:cx4="http://schemas.microsoft.com/office/drawing/2016/5/10/chartex" xmlns:cx5="http://schemas.microsoft.com/office/drawing/2016/5/11/chartex" xmlns:cx6="http://schemas.microsoft.com/office/drawing/2016/5/12/chartex" xmlns:cx7="http://schemas.microsoft.com/office/drawing/2016/5/13/chartex" xmlns:cx8="http://schemas.microsoft.com/office/drawing/2016/5/14/chartex" xmlns:mc="http://schemas.openxmlformats.org/markup-compatibility/2006" xmlns:aink="http://schemas.microsoft.com/office/drawing/2016/ink" xmlns:am3d="http://schemas.microsoft.com/office/drawing/2017/model3d" xmlns:o="urn:schemas-microsoft-com:office:office" xmlns:oel="http://schemas.microsoft.com/office/2019/extlst" xmlns:r="http://schemas.openxmlformats.org/officeDocument/2006/relationships" xmlns:m="http://schemas.openxmlformats.org/officeDocument/2006/math" xmlns:v="urn:schemas-microsoft-com:vml" xmlns:wp14="http://schemas.microsoft.com/office/word/2010/wordprocessingDrawing" xmlns:wp="http://schemas.openxmlformats.org/drawingml/2006/wordprocessingDrawing" xmlns:w10="urn:schemas-microsoft-com:office:word" xmlns:w="http://schemas.openxmlformats.org/wordprocessingml/2006/main" xmlns:w14="http://schemas.microsoft.com/office/word/2010/wordml" xmlns:w15="http://schemas.microsoft.com/office/word/2012/wordml" xmlns:w16cex="http://schemas.microsoft.com/office/word/2018/wordml/cex" xmlns:w16cid="http://schemas.microsoft.com/office/word/2016/wordml/cid" xmlns:w16="http://schemas.microsoft.com/office/word/2018/wordml" xmlns:w16du="http://schemas.microsoft.com/office/word/2023/wordml/word16du" xmlns:w16sdtdh="http://schemas.microsoft.com/office/word/2020/wordml/sdtdatahash" xmlns:w16sdtfl="http://schemas.microsoft.com/office/word/2024/wordml/sdtformatlock" xmlns:w16se="http://schemas.microsoft.com/office/word/2015/wordml/symex" xmlns:wpg="http://schemas.microsoft.com/office/word/2010/wordprocessingGroup" xmlns:wpi="http://schemas.microsoft.com/office/word/2010/wordprocessingInk" xmlns:wne="http://schemas.microsoft.com/office/word/2006/wordml" xmlns:wps="http://schemas.microsoft.com/office/word/2010/wordprocessingShape" mc:Ignorable="w14 w15 w16se w16cid w16 w16cex w16sdtdh w16sdtfl w16du wp14">
   <w:endnote w:type="separator" w:id="-1">
     <w:p>
-      <w:pPr>
-        <w:spacing w:after="0" w:line="240" w:lineRule="auto"/>
-      </w:pPr>
-      <w:r>
-        <w:rPr>
-          <w:rStyle w:val="EndnoteReference"/>
-        </w:rPr>
-        <w:endnoteRef/>
-      </w:r>
       <w:r>
         <w:separator/>
       </w:r>
@@ -1685,15 +2350,6 @@
   </w:endnote>
   <w:endnote w:type="continuationSeparator" w:id="0">
     <w:p>
-      <w:pPr>
-        <w:spacing w:after="0" w:line="240" w:lineRule="auto"/>
-      </w:pPr>
-      <w:r>
-        <w:rPr>
-          <w:rStyle w:val="EndnoteReference"/>
-        </w:rPr>
-        <w:endnoteRef/>
-      </w:r>
       <w:r>
         <w:continuationSeparator/>
       </w:r>
@@ -1702,19 +2358,138 @@
 </w:endnotes>
 </file>
 
+<file path=word/footer1.xml><?xml version="1.0" encoding="utf-8"?>
+<w:ftr xmlns:wpc="http://schemas.microsoft.com/office/word/2010/wordprocessingCanvas" xmlns:cx="http://schemas.microsoft.com/office/drawing/2014/chartex" xmlns:cx1="http://schemas.microsoft.com/office/drawing/2015/9/8/chartex" xmlns:cx2="http://schemas.microsoft.com/office/drawing/2015/10/21/chartex" xmlns:cx3="http://schemas.microsoft.com/office/drawing/2016/5/9/chartex" xmlns:cx4="http://schemas.microsoft.com/office/drawing/2016/5/10/chartex" xmlns:cx5="http://schemas.microsoft.com/office/drawing/2016/5/11/chartex" xmlns:cx6="http://schemas.microsoft.com/office/drawing/2016/5/12/chartex" xmlns:cx7="http://schemas.microsoft.com/office/drawing/2016/5/13/chartex" xmlns:cx8="http://schemas.microsoft.com/office/drawing/2016/5/14/chartex" xmlns:mc="http://schemas.openxmlformats.org/markup-compatibility/2006" xmlns:aink="http://schemas.microsoft.com/office/drawing/2016/ink" xmlns:am3d="http://schemas.microsoft.com/office/drawing/2017/model3d" xmlns:o="urn:schemas-microsoft-com:office:office" xmlns:oel="http://schemas.microsoft.com/office/2019/extlst" xmlns:r="http://schemas.openxmlformats.org/officeDocument/2006/relationships" xmlns:m="http://schemas.openxmlformats.org/officeDocument/2006/math" xmlns:v="urn:schemas-microsoft-com:vml" xmlns:wp14="http://schemas.microsoft.com/office/word/2010/wordprocessingDrawing" xmlns:wp="http://schemas.openxmlformats.org/drawingml/2006/wordprocessingDrawing" xmlns:w10="urn:schemas-microsoft-com:office:word" xmlns:w="http://schemas.openxmlformats.org/wordprocessingml/2006/main" xmlns:w14="http://schemas.microsoft.com/office/word/2010/wordml" xmlns:w15="http://schemas.microsoft.com/office/word/2012/wordml" xmlns:w16cex="http://schemas.microsoft.com/office/word/2018/wordml/cex" xmlns:w16cid="http://schemas.microsoft.com/office/word/2016/wordml/cid" xmlns:w16="http://schemas.microsoft.com/office/word/2018/wordml" xmlns:w16du="http://schemas.microsoft.com/office/word/2023/wordml/word16du" xmlns:w16sdtdh="http://schemas.microsoft.com/office/word/2020/wordml/sdtdatahash" xmlns:w16sdtfl="http://schemas.microsoft.com/office/word/2024/wordml/sdtformatlock" xmlns:w16se="http://schemas.microsoft.com/office/word/2015/wordml/symex" xmlns:wpg="http://schemas.microsoft.com/office/word/2010/wordprocessingGroup" xmlns:wpi="http://schemas.microsoft.com/office/word/2010/wordprocessingInk" xmlns:wne="http://schemas.microsoft.com/office/word/2006/wordml" xmlns:wps="http://schemas.microsoft.com/office/word/2010/wordprocessingShape" mc:Ignorable="w14 w15 w16se w16cid w16 w16cex w16sdtdh w16sdtfl w16du wp14">
+  <w:sdt>
+    <w:sdtPr>
+      <w:id w:val="-534576830"/>
+      <w:docPartObj>
+        <w:docPartGallery w:val="Page Numbers (Bottom of Page)"/>
+        <w:docPartUnique/>
+      </w:docPartObj>
+    </w:sdtPr>
+    <w:sdtContent>
+      <w:sdt>
+        <w:sdtPr>
+          <w:id w:val="-1769616900"/>
+          <w:docPartObj>
+            <w:docPartGallery w:val="Page Numbers (Top of Page)"/>
+            <w:docPartUnique/>
+          </w:docPartObj>
+        </w:sdtPr>
+        <w:sdtContent>
+          <w:p>
+            <w:pPr>
+              <w:pStyle w:val="Footer"/>
+              <w:jc w:val="right"/>
+            </w:pPr>
+            <w:r>
+              <w:t xml:space="preserve">Page </w:t>
+            </w:r>
+            <w:r>
+              <w:rPr>
+                <w:b/>
+                <w:bCs/>
+                <w:sz w:val="24"/>
+                <w:szCs w:val="24"/>
+              </w:rPr>
+              <w:fldChar w:fldCharType="begin"/>
+            </w:r>
+            <w:r>
+              <w:rPr>
+                <w:b/>
+                <w:bCs/>
+              </w:rPr>
+              <w:instrText xml:space="preserve"> PAGE </w:instrText>
+            </w:r>
+            <w:r>
+              <w:rPr>
+                <w:b/>
+                <w:bCs/>
+                <w:sz w:val="24"/>
+                <w:szCs w:val="24"/>
+              </w:rPr>
+              <w:fldChar w:fldCharType="separate"/>
+            </w:r>
+            <w:r>
+              <w:rPr>
+                <w:b/>
+                <w:bCs/>
+                <w:noProof/>
+              </w:rPr>
+              <w:t>2</w:t>
+            </w:r>
+            <w:r>
+              <w:rPr>
+                <w:b/>
+                <w:bCs/>
+                <w:sz w:val="24"/>
+                <w:szCs w:val="24"/>
+              </w:rPr>
+              <w:fldChar w:fldCharType="end"/>
+            </w:r>
+            <w:r>
+              <w:t xml:space="preserve"> of </w:t>
+            </w:r>
+            <w:r>
+              <w:rPr>
+                <w:b/>
+                <w:bCs/>
+                <w:sz w:val="24"/>
+                <w:szCs w:val="24"/>
+              </w:rPr>
+              <w:fldChar w:fldCharType="begin"/>
+            </w:r>
+            <w:r>
+              <w:rPr>
+                <w:b/>
+                <w:bCs/>
+              </w:rPr>
+              <w:instrText xml:space="preserve"> NUMPAGES  </w:instrText>
+            </w:r>
+            <w:r>
+              <w:rPr>
+                <w:b/>
+                <w:bCs/>
+                <w:sz w:val="24"/>
+                <w:szCs w:val="24"/>
+              </w:rPr>
+              <w:fldChar w:fldCharType="separate"/>
+            </w:r>
+            <w:r>
+              <w:rPr>
+                <w:b/>
+                <w:bCs/>
+                <w:noProof/>
+              </w:rPr>
+              <w:t>2</w:t>
+            </w:r>
+            <w:r>
+              <w:rPr>
+                <w:b/>
+                <w:bCs/>
+                <w:sz w:val="24"/>
+                <w:szCs w:val="24"/>
+              </w:rPr>
+              <w:fldChar w:fldCharType="end"/>
+            </w:r>
+          </w:p>
+        </w:sdtContent>
+      </w:sdt>
+    </w:sdtContent>
+  </w:sdt>
+  <w:p>
+    <w:pPr>
+      <w:pStyle w:val="Footer"/>
+    </w:pPr>
+  </w:p>
+</w:ftr>
+</file>
+
 <file path=word/footnotes.xml><?xml version="1.0" encoding="utf-8"?>
-<w:footnotes xmlns:wpc="http://schemas.microsoft.com/office/word/2010/wordprocessingCanvas" xmlns:mc="http://schemas.openxmlformats.org/markup-compatibility/2006" xmlns:o="urn:schemas-microsoft-com:office:office" xmlns:r="http://schemas.openxmlformats.org/officeDocument/2006/relationships" xmlns:m="http://schemas.openxmlformats.org/officeDocument/2006/math" xmlns:v="urn:schemas-microsoft-com:vml" xmlns:wp14="http://schemas.microsoft.com/office/word/2010/wordprocessingDrawing" xmlns:wp="http://schemas.openxmlformats.org/drawingml/2006/wordprocessingDrawing" xmlns:w10="urn:schemas-microsoft-com:office:word" xmlns:w="http://schemas.openxmlformats.org/wordprocessingml/2006/main" xmlns:w14="http://schemas.microsoft.com/office/word/2010/wordml" xmlns:w15="http://schemas.microsoft.com/office/word/2012/wordml" xmlns:wpg="http://schemas.microsoft.com/office/word/2010/wordprocessingGroup" xmlns:wpi="http://schemas.microsoft.com/office/word/2010/wordprocessingInk" xmlns:wne="http://schemas.microsoft.com/office/word/2006/wordml" xmlns:wps="http://schemas.microsoft.com/office/word/2010/wordprocessingShape" mc:Ignorable="w14 w15 wp14">
+<w:footnotes xmlns:wpc="http://schemas.microsoft.com/office/word/2010/wordprocessingCanvas" xmlns:cx="http://schemas.microsoft.com/office/drawing/2014/chartex" xmlns:cx1="http://schemas.microsoft.com/office/drawing/2015/9/8/chartex" xmlns:cx2="http://schemas.microsoft.com/office/drawing/2015/10/21/chartex" xmlns:cx3="http://schemas.microsoft.com/office/drawing/2016/5/9/chartex" xmlns:cx4="http://schemas.microsoft.com/office/drawing/2016/5/10/chartex" xmlns:cx5="http://schemas.microsoft.com/office/drawing/2016/5/11/chartex" xmlns:cx6="http://schemas.microsoft.com/office/drawing/2016/5/12/chartex" xmlns:cx7="http://schemas.microsoft.com/office/drawing/2016/5/13/chartex" xmlns:cx8="http://schemas.microsoft.com/office/drawing/2016/5/14/chartex" xmlns:mc="http://schemas.openxmlformats.org/markup-compatibility/2006" xmlns:aink="http://schemas.microsoft.com/office/drawing/2016/ink" xmlns:am3d="http://schemas.microsoft.com/office/drawing/2017/model3d" xmlns:o="urn:schemas-microsoft-com:office:office" xmlns:oel="http://schemas.microsoft.com/office/2019/extlst" xmlns:r="http://schemas.openxmlformats.org/officeDocument/2006/relationships" xmlns:m="http://schemas.openxmlformats.org/officeDocument/2006/math" xmlns:v="urn:schemas-microsoft-com:vml" xmlns:wp14="http://schemas.microsoft.com/office/word/2010/wordprocessingDrawing" xmlns:wp="http://schemas.openxmlformats.org/drawingml/2006/wordprocessingDrawing" xmlns:w10="urn:schemas-microsoft-com:office:word" xmlns:w="http://schemas.openxmlformats.org/wordprocessingml/2006/main" xmlns:w14="http://schemas.microsoft.com/office/word/2010/wordml" xmlns:w15="http://schemas.microsoft.com/office/word/2012/wordml" xmlns:w16cex="http://schemas.microsoft.com/office/word/2018/wordml/cex" xmlns:w16cid="http://schemas.microsoft.com/office/word/2016/wordml/cid" xmlns:w16="http://schemas.microsoft.com/office/word/2018/wordml" xmlns:w16du="http://schemas.microsoft.com/office/word/2023/wordml/word16du" xmlns:w16sdtdh="http://schemas.microsoft.com/office/word/2020/wordml/sdtdatahash" xmlns:w16sdtfl="http://schemas.microsoft.com/office/word/2024/wordml/sdtformatlock" xmlns:w16se="http://schemas.microsoft.com/office/word/2015/wordml/symex" xmlns:wpg="http://schemas.microsoft.com/office/word/2010/wordprocessingGroup" xmlns:wpi="http://schemas.microsoft.com/office/word/2010/wordprocessingInk" xmlns:wne="http://schemas.microsoft.com/office/word/2006/wordml" xmlns:wps="http://schemas.microsoft.com/office/word/2010/wordprocessingShape" mc:Ignorable="w14 w15 w16se w16cid w16 w16cex w16sdtdh w16sdtfl w16du wp14">
   <w:footnote w:type="separator" w:id="-1">
     <w:p>
-      <w:pPr>
-        <w:spacing w:after="0" w:line="240" w:lineRule="auto"/>
-      </w:pPr>
-      <w:r>
-        <w:rPr>
-          <w:rStyle w:val="FootnoteReference"/>
-        </w:rPr>
-        <w:footnoteRef/>
-      </w:r>
       <w:r>
         <w:separator/>
       </w:r>
@@ -1722,15 +2497,6 @@
   </w:footnote>
   <w:footnote w:type="continuationSeparator" w:id="0">
     <w:p>
-      <w:pPr>
-        <w:spacing w:after="0" w:line="240" w:lineRule="auto"/>
-      </w:pPr>
-      <w:r>
-        <w:rPr>
-          <w:rStyle w:val="FootnoteReference"/>
-        </w:rPr>
-        <w:footnoteRef/>
-      </w:r>
       <w:r>
         <w:continuationSeparator/>
       </w:r>
@@ -1739,11 +2505,34 @@
 </w:footnotes>
 </file>
 
+<file path=word/header1.xml><?xml version="1.0" encoding="utf-8"?>
+<w:hdr xmlns:wpc="http://schemas.microsoft.com/office/word/2010/wordprocessingCanvas" xmlns:cx="http://schemas.microsoft.com/office/drawing/2014/chartex" xmlns:cx1="http://schemas.microsoft.com/office/drawing/2015/9/8/chartex" xmlns:cx2="http://schemas.microsoft.com/office/drawing/2015/10/21/chartex" xmlns:cx3="http://schemas.microsoft.com/office/drawing/2016/5/9/chartex" xmlns:cx4="http://schemas.microsoft.com/office/drawing/2016/5/10/chartex" xmlns:cx5="http://schemas.microsoft.com/office/drawing/2016/5/11/chartex" xmlns:cx6="http://schemas.microsoft.com/office/drawing/2016/5/12/chartex" xmlns:cx7="http://schemas.microsoft.com/office/drawing/2016/5/13/chartex" xmlns:cx8="http://schemas.microsoft.com/office/drawing/2016/5/14/chartex" xmlns:mc="http://schemas.openxmlformats.org/markup-compatibility/2006" xmlns:aink="http://schemas.microsoft.com/office/drawing/2016/ink" xmlns:am3d="http://schemas.microsoft.com/office/drawing/2017/model3d" xmlns:o="urn:schemas-microsoft-com:office:office" xmlns:oel="http://schemas.microsoft.com/office/2019/extlst" xmlns:r="http://schemas.openxmlformats.org/officeDocument/2006/relationships" xmlns:m="http://schemas.openxmlformats.org/officeDocument/2006/math" xmlns:v="urn:schemas-microsoft-com:vml" xmlns:wp14="http://schemas.microsoft.com/office/word/2010/wordprocessingDrawing" xmlns:wp="http://schemas.openxmlformats.org/drawingml/2006/wordprocessingDrawing" xmlns:w10="urn:schemas-microsoft-com:office:word" xmlns:w="http://schemas.openxmlformats.org/wordprocessingml/2006/main" xmlns:w14="http://schemas.microsoft.com/office/word/2010/wordml" xmlns:w15="http://schemas.microsoft.com/office/word/2012/wordml" xmlns:w16cex="http://schemas.microsoft.com/office/word/2018/wordml/cex" xmlns:w16cid="http://schemas.microsoft.com/office/word/2016/wordml/cid" xmlns:w16="http://schemas.microsoft.com/office/word/2018/wordml" xmlns:w16du="http://schemas.microsoft.com/office/word/2023/wordml/word16du" xmlns:w16sdtdh="http://schemas.microsoft.com/office/word/2020/wordml/sdtdatahash" xmlns:w16sdtfl="http://schemas.microsoft.com/office/word/2024/wordml/sdtformatlock" xmlns:w16se="http://schemas.microsoft.com/office/word/2015/wordml/symex" xmlns:wpg="http://schemas.microsoft.com/office/word/2010/wordprocessingGroup" xmlns:wpi="http://schemas.microsoft.com/office/word/2010/wordprocessingInk" xmlns:wne="http://schemas.microsoft.com/office/word/2006/wordml" xmlns:wps="http://schemas.microsoft.com/office/word/2010/wordprocessingShape" mc:Ignorable="w14 w15 w16se w16cid w16 w16cex w16sdtdh w16sdtfl w16du wp14">
+  <w:p>
+    <w:pPr>
+      <w:pStyle w:val="Header"/>
+    </w:pPr>
+    <w:r>
+      <w:t xml:space="preserve">Worksheet - Add Sound Effects </w:t>
+    </w:r>
+    <w:proofErr w:type="gramStart"/>
+    <w:r>
+      <w:t>To</w:t>
+    </w:r>
+    <w:proofErr w:type="gramEnd"/>
+    <w:r>
+      <w:t xml:space="preserve"> Tiles </w:t>
+    </w:r>
+  </w:p>
+</w:hdr>
+</file>
+
 <file path=word/numbering.xml><?xml version="1.0" encoding="utf-8"?>
-<w:numbering xmlns:wpc="http://schemas.microsoft.com/office/word/2010/wordprocessingCanvas" xmlns:mc="http://schemas.openxmlformats.org/markup-compatibility/2006" xmlns:o="urn:schemas-microsoft-com:office:office" xmlns:r="http://schemas.openxmlformats.org/officeDocument/2006/relationships" xmlns:m="http://schemas.openxmlformats.org/officeDocument/2006/math" xmlns:v="urn:schemas-microsoft-com:vml" xmlns:wp14="http://schemas.microsoft.com/office/word/2010/wordprocessingDrawing" xmlns:wp="http://schemas.openxmlformats.org/drawingml/2006/wordprocessingDrawing" xmlns:w10="urn:schemas-microsoft-com:office:word" xmlns:w="http://schemas.openxmlformats.org/wordprocessingml/2006/main" xmlns:w14="http://schemas.microsoft.com/office/word/2010/wordml" xmlns:w15="http://schemas.microsoft.com/office/word/2012/wordml" xmlns:wpg="http://schemas.microsoft.com/office/word/2010/wordprocessingGroup" xmlns:wpi="http://schemas.microsoft.com/office/word/2010/wordprocessingInk" xmlns:wne="http://schemas.microsoft.com/office/word/2006/wordml" xmlns:wps="http://schemas.microsoft.com/office/word/2010/wordprocessingShape" mc:Ignorable="w14 w15 wp14">
-  <w:abstractNum w:abstractNumId="1" w15:restartNumberingAfterBreak="0">
+<w:numbering xmlns:wpc="http://schemas.microsoft.com/office/word/2010/wordprocessingCanvas" xmlns:cx="http://schemas.microsoft.com/office/drawing/2014/chartex" xmlns:cx1="http://schemas.microsoft.com/office/drawing/2015/9/8/chartex" xmlns:cx2="http://schemas.microsoft.com/office/drawing/2015/10/21/chartex" xmlns:cx3="http://schemas.microsoft.com/office/drawing/2016/5/9/chartex" xmlns:cx4="http://schemas.microsoft.com/office/drawing/2016/5/10/chartex" xmlns:cx5="http://schemas.microsoft.com/office/drawing/2016/5/11/chartex" xmlns:cx6="http://schemas.microsoft.com/office/drawing/2016/5/12/chartex" xmlns:cx7="http://schemas.microsoft.com/office/drawing/2016/5/13/chartex" xmlns:cx8="http://schemas.microsoft.com/office/drawing/2016/5/14/chartex" xmlns:mc="http://schemas.openxmlformats.org/markup-compatibility/2006" xmlns:aink="http://schemas.microsoft.com/office/drawing/2016/ink" xmlns:am3d="http://schemas.microsoft.com/office/drawing/2017/model3d" xmlns:o="urn:schemas-microsoft-com:office:office" xmlns:oel="http://schemas.microsoft.com/office/2019/extlst" xmlns:r="http://schemas.openxmlformats.org/officeDocument/2006/relationships" xmlns:m="http://schemas.openxmlformats.org/officeDocument/2006/math" xmlns:v="urn:schemas-microsoft-com:vml" xmlns:wp14="http://schemas.microsoft.com/office/word/2010/wordprocessingDrawing" xmlns:wp="http://schemas.openxmlformats.org/drawingml/2006/wordprocessingDrawing" xmlns:w10="urn:schemas-microsoft-com:office:word" xmlns:w="http://schemas.openxmlformats.org/wordprocessingml/2006/main" xmlns:w14="http://schemas.microsoft.com/office/word/2010/wordml" xmlns:w15="http://schemas.microsoft.com/office/word/2012/wordml" xmlns:w16cex="http://schemas.microsoft.com/office/word/2018/wordml/cex" xmlns:w16cid="http://schemas.microsoft.com/office/word/2016/wordml/cid" xmlns:w16="http://schemas.microsoft.com/office/word/2018/wordml" xmlns:w16du="http://schemas.microsoft.com/office/word/2023/wordml/word16du" xmlns:w16sdtdh="http://schemas.microsoft.com/office/word/2020/wordml/sdtdatahash" xmlns:w16sdtfl="http://schemas.microsoft.com/office/word/2024/wordml/sdtformatlock" xmlns:w16se="http://schemas.microsoft.com/office/word/2015/wordml/symex" xmlns:wpg="http://schemas.microsoft.com/office/word/2010/wordprocessingGroup" xmlns:wpi="http://schemas.microsoft.com/office/word/2010/wordprocessingInk" xmlns:wne="http://schemas.microsoft.com/office/word/2006/wordml" xmlns:wps="http://schemas.microsoft.com/office/word/2010/wordprocessingShape" mc:Ignorable="w14 w15 w16se w16cid w16 w16cex w16sdtdh w16sdtfl w16du wp14">
+  <w:abstractNum w:abstractNumId="0" w15:restartNumberingAfterBreak="0">
+    <w:nsid w:val="265E0F1F"/>
     <w:multiLevelType w:val="hybridMultilevel"/>
-    <w:lvl w:ilvl="0" w15:tentative="1">
+    <w:tmpl w:val="F80A4564"/>
+    <w:lvl w:ilvl="0" w:tplc="6A165C42">
       <w:start w:val="1"/>
       <w:numFmt w:val="bullet"/>
       <w:lvlText w:val="●"/>
@@ -1752,7 +2541,7 @@
         <w:ind w:left="720" w:hanging="360"/>
       </w:pPr>
     </w:lvl>
-    <w:lvl w:ilvl="1" w15:tentative="1">
+    <w:lvl w:ilvl="1" w:tplc="B84CE4DA">
       <w:start w:val="1"/>
       <w:numFmt w:val="bullet"/>
       <w:lvlText w:val="○"/>
@@ -1761,7 +2550,7 @@
         <w:ind w:left="1440" w:hanging="360"/>
       </w:pPr>
     </w:lvl>
-    <w:lvl w:ilvl="2" w15:tentative="1">
+    <w:lvl w:ilvl="2" w:tplc="1AEE6468">
       <w:start w:val="1"/>
       <w:numFmt w:val="bullet"/>
       <w:lvlText w:val="■"/>
@@ -1770,7 +2559,7 @@
         <w:ind w:left="2160" w:hanging="360"/>
       </w:pPr>
     </w:lvl>
-    <w:lvl w:ilvl="3" w15:tentative="1">
+    <w:lvl w:ilvl="3" w:tplc="455E9E2C">
       <w:start w:val="1"/>
       <w:numFmt w:val="bullet"/>
       <w:lvlText w:val="●"/>
@@ -1779,7 +2568,7 @@
         <w:ind w:left="2880" w:hanging="360"/>
       </w:pPr>
     </w:lvl>
-    <w:lvl w:ilvl="4" w15:tentative="1">
+    <w:lvl w:ilvl="4" w:tplc="69EC22C0">
       <w:start w:val="1"/>
       <w:numFmt w:val="bullet"/>
       <w:lvlText w:val="○"/>
@@ -1788,7 +2577,7 @@
         <w:ind w:left="3600" w:hanging="360"/>
       </w:pPr>
     </w:lvl>
-    <w:lvl w:ilvl="5" w15:tentative="1">
+    <w:lvl w:ilvl="5" w:tplc="A4364408">
       <w:start w:val="1"/>
       <w:numFmt w:val="bullet"/>
       <w:lvlText w:val="■"/>
@@ -1797,7 +2586,7 @@
         <w:ind w:left="4320" w:hanging="360"/>
       </w:pPr>
     </w:lvl>
-    <w:lvl w:ilvl="6" w15:tentative="1">
+    <w:lvl w:ilvl="6" w:tplc="6D086C74">
       <w:start w:val="1"/>
       <w:numFmt w:val="bullet"/>
       <w:lvlText w:val="●"/>
@@ -1806,7 +2595,7 @@
         <w:ind w:left="5040" w:hanging="360"/>
       </w:pPr>
     </w:lvl>
-    <w:lvl w:ilvl="7" w15:tentative="1">
+    <w:lvl w:ilvl="7" w:tplc="1EE80684">
       <w:start w:val="1"/>
       <w:numFmt w:val="bullet"/>
       <w:lvlText w:val="●"/>
@@ -1815,7 +2604,7 @@
         <w:ind w:left="5760" w:hanging="360"/>
       </w:pPr>
     </w:lvl>
-    <w:lvl w:ilvl="8" w15:tentative="1">
+    <w:lvl w:ilvl="8" w:tplc="42842048">
       <w:start w:val="1"/>
       <w:numFmt w:val="bullet"/>
       <w:lvlText w:val="●"/>
@@ -1825,9 +2614,73 @@
       </w:pPr>
     </w:lvl>
   </w:abstractNum>
+  <w:abstractNum w:abstractNumId="1" w15:restartNumberingAfterBreak="0">
+    <w:nsid w:val="2BE36927"/>
+    <w:multiLevelType w:val="hybridMultilevel"/>
+    <w:tmpl w:val="8B665A6C"/>
+    <w:lvl w:ilvl="0" w:tplc="52B2F1A2">
+      <w:start w:val="1"/>
+      <w:numFmt w:val="decimal"/>
+      <w:lvlText w:val="%1."/>
+      <w:lvlJc w:val="left"/>
+      <w:pPr>
+        <w:ind w:left="720" w:hanging="360"/>
+      </w:pPr>
+    </w:lvl>
+    <w:lvl w:ilvl="1" w:tplc="8C74DFE6">
+      <w:start w:val="1"/>
+      <w:numFmt w:val="decimal"/>
+      <w:lvlText w:val="%2."/>
+      <w:lvlJc w:val="left"/>
+      <w:pPr>
+        <w:ind w:left="1440" w:hanging="360"/>
+      </w:pPr>
+    </w:lvl>
+    <w:lvl w:ilvl="2" w:tplc="306E4A30">
+      <w:start w:val="1"/>
+      <w:numFmt w:val="decimal"/>
+      <w:lvlText w:val="%3."/>
+      <w:lvlJc w:val="left"/>
+      <w:pPr>
+        <w:ind w:left="2160" w:hanging="360"/>
+      </w:pPr>
+    </w:lvl>
+    <w:lvl w:ilvl="3" w:tplc="7DE2DB0C">
+      <w:numFmt w:val="decimal"/>
+      <w:lvlText w:val=""/>
+      <w:lvlJc w:val="left"/>
+    </w:lvl>
+    <w:lvl w:ilvl="4" w:tplc="015211E2">
+      <w:numFmt w:val="decimal"/>
+      <w:lvlText w:val=""/>
+      <w:lvlJc w:val="left"/>
+    </w:lvl>
+    <w:lvl w:ilvl="5" w:tplc="672805E2">
+      <w:numFmt w:val="decimal"/>
+      <w:lvlText w:val=""/>
+      <w:lvlJc w:val="left"/>
+    </w:lvl>
+    <w:lvl w:ilvl="6" w:tplc="ECAAECCA">
+      <w:numFmt w:val="decimal"/>
+      <w:lvlText w:val=""/>
+      <w:lvlJc w:val="left"/>
+    </w:lvl>
+    <w:lvl w:ilvl="7" w:tplc="C3725D4A">
+      <w:numFmt w:val="decimal"/>
+      <w:lvlText w:val=""/>
+      <w:lvlJc w:val="left"/>
+    </w:lvl>
+    <w:lvl w:ilvl="8" w:tplc="5608E140">
+      <w:numFmt w:val="decimal"/>
+      <w:lvlText w:val=""/>
+      <w:lvlJc w:val="left"/>
+    </w:lvl>
+  </w:abstractNum>
   <w:abstractNum w:abstractNumId="2" w15:restartNumberingAfterBreak="0">
+    <w:nsid w:val="7DF20F06"/>
     <w:multiLevelType w:val="hybridMultilevel"/>
-    <w:lvl w:ilvl="0" w15:tentative="1">
+    <w:tmpl w:val="108AC7E0"/>
+    <w:lvl w:ilvl="0" w:tplc="5100D732">
       <w:start w:val="1"/>
       <w:numFmt w:val="bullet"/>
       <w:lvlText w:val="•"/>
@@ -1836,7 +2689,7 @@
         <w:ind w:left="720" w:hanging="360"/>
       </w:pPr>
     </w:lvl>
-    <w:lvl w:ilvl="1" w15:tentative="1">
+    <w:lvl w:ilvl="1" w:tplc="1FDA3692">
       <w:start w:val="1"/>
       <w:numFmt w:val="bullet"/>
       <w:lvlText w:val="◦"/>
@@ -1845,7 +2698,7 @@
         <w:ind w:left="1440" w:hanging="360"/>
       </w:pPr>
     </w:lvl>
-    <w:lvl w:ilvl="2" w15:tentative="1">
+    <w:lvl w:ilvl="2" w:tplc="067C2D4E">
       <w:start w:val="1"/>
       <w:numFmt w:val="bullet"/>
       <w:lvlText w:val="▪"/>
@@ -1854,62 +2707,62 @@
         <w:ind w:left="2160" w:hanging="360"/>
       </w:pPr>
     </w:lvl>
-  </w:abstractNum>
-  <w:abstractNum w:abstractNumId="3" w15:restartNumberingAfterBreak="0">
-    <w:multiLevelType w:val="hybridMultilevel"/>
-    <w:lvl w:ilvl="0" w15:tentative="1">
-      <w:start w:val="1"/>
+    <w:lvl w:ilvl="3" w:tplc="8C40EDA2">
       <w:numFmt w:val="decimal"/>
-      <w:lvlText w:val="%1."/>
+      <w:lvlText w:val=""/>
       <w:lvlJc w:val="left"/>
-      <w:pPr>
-        <w:ind w:left="720" w:hanging="360"/>
-      </w:pPr>
     </w:lvl>
-    <w:lvl w:ilvl="1" w15:tentative="1">
-      <w:start w:val="1"/>
+    <w:lvl w:ilvl="4" w:tplc="0D4C943A">
       <w:numFmt w:val="decimal"/>
-      <w:lvlText w:val="%2."/>
+      <w:lvlText w:val=""/>
       <w:lvlJc w:val="left"/>
-      <w:pPr>
-        <w:ind w:left="1440" w:hanging="360"/>
-      </w:pPr>
     </w:lvl>
-    <w:lvl w:ilvl="2" w15:tentative="1">
-      <w:start w:val="1"/>
+    <w:lvl w:ilvl="5" w:tplc="FE64DBB2">
       <w:numFmt w:val="decimal"/>
-      <w:lvlText w:val="%3."/>
+      <w:lvlText w:val=""/>
       <w:lvlJc w:val="left"/>
-      <w:pPr>
-        <w:ind w:left="2160" w:hanging="360"/>
-      </w:pPr>
+    </w:lvl>
+    <w:lvl w:ilvl="6" w:tplc="E1341322">
+      <w:numFmt w:val="decimal"/>
+      <w:lvlText w:val=""/>
+      <w:lvlJc w:val="left"/>
+    </w:lvl>
+    <w:lvl w:ilvl="7" w:tplc="3D2C4710">
+      <w:numFmt w:val="decimal"/>
+      <w:lvlText w:val=""/>
+      <w:lvlJc w:val="left"/>
+    </w:lvl>
+    <w:lvl w:ilvl="8" w:tplc="8F9854B6">
+      <w:numFmt w:val="decimal"/>
+      <w:lvlText w:val=""/>
+      <w:lvlJc w:val="left"/>
     </w:lvl>
   </w:abstractNum>
-  <w:num w:numId="1">
+  <w:num w:numId="1" w16cid:durableId="981933066">
+    <w:abstractNumId w:val="0"/>
+    <w:lvlOverride w:ilvl="0">
+      <w:startOverride w:val="1"/>
+    </w:lvlOverride>
+  </w:num>
+  <w:num w:numId="2" w16cid:durableId="1964192325">
     <w:abstractNumId w:val="1"/>
     <w:lvlOverride w:ilvl="0">
       <w:startOverride w:val="1"/>
     </w:lvlOverride>
   </w:num>
-  <w:num w:numId="2">
-    <w:abstractNumId w:val="3"/>
+  <w:num w:numId="3" w16cid:durableId="651716917">
+    <w:abstractNumId w:val="1"/>
     <w:lvlOverride w:ilvl="0">
       <w:startOverride w:val="1"/>
     </w:lvlOverride>
   </w:num>
-  <w:num w:numId="3">
-    <w:abstractNumId w:val="3"/>
+  <w:num w:numId="4" w16cid:durableId="752553565">
+    <w:abstractNumId w:val="1"/>
     <w:lvlOverride w:ilvl="0">
       <w:startOverride w:val="1"/>
     </w:lvlOverride>
   </w:num>
-  <w:num w:numId="4">
-    <w:abstractNumId w:val="3"/>
-    <w:lvlOverride w:ilvl="0">
-      <w:startOverride w:val="1"/>
-    </w:lvlOverride>
-  </w:num>
-  <w:num w:numId="5">
+  <w:num w:numId="5" w16cid:durableId="116412389">
     <w:abstractNumId w:val="2"/>
     <w:lvlOverride w:ilvl="0">
       <w:startOverride w:val="1"/>
@@ -1919,32 +2772,407 @@
 </file>
 
 <file path=word/styles.xml><?xml version="1.0" encoding="utf-8"?>
-<w:styles xmlns:mc="http://schemas.openxmlformats.org/markup-compatibility/2006" xmlns:r="http://schemas.openxmlformats.org/officeDocument/2006/relationships" xmlns:w="http://schemas.openxmlformats.org/wordprocessingml/2006/main" xmlns:w14="http://schemas.microsoft.com/office/word/2010/wordml" xmlns:w15="http://schemas.microsoft.com/office/word/2012/wordml" mc:Ignorable="w14 w15">
+<w:styles xmlns:mc="http://schemas.openxmlformats.org/markup-compatibility/2006" xmlns:r="http://schemas.openxmlformats.org/officeDocument/2006/relationships" xmlns:w="http://schemas.openxmlformats.org/wordprocessingml/2006/main" xmlns:w14="http://schemas.microsoft.com/office/word/2010/wordml" xmlns:w15="http://schemas.microsoft.com/office/word/2012/wordml" xmlns:w16cex="http://schemas.microsoft.com/office/word/2018/wordml/cex" xmlns:w16cid="http://schemas.microsoft.com/office/word/2016/wordml/cid" xmlns:w16="http://schemas.microsoft.com/office/word/2018/wordml" xmlns:w16du="http://schemas.microsoft.com/office/word/2023/wordml/word16du" xmlns:w16sdtdh="http://schemas.microsoft.com/office/word/2020/wordml/sdtdatahash" xmlns:w16sdtfl="http://schemas.microsoft.com/office/word/2024/wordml/sdtformatlock" xmlns:w16se="http://schemas.microsoft.com/office/word/2015/wordml/symex" mc:Ignorable="w14 w15 w16se w16cid w16 w16cex w16sdtdh w16sdtfl w16du">
   <w:docDefaults>
     <w:rPrDefault>
       <w:rPr>
-        <w:rFonts w:ascii="Calibri" w:cs="Calibri" w:eastAsia="Calibri" w:hAnsi="Calibri"/>
+        <w:rFonts w:ascii="Calibri" w:eastAsia="Calibri" w:hAnsi="Calibri" w:cs="Calibri"/>
         <w:sz w:val="22"/>
         <w:szCs w:val="22"/>
+        <w:lang w:val="en-GB" w:eastAsia="en-GB" w:bidi="ar-SA"/>
       </w:rPr>
     </w:rPrDefault>
     <w:pPrDefault/>
   </w:docDefaults>
-  <w:style w:type="paragraph" w:styleId="Title">
-    <w:name w:val="Title"/>
-    <w:basedOn w:val="Normal"/>
-    <w:next w:val="Normal"/>
+  <w:latentStyles w:defLockedState="0" w:defUIPriority="99" w:defSemiHidden="0" w:defUnhideWhenUsed="0" w:defQFormat="0" w:count="376">
+    <w:lsdException w:name="Normal" w:uiPriority="0" w:qFormat="1"/>
+    <w:lsdException w:name="heading 1" w:uiPriority="9" w:qFormat="1"/>
+    <w:lsdException w:name="heading 2" w:semiHidden="1" w:uiPriority="9" w:unhideWhenUsed="1" w:qFormat="1"/>
+    <w:lsdException w:name="heading 3" w:semiHidden="1" w:uiPriority="9" w:unhideWhenUsed="1" w:qFormat="1"/>
+    <w:lsdException w:name="heading 4" w:semiHidden="1" w:uiPriority="9" w:unhideWhenUsed="1" w:qFormat="1"/>
+    <w:lsdException w:name="heading 5" w:semiHidden="1" w:uiPriority="9" w:unhideWhenUsed="1" w:qFormat="1"/>
+    <w:lsdException w:name="heading 6" w:semiHidden="1" w:uiPriority="9" w:unhideWhenUsed="1" w:qFormat="1"/>
+    <w:lsdException w:name="heading 7" w:semiHidden="1" w:uiPriority="9" w:unhideWhenUsed="1" w:qFormat="1"/>
+    <w:lsdException w:name="heading 8" w:semiHidden="1" w:uiPriority="9" w:unhideWhenUsed="1" w:qFormat="1"/>
+    <w:lsdException w:name="heading 9" w:semiHidden="1" w:uiPriority="9" w:unhideWhenUsed="1" w:qFormat="1"/>
+    <w:lsdException w:name="index 1" w:semiHidden="1" w:unhideWhenUsed="1"/>
+    <w:lsdException w:name="index 2" w:semiHidden="1" w:unhideWhenUsed="1"/>
+    <w:lsdException w:name="index 3" w:semiHidden="1" w:unhideWhenUsed="1"/>
+    <w:lsdException w:name="index 4" w:semiHidden="1" w:unhideWhenUsed="1"/>
+    <w:lsdException w:name="index 5" w:semiHidden="1" w:unhideWhenUsed="1"/>
+    <w:lsdException w:name="index 6" w:semiHidden="1" w:unhideWhenUsed="1"/>
+    <w:lsdException w:name="index 7" w:semiHidden="1" w:unhideWhenUsed="1"/>
+    <w:lsdException w:name="index 8" w:semiHidden="1" w:unhideWhenUsed="1"/>
+    <w:lsdException w:name="index 9" w:semiHidden="1" w:unhideWhenUsed="1"/>
+    <w:lsdException w:name="toc 1" w:semiHidden="1" w:uiPriority="39" w:unhideWhenUsed="1"/>
+    <w:lsdException w:name="toc 2" w:semiHidden="1" w:uiPriority="39" w:unhideWhenUsed="1"/>
+    <w:lsdException w:name="toc 3" w:semiHidden="1" w:uiPriority="39" w:unhideWhenUsed="1"/>
+    <w:lsdException w:name="toc 4" w:semiHidden="1" w:uiPriority="39" w:unhideWhenUsed="1"/>
+    <w:lsdException w:name="toc 5" w:semiHidden="1" w:uiPriority="39" w:unhideWhenUsed="1"/>
+    <w:lsdException w:name="toc 6" w:semiHidden="1" w:uiPriority="39" w:unhideWhenUsed="1"/>
+    <w:lsdException w:name="toc 7" w:semiHidden="1" w:uiPriority="39" w:unhideWhenUsed="1"/>
+    <w:lsdException w:name="toc 8" w:semiHidden="1" w:uiPriority="39" w:unhideWhenUsed="1"/>
+    <w:lsdException w:name="toc 9" w:semiHidden="1" w:uiPriority="39" w:unhideWhenUsed="1"/>
+    <w:lsdException w:name="Normal Indent" w:semiHidden="1" w:unhideWhenUsed="1"/>
+    <w:lsdException w:name="footnote text" w:semiHidden="1" w:unhideWhenUsed="1"/>
+    <w:lsdException w:name="annotation text" w:semiHidden="1" w:unhideWhenUsed="1"/>
+    <w:lsdException w:name="header" w:semiHidden="1" w:unhideWhenUsed="1"/>
+    <w:lsdException w:name="footer" w:semiHidden="1" w:unhideWhenUsed="1"/>
+    <w:lsdException w:name="index heading" w:semiHidden="1" w:unhideWhenUsed="1"/>
+    <w:lsdException w:name="caption" w:semiHidden="1" w:uiPriority="35" w:unhideWhenUsed="1" w:qFormat="1"/>
+    <w:lsdException w:name="table of figures" w:semiHidden="1" w:unhideWhenUsed="1"/>
+    <w:lsdException w:name="envelope address" w:semiHidden="1" w:unhideWhenUsed="1"/>
+    <w:lsdException w:name="envelope return" w:semiHidden="1" w:unhideWhenUsed="1"/>
+    <w:lsdException w:name="footnote reference" w:semiHidden="1" w:unhideWhenUsed="1"/>
+    <w:lsdException w:name="annotation reference" w:semiHidden="1" w:unhideWhenUsed="1"/>
+    <w:lsdException w:name="line number" w:semiHidden="1" w:unhideWhenUsed="1"/>
+    <w:lsdException w:name="page number" w:semiHidden="1" w:unhideWhenUsed="1"/>
+    <w:lsdException w:name="endnote reference" w:semiHidden="1" w:unhideWhenUsed="1"/>
+    <w:lsdException w:name="endnote text" w:semiHidden="1" w:unhideWhenUsed="1"/>
+    <w:lsdException w:name="table of authorities" w:semiHidden="1" w:unhideWhenUsed="1"/>
+    <w:lsdException w:name="macro" w:semiHidden="1" w:unhideWhenUsed="1"/>
+    <w:lsdException w:name="toa heading" w:semiHidden="1" w:unhideWhenUsed="1"/>
+    <w:lsdException w:name="List" w:semiHidden="1" w:unhideWhenUsed="1"/>
+    <w:lsdException w:name="List Bullet" w:semiHidden="1" w:unhideWhenUsed="1"/>
+    <w:lsdException w:name="List Number" w:semiHidden="1" w:unhideWhenUsed="1"/>
+    <w:lsdException w:name="List 2" w:semiHidden="1" w:unhideWhenUsed="1"/>
+    <w:lsdException w:name="List 3" w:semiHidden="1" w:unhideWhenUsed="1"/>
+    <w:lsdException w:name="List 4" w:semiHidden="1" w:unhideWhenUsed="1"/>
+    <w:lsdException w:name="List 5" w:semiHidden="1" w:unhideWhenUsed="1"/>
+    <w:lsdException w:name="List Bullet 2" w:semiHidden="1" w:unhideWhenUsed="1"/>
+    <w:lsdException w:name="List Bullet 3" w:semiHidden="1" w:unhideWhenUsed="1"/>
+    <w:lsdException w:name="List Bullet 4" w:semiHidden="1" w:unhideWhenUsed="1"/>
+    <w:lsdException w:name="List Bullet 5" w:semiHidden="1" w:unhideWhenUsed="1"/>
+    <w:lsdException w:name="List Number 2" w:semiHidden="1" w:unhideWhenUsed="1"/>
+    <w:lsdException w:name="List Number 3" w:semiHidden="1" w:unhideWhenUsed="1"/>
+    <w:lsdException w:name="List Number 4" w:semiHidden="1" w:unhideWhenUsed="1"/>
+    <w:lsdException w:name="List Number 5" w:semiHidden="1" w:unhideWhenUsed="1"/>
+    <w:lsdException w:name="Title" w:uiPriority="10" w:qFormat="1"/>
+    <w:lsdException w:name="Closing" w:semiHidden="1" w:unhideWhenUsed="1"/>
+    <w:lsdException w:name="Signature" w:semiHidden="1" w:unhideWhenUsed="1"/>
+    <w:lsdException w:name="Default Paragraph Font" w:semiHidden="1" w:uiPriority="1" w:unhideWhenUsed="1"/>
+    <w:lsdException w:name="Body Text" w:semiHidden="1" w:unhideWhenUsed="1"/>
+    <w:lsdException w:name="Body Text Indent" w:semiHidden="1" w:unhideWhenUsed="1"/>
+    <w:lsdException w:name="List Continue" w:semiHidden="1" w:unhideWhenUsed="1"/>
+    <w:lsdException w:name="List Continue 2" w:semiHidden="1" w:unhideWhenUsed="1"/>
+    <w:lsdException w:name="List Continue 3" w:semiHidden="1" w:unhideWhenUsed="1"/>
+    <w:lsdException w:name="List Continue 4" w:semiHidden="1" w:unhideWhenUsed="1"/>
+    <w:lsdException w:name="List Continue 5" w:semiHidden="1" w:unhideWhenUsed="1"/>
+    <w:lsdException w:name="Message Header" w:semiHidden="1" w:unhideWhenUsed="1"/>
+    <w:lsdException w:name="Subtitle" w:uiPriority="11" w:qFormat="1"/>
+    <w:lsdException w:name="Salutation" w:semiHidden="1" w:unhideWhenUsed="1"/>
+    <w:lsdException w:name="Date" w:semiHidden="1" w:unhideWhenUsed="1"/>
+    <w:lsdException w:name="Body Text First Indent" w:semiHidden="1" w:unhideWhenUsed="1"/>
+    <w:lsdException w:name="Body Text First Indent 2" w:semiHidden="1" w:unhideWhenUsed="1"/>
+    <w:lsdException w:name="Note Heading" w:semiHidden="1" w:unhideWhenUsed="1"/>
+    <w:lsdException w:name="Body Text 2" w:semiHidden="1" w:unhideWhenUsed="1"/>
+    <w:lsdException w:name="Body Text 3" w:semiHidden="1" w:unhideWhenUsed="1"/>
+    <w:lsdException w:name="Body Text Indent 2" w:semiHidden="1" w:unhideWhenUsed="1"/>
+    <w:lsdException w:name="Body Text Indent 3" w:semiHidden="1" w:unhideWhenUsed="1"/>
+    <w:lsdException w:name="Block Text" w:semiHidden="1" w:unhideWhenUsed="1"/>
+    <w:lsdException w:name="Hyperlink" w:semiHidden="1" w:unhideWhenUsed="1"/>
+    <w:lsdException w:name="FollowedHyperlink" w:semiHidden="1" w:unhideWhenUsed="1"/>
+    <w:lsdException w:name="Strong" w:uiPriority="22" w:qFormat="1"/>
+    <w:lsdException w:name="Emphasis" w:uiPriority="20" w:qFormat="1"/>
+    <w:lsdException w:name="Document Map" w:semiHidden="1" w:unhideWhenUsed="1"/>
+    <w:lsdException w:name="Plain Text" w:semiHidden="1" w:unhideWhenUsed="1"/>
+    <w:lsdException w:name="E-mail Signature" w:semiHidden="1" w:unhideWhenUsed="1"/>
+    <w:lsdException w:name="HTML Top of Form" w:semiHidden="1" w:unhideWhenUsed="1"/>
+    <w:lsdException w:name="HTML Bottom of Form" w:semiHidden="1" w:unhideWhenUsed="1"/>
+    <w:lsdException w:name="Normal (Web)" w:semiHidden="1" w:unhideWhenUsed="1"/>
+    <w:lsdException w:name="HTML Acronym" w:semiHidden="1" w:unhideWhenUsed="1"/>
+    <w:lsdException w:name="HTML Address" w:semiHidden="1" w:unhideWhenUsed="1"/>
+    <w:lsdException w:name="HTML Cite" w:semiHidden="1" w:unhideWhenUsed="1"/>
+    <w:lsdException w:name="HTML Code" w:semiHidden="1" w:unhideWhenUsed="1"/>
+    <w:lsdException w:name="HTML Definition" w:semiHidden="1" w:unhideWhenUsed="1"/>
+    <w:lsdException w:name="HTML Keyboard" w:semiHidden="1" w:unhideWhenUsed="1"/>
+    <w:lsdException w:name="HTML Preformatted" w:semiHidden="1" w:unhideWhenUsed="1"/>
+    <w:lsdException w:name="HTML Sample" w:semiHidden="1" w:unhideWhenUsed="1"/>
+    <w:lsdException w:name="HTML Typewriter" w:semiHidden="1" w:unhideWhenUsed="1"/>
+    <w:lsdException w:name="HTML Variable" w:semiHidden="1" w:unhideWhenUsed="1"/>
+    <w:lsdException w:name="Normal Table" w:semiHidden="1" w:unhideWhenUsed="1"/>
+    <w:lsdException w:name="annotation subject" w:semiHidden="1" w:unhideWhenUsed="1"/>
+    <w:lsdException w:name="No List" w:semiHidden="1" w:unhideWhenUsed="1"/>
+    <w:lsdException w:name="Outline List 1" w:semiHidden="1" w:unhideWhenUsed="1"/>
+    <w:lsdException w:name="Outline List 2" w:semiHidden="1" w:unhideWhenUsed="1"/>
+    <w:lsdException w:name="Outline List 3" w:semiHidden="1" w:unhideWhenUsed="1"/>
+    <w:lsdException w:name="Table Simple 1" w:semiHidden="1" w:unhideWhenUsed="1"/>
+    <w:lsdException w:name="Table Simple 2" w:semiHidden="1" w:unhideWhenUsed="1"/>
+    <w:lsdException w:name="Table Simple 3" w:semiHidden="1" w:unhideWhenUsed="1"/>
+    <w:lsdException w:name="Table Classic 1" w:semiHidden="1" w:unhideWhenUsed="1"/>
+    <w:lsdException w:name="Table Classic 2" w:semiHidden="1" w:unhideWhenUsed="1"/>
+    <w:lsdException w:name="Table Classic 3" w:semiHidden="1" w:unhideWhenUsed="1"/>
+    <w:lsdException w:name="Table Classic 4" w:semiHidden="1" w:unhideWhenUsed="1"/>
+    <w:lsdException w:name="Table Colorful 1" w:semiHidden="1" w:unhideWhenUsed="1"/>
+    <w:lsdException w:name="Table Colorful 2" w:semiHidden="1" w:unhideWhenUsed="1"/>
+    <w:lsdException w:name="Table Colorful 3" w:semiHidden="1" w:unhideWhenUsed="1"/>
+    <w:lsdException w:name="Table Columns 1" w:semiHidden="1" w:unhideWhenUsed="1"/>
+    <w:lsdException w:name="Table Columns 2" w:semiHidden="1" w:unhideWhenUsed="1"/>
+    <w:lsdException w:name="Table Columns 3" w:semiHidden="1" w:unhideWhenUsed="1"/>
+    <w:lsdException w:name="Table Columns 4" w:semiHidden="1" w:unhideWhenUsed="1"/>
+    <w:lsdException w:name="Table Columns 5" w:semiHidden="1" w:unhideWhenUsed="1"/>
+    <w:lsdException w:name="Table Grid 1" w:semiHidden="1" w:unhideWhenUsed="1"/>
+    <w:lsdException w:name="Table Grid 2" w:semiHidden="1" w:unhideWhenUsed="1"/>
+    <w:lsdException w:name="Table Grid 3" w:semiHidden="1" w:unhideWhenUsed="1"/>
+    <w:lsdException w:name="Table Grid 4" w:semiHidden="1" w:unhideWhenUsed="1"/>
+    <w:lsdException w:name="Table Grid 5" w:semiHidden="1" w:unhideWhenUsed="1"/>
+    <w:lsdException w:name="Table Grid 6" w:semiHidden="1" w:unhideWhenUsed="1"/>
+    <w:lsdException w:name="Table Grid 7" w:semiHidden="1" w:unhideWhenUsed="1"/>
+    <w:lsdException w:name="Table Grid 8" w:semiHidden="1" w:unhideWhenUsed="1"/>
+    <w:lsdException w:name="Table List 1" w:semiHidden="1" w:unhideWhenUsed="1"/>
+    <w:lsdException w:name="Table List 2" w:semiHidden="1" w:unhideWhenUsed="1"/>
+    <w:lsdException w:name="Table List 3" w:semiHidden="1" w:unhideWhenUsed="1"/>
+    <w:lsdException w:name="Table List 4" w:semiHidden="1" w:unhideWhenUsed="1"/>
+    <w:lsdException w:name="Table List 5" w:semiHidden="1" w:unhideWhenUsed="1"/>
+    <w:lsdException w:name="Table List 6" w:semiHidden="1" w:unhideWhenUsed="1"/>
+    <w:lsdException w:name="Table List 7" w:semiHidden="1" w:unhideWhenUsed="1"/>
+    <w:lsdException w:name="Table List 8" w:semiHidden="1" w:unhideWhenUsed="1"/>
+    <w:lsdException w:name="Table 3D effects 1" w:semiHidden="1" w:unhideWhenUsed="1"/>
+    <w:lsdException w:name="Table 3D effects 2" w:semiHidden="1" w:unhideWhenUsed="1"/>
+    <w:lsdException w:name="Table 3D effects 3" w:semiHidden="1" w:unhideWhenUsed="1"/>
+    <w:lsdException w:name="Table Contemporary" w:semiHidden="1" w:unhideWhenUsed="1"/>
+    <w:lsdException w:name="Table Elegant" w:semiHidden="1" w:unhideWhenUsed="1"/>
+    <w:lsdException w:name="Table Professional" w:semiHidden="1" w:unhideWhenUsed="1"/>
+    <w:lsdException w:name="Table Subtle 1" w:semiHidden="1" w:unhideWhenUsed="1"/>
+    <w:lsdException w:name="Table Subtle 2" w:semiHidden="1" w:unhideWhenUsed="1"/>
+    <w:lsdException w:name="Table Web 1" w:semiHidden="1" w:unhideWhenUsed="1"/>
+    <w:lsdException w:name="Table Web 2" w:semiHidden="1" w:unhideWhenUsed="1"/>
+    <w:lsdException w:name="Table Web 3" w:semiHidden="1" w:unhideWhenUsed="1"/>
+    <w:lsdException w:name="Balloon Text" w:semiHidden="1" w:unhideWhenUsed="1"/>
+    <w:lsdException w:name="Table Grid" w:uiPriority="39"/>
+    <w:lsdException w:name="Table Theme" w:semiHidden="1" w:unhideWhenUsed="1"/>
+    <w:lsdException w:name="Placeholder Text" w:semiHidden="1"/>
+    <w:lsdException w:name="No Spacing" w:uiPriority="1" w:qFormat="1"/>
+    <w:lsdException w:name="Light Shading" w:uiPriority="60"/>
+    <w:lsdException w:name="Light List" w:uiPriority="61"/>
+    <w:lsdException w:name="Light Grid" w:uiPriority="62"/>
+    <w:lsdException w:name="Medium Shading 1" w:uiPriority="63"/>
+    <w:lsdException w:name="Medium Shading 2" w:uiPriority="64"/>
+    <w:lsdException w:name="Medium List 1" w:uiPriority="65"/>
+    <w:lsdException w:name="Medium List 2" w:uiPriority="66"/>
+    <w:lsdException w:name="Medium Grid 1" w:uiPriority="67"/>
+    <w:lsdException w:name="Medium Grid 2" w:uiPriority="68"/>
+    <w:lsdException w:name="Medium Grid 3" w:uiPriority="69"/>
+    <w:lsdException w:name="Dark List" w:uiPriority="70"/>
+    <w:lsdException w:name="Colorful Shading" w:uiPriority="71"/>
+    <w:lsdException w:name="Colorful List" w:uiPriority="72"/>
+    <w:lsdException w:name="Colorful Grid" w:uiPriority="73"/>
+    <w:lsdException w:name="Light Shading Accent 1" w:uiPriority="60"/>
+    <w:lsdException w:name="Light List Accent 1" w:uiPriority="61"/>
+    <w:lsdException w:name="Light Grid Accent 1" w:uiPriority="62"/>
+    <w:lsdException w:name="Medium Shading 1 Accent 1" w:uiPriority="63"/>
+    <w:lsdException w:name="Medium Shading 2 Accent 1" w:uiPriority="64"/>
+    <w:lsdException w:name="Medium List 1 Accent 1" w:uiPriority="65"/>
+    <w:lsdException w:name="Revision" w:semiHidden="1"/>
+    <w:lsdException w:name="List Paragraph" w:uiPriority="34" w:qFormat="1"/>
+    <w:lsdException w:name="Quote" w:uiPriority="29" w:qFormat="1"/>
+    <w:lsdException w:name="Intense Quote" w:uiPriority="30" w:qFormat="1"/>
+    <w:lsdException w:name="Medium List 2 Accent 1" w:uiPriority="66"/>
+    <w:lsdException w:name="Medium Grid 1 Accent 1" w:uiPriority="67"/>
+    <w:lsdException w:name="Medium Grid 2 Accent 1" w:uiPriority="68"/>
+    <w:lsdException w:name="Medium Grid 3 Accent 1" w:uiPriority="69"/>
+    <w:lsdException w:name="Dark List Accent 1" w:uiPriority="70"/>
+    <w:lsdException w:name="Colorful Shading Accent 1" w:uiPriority="71"/>
+    <w:lsdException w:name="Colorful List Accent 1" w:uiPriority="72"/>
+    <w:lsdException w:name="Colorful Grid Accent 1" w:uiPriority="73"/>
+    <w:lsdException w:name="Light Shading Accent 2" w:uiPriority="60"/>
+    <w:lsdException w:name="Light List Accent 2" w:uiPriority="61"/>
+    <w:lsdException w:name="Light Grid Accent 2" w:uiPriority="62"/>
+    <w:lsdException w:name="Medium Shading 1 Accent 2" w:uiPriority="63"/>
+    <w:lsdException w:name="Medium Shading 2 Accent 2" w:uiPriority="64"/>
+    <w:lsdException w:name="Medium List 1 Accent 2" w:uiPriority="65"/>
+    <w:lsdException w:name="Medium List 2 Accent 2" w:uiPriority="66"/>
+    <w:lsdException w:name="Medium Grid 1 Accent 2" w:uiPriority="67"/>
+    <w:lsdException w:name="Medium Grid 2 Accent 2" w:uiPriority="68"/>
+    <w:lsdException w:name="Medium Grid 3 Accent 2" w:uiPriority="69"/>
+    <w:lsdException w:name="Dark List Accent 2" w:uiPriority="70"/>
+    <w:lsdException w:name="Colorful Shading Accent 2" w:uiPriority="71"/>
+    <w:lsdException w:name="Colorful List Accent 2" w:uiPriority="72"/>
+    <w:lsdException w:name="Colorful Grid Accent 2" w:uiPriority="73"/>
+    <w:lsdException w:name="Light Shading Accent 3" w:uiPriority="60"/>
+    <w:lsdException w:name="Light List Accent 3" w:uiPriority="61"/>
+    <w:lsdException w:name="Light Grid Accent 3" w:uiPriority="62"/>
+    <w:lsdException w:name="Medium Shading 1 Accent 3" w:uiPriority="63"/>
+    <w:lsdException w:name="Medium Shading 2 Accent 3" w:uiPriority="64"/>
+    <w:lsdException w:name="Medium List 1 Accent 3" w:uiPriority="65"/>
+    <w:lsdException w:name="Medium List 2 Accent 3" w:uiPriority="66"/>
+    <w:lsdException w:name="Medium Grid 1 Accent 3" w:uiPriority="67"/>
+    <w:lsdException w:name="Medium Grid 2 Accent 3" w:uiPriority="68"/>
+    <w:lsdException w:name="Medium Grid 3 Accent 3" w:uiPriority="69"/>
+    <w:lsdException w:name="Dark List Accent 3" w:uiPriority="70"/>
+    <w:lsdException w:name="Colorful Shading Accent 3" w:uiPriority="71"/>
+    <w:lsdException w:name="Colorful List Accent 3" w:uiPriority="72"/>
+    <w:lsdException w:name="Colorful Grid Accent 3" w:uiPriority="73"/>
+    <w:lsdException w:name="Light Shading Accent 4" w:uiPriority="60"/>
+    <w:lsdException w:name="Light List Accent 4" w:uiPriority="61"/>
+    <w:lsdException w:name="Light Grid Accent 4" w:uiPriority="62"/>
+    <w:lsdException w:name="Medium Shading 1 Accent 4" w:uiPriority="63"/>
+    <w:lsdException w:name="Medium Shading 2 Accent 4" w:uiPriority="64"/>
+    <w:lsdException w:name="Medium List 1 Accent 4" w:uiPriority="65"/>
+    <w:lsdException w:name="Medium List 2 Accent 4" w:uiPriority="66"/>
+    <w:lsdException w:name="Medium Grid 1 Accent 4" w:uiPriority="67"/>
+    <w:lsdException w:name="Medium Grid 2 Accent 4" w:uiPriority="68"/>
+    <w:lsdException w:name="Medium Grid 3 Accent 4" w:uiPriority="69"/>
+    <w:lsdException w:name="Dark List Accent 4" w:uiPriority="70"/>
+    <w:lsdException w:name="Colorful Shading Accent 4" w:uiPriority="71"/>
+    <w:lsdException w:name="Colorful List Accent 4" w:uiPriority="72"/>
+    <w:lsdException w:name="Colorful Grid Accent 4" w:uiPriority="73"/>
+    <w:lsdException w:name="Light Shading Accent 5" w:uiPriority="60"/>
+    <w:lsdException w:name="Light List Accent 5" w:uiPriority="61"/>
+    <w:lsdException w:name="Light Grid Accent 5" w:uiPriority="62"/>
+    <w:lsdException w:name="Medium Shading 1 Accent 5" w:uiPriority="63"/>
+    <w:lsdException w:name="Medium Shading 2 Accent 5" w:uiPriority="64"/>
+    <w:lsdException w:name="Medium List 1 Accent 5" w:uiPriority="65"/>
+    <w:lsdException w:name="Medium List 2 Accent 5" w:uiPriority="66"/>
+    <w:lsdException w:name="Medium Grid 1 Accent 5" w:uiPriority="67"/>
+    <w:lsdException w:name="Medium Grid 2 Accent 5" w:uiPriority="68"/>
+    <w:lsdException w:name="Medium Grid 3 Accent 5" w:uiPriority="69"/>
+    <w:lsdException w:name="Dark List Accent 5" w:uiPriority="70"/>
+    <w:lsdException w:name="Colorful Shading Accent 5" w:uiPriority="71"/>
+    <w:lsdException w:name="Colorful List Accent 5" w:uiPriority="72"/>
+    <w:lsdException w:name="Colorful Grid Accent 5" w:uiPriority="73"/>
+    <w:lsdException w:name="Light Shading Accent 6" w:uiPriority="60"/>
+    <w:lsdException w:name="Light List Accent 6" w:uiPriority="61"/>
+    <w:lsdException w:name="Light Grid Accent 6" w:uiPriority="62"/>
+    <w:lsdException w:name="Medium Shading 1 Accent 6" w:uiPriority="63"/>
+    <w:lsdException w:name="Medium Shading 2 Accent 6" w:uiPriority="64"/>
+    <w:lsdException w:name="Medium List 1 Accent 6" w:uiPriority="65"/>
+    <w:lsdException w:name="Medium List 2 Accent 6" w:uiPriority="66"/>
+    <w:lsdException w:name="Medium Grid 1 Accent 6" w:uiPriority="67"/>
+    <w:lsdException w:name="Medium Grid 2 Accent 6" w:uiPriority="68"/>
+    <w:lsdException w:name="Medium Grid 3 Accent 6" w:uiPriority="69"/>
+    <w:lsdException w:name="Dark List Accent 6" w:uiPriority="70"/>
+    <w:lsdException w:name="Colorful Shading Accent 6" w:uiPriority="71"/>
+    <w:lsdException w:name="Colorful List Accent 6" w:uiPriority="72"/>
+    <w:lsdException w:name="Colorful Grid Accent 6" w:uiPriority="73"/>
+    <w:lsdException w:name="Subtle Emphasis" w:uiPriority="19" w:qFormat="1"/>
+    <w:lsdException w:name="Intense Emphasis" w:uiPriority="21" w:qFormat="1"/>
+    <w:lsdException w:name="Subtle Reference" w:uiPriority="31" w:qFormat="1"/>
+    <w:lsdException w:name="Intense Reference" w:uiPriority="32" w:qFormat="1"/>
+    <w:lsdException w:name="Book Title" w:uiPriority="33" w:qFormat="1"/>
+    <w:lsdException w:name="Bibliography" w:semiHidden="1" w:uiPriority="37" w:unhideWhenUsed="1"/>
+    <w:lsdException w:name="TOC Heading" w:semiHidden="1" w:uiPriority="39" w:unhideWhenUsed="1" w:qFormat="1"/>
+    <w:lsdException w:name="Plain Table 1" w:uiPriority="41"/>
+    <w:lsdException w:name="Plain Table 2" w:uiPriority="42"/>
+    <w:lsdException w:name="Plain Table 3" w:uiPriority="43"/>
+    <w:lsdException w:name="Plain Table 4" w:uiPriority="44"/>
+    <w:lsdException w:name="Plain Table 5" w:uiPriority="45"/>
+    <w:lsdException w:name="Grid Table Light" w:uiPriority="40"/>
+    <w:lsdException w:name="Grid Table 1 Light" w:uiPriority="46"/>
+    <w:lsdException w:name="Grid Table 2" w:uiPriority="47"/>
+    <w:lsdException w:name="Grid Table 3" w:uiPriority="48"/>
+    <w:lsdException w:name="Grid Table 4" w:uiPriority="49"/>
+    <w:lsdException w:name="Grid Table 5 Dark" w:uiPriority="50"/>
+    <w:lsdException w:name="Grid Table 6 Colorful" w:uiPriority="51"/>
+    <w:lsdException w:name="Grid Table 7 Colorful" w:uiPriority="52"/>
+    <w:lsdException w:name="Grid Table 1 Light Accent 1" w:uiPriority="46"/>
+    <w:lsdException w:name="Grid Table 2 Accent 1" w:uiPriority="47"/>
+    <w:lsdException w:name="Grid Table 3 Accent 1" w:uiPriority="48"/>
+    <w:lsdException w:name="Grid Table 4 Accent 1" w:uiPriority="49"/>
+    <w:lsdException w:name="Grid Table 5 Dark Accent 1" w:uiPriority="50"/>
+    <w:lsdException w:name="Grid Table 6 Colorful Accent 1" w:uiPriority="51"/>
+    <w:lsdException w:name="Grid Table 7 Colorful Accent 1" w:uiPriority="52"/>
+    <w:lsdException w:name="Grid Table 1 Light Accent 2" w:uiPriority="46"/>
+    <w:lsdException w:name="Grid Table 2 Accent 2" w:uiPriority="47"/>
+    <w:lsdException w:name="Grid Table 3 Accent 2" w:uiPriority="48"/>
+    <w:lsdException w:name="Grid Table 4 Accent 2" w:uiPriority="49"/>
+    <w:lsdException w:name="Grid Table 5 Dark Accent 2" w:uiPriority="50"/>
+    <w:lsdException w:name="Grid Table 6 Colorful Accent 2" w:uiPriority="51"/>
+    <w:lsdException w:name="Grid Table 7 Colorful Accent 2" w:uiPriority="52"/>
+    <w:lsdException w:name="Grid Table 1 Light Accent 3" w:uiPriority="46"/>
+    <w:lsdException w:name="Grid Table 2 Accent 3" w:uiPriority="47"/>
+    <w:lsdException w:name="Grid Table 3 Accent 3" w:uiPriority="48"/>
+    <w:lsdException w:name="Grid Table 4 Accent 3" w:uiPriority="49"/>
+    <w:lsdException w:name="Grid Table 5 Dark Accent 3" w:uiPriority="50"/>
+    <w:lsdException w:name="Grid Table 6 Colorful Accent 3" w:uiPriority="51"/>
+    <w:lsdException w:name="Grid Table 7 Colorful Accent 3" w:uiPriority="52"/>
+    <w:lsdException w:name="Grid Table 1 Light Accent 4" w:uiPriority="46"/>
+    <w:lsdException w:name="Grid Table 2 Accent 4" w:uiPriority="47"/>
+    <w:lsdException w:name="Grid Table 3 Accent 4" w:uiPriority="48"/>
+    <w:lsdException w:name="Grid Table 4 Accent 4" w:uiPriority="49"/>
+    <w:lsdException w:name="Grid Table 5 Dark Accent 4" w:uiPriority="50"/>
+    <w:lsdException w:name="Grid Table 6 Colorful Accent 4" w:uiPriority="51"/>
+    <w:lsdException w:name="Grid Table 7 Colorful Accent 4" w:uiPriority="52"/>
+    <w:lsdException w:name="Grid Table 1 Light Accent 5" w:uiPriority="46"/>
+    <w:lsdException w:name="Grid Table 2 Accent 5" w:uiPriority="47"/>
+    <w:lsdException w:name="Grid Table 3 Accent 5" w:uiPriority="48"/>
+    <w:lsdException w:name="Grid Table 4 Accent 5" w:uiPriority="49"/>
+    <w:lsdException w:name="Grid Table 5 Dark Accent 5" w:uiPriority="50"/>
+    <w:lsdException w:name="Grid Table 6 Colorful Accent 5" w:uiPriority="51"/>
+    <w:lsdException w:name="Grid Table 7 Colorful Accent 5" w:uiPriority="52"/>
+    <w:lsdException w:name="Grid Table 1 Light Accent 6" w:uiPriority="46"/>
+    <w:lsdException w:name="Grid Table 2 Accent 6" w:uiPriority="47"/>
+    <w:lsdException w:name="Grid Table 3 Accent 6" w:uiPriority="48"/>
+    <w:lsdException w:name="Grid Table 4 Accent 6" w:uiPriority="49"/>
+    <w:lsdException w:name="Grid Table 5 Dark Accent 6" w:uiPriority="50"/>
+    <w:lsdException w:name="Grid Table 6 Colorful Accent 6" w:uiPriority="51"/>
+    <w:lsdException w:name="Grid Table 7 Colorful Accent 6" w:uiPriority="52"/>
+    <w:lsdException w:name="List Table 1 Light" w:uiPriority="46"/>
+    <w:lsdException w:name="List Table 2" w:uiPriority="47"/>
+    <w:lsdException w:name="List Table 3" w:uiPriority="48"/>
+    <w:lsdException w:name="List Table 4" w:uiPriority="49"/>
+    <w:lsdException w:name="List Table 5 Dark" w:uiPriority="50"/>
+    <w:lsdException w:name="List Table 6 Colorful" w:uiPriority="51"/>
+    <w:lsdException w:name="List Table 7 Colorful" w:uiPriority="52"/>
+    <w:lsdException w:name="List Table 1 Light Accent 1" w:uiPriority="46"/>
+    <w:lsdException w:name="List Table 2 Accent 1" w:uiPriority="47"/>
+    <w:lsdException w:name="List Table 3 Accent 1" w:uiPriority="48"/>
+    <w:lsdException w:name="List Table 4 Accent 1" w:uiPriority="49"/>
+    <w:lsdException w:name="List Table 5 Dark Accent 1" w:uiPriority="50"/>
+    <w:lsdException w:name="List Table 6 Colorful Accent 1" w:uiPriority="51"/>
+    <w:lsdException w:name="List Table 7 Colorful Accent 1" w:uiPriority="52"/>
+    <w:lsdException w:name="List Table 1 Light Accent 2" w:uiPriority="46"/>
+    <w:lsdException w:name="List Table 2 Accent 2" w:uiPriority="47"/>
+    <w:lsdException w:name="List Table 3 Accent 2" w:uiPriority="48"/>
+    <w:lsdException w:name="List Table 4 Accent 2" w:uiPriority="49"/>
+    <w:lsdException w:name="List Table 5 Dark Accent 2" w:uiPriority="50"/>
+    <w:lsdException w:name="List Table 6 Colorful Accent 2" w:uiPriority="51"/>
+    <w:lsdException w:name="List Table 7 Colorful Accent 2" w:uiPriority="52"/>
+    <w:lsdException w:name="List Table 1 Light Accent 3" w:uiPriority="46"/>
+    <w:lsdException w:name="List Table 2 Accent 3" w:uiPriority="47"/>
+    <w:lsdException w:name="List Table 3 Accent 3" w:uiPriority="48"/>
+    <w:lsdException w:name="List Table 4 Accent 3" w:uiPriority="49"/>
+    <w:lsdException w:name="List Table 5 Dark Accent 3" w:uiPriority="50"/>
+    <w:lsdException w:name="List Table 6 Colorful Accent 3" w:uiPriority="51"/>
+    <w:lsdException w:name="List Table 7 Colorful Accent 3" w:uiPriority="52"/>
+    <w:lsdException w:name="List Table 1 Light Accent 4" w:uiPriority="46"/>
+    <w:lsdException w:name="List Table 2 Accent 4" w:uiPriority="47"/>
+    <w:lsdException w:name="List Table 3 Accent 4" w:uiPriority="48"/>
+    <w:lsdException w:name="List Table 4 Accent 4" w:uiPriority="49"/>
+    <w:lsdException w:name="List Table 5 Dark Accent 4" w:uiPriority="50"/>
+    <w:lsdException w:name="List Table 6 Colorful Accent 4" w:uiPriority="51"/>
+    <w:lsdException w:name="List Table 7 Colorful Accent 4" w:uiPriority="52"/>
+    <w:lsdException w:name="List Table 1 Light Accent 5" w:uiPriority="46"/>
+    <w:lsdException w:name="List Table 2 Accent 5" w:uiPriority="47"/>
+    <w:lsdException w:name="List Table 3 Accent 5" w:uiPriority="48"/>
+    <w:lsdException w:name="List Table 4 Accent 5" w:uiPriority="49"/>
+    <w:lsdException w:name="List Table 5 Dark Accent 5" w:uiPriority="50"/>
+    <w:lsdException w:name="List Table 6 Colorful Accent 5" w:uiPriority="51"/>
+    <w:lsdException w:name="List Table 7 Colorful Accent 5" w:uiPriority="52"/>
+    <w:lsdException w:name="List Table 1 Light Accent 6" w:uiPriority="46"/>
+    <w:lsdException w:name="List Table 2 Accent 6" w:uiPriority="47"/>
+    <w:lsdException w:name="List Table 3 Accent 6" w:uiPriority="48"/>
+    <w:lsdException w:name="List Table 4 Accent 6" w:uiPriority="49"/>
+    <w:lsdException w:name="List Table 5 Dark Accent 6" w:uiPriority="50"/>
+    <w:lsdException w:name="List Table 6 Colorful Accent 6" w:uiPriority="51"/>
+    <w:lsdException w:name="List Table 7 Colorful Accent 6" w:uiPriority="52"/>
+    <w:lsdException w:name="Mention" w:semiHidden="1" w:unhideWhenUsed="1"/>
+    <w:lsdException w:name="Smart Hyperlink" w:semiHidden="1" w:unhideWhenUsed="1"/>
+    <w:lsdException w:name="Hashtag" w:semiHidden="1" w:unhideWhenUsed="1"/>
+    <w:lsdException w:name="Unresolved Mention" w:semiHidden="1" w:unhideWhenUsed="1"/>
+    <w:lsdException w:name="Smart Link" w:semiHidden="1" w:unhideWhenUsed="1"/>
+  </w:latentStyles>
+  <w:style w:type="paragraph" w:default="1" w:styleId="Normal">
+    <w:name w:val="Normal"/>
     <w:qFormat/>
-    <w:rPr>
-      <w:sz w:val="56"/>
-      <w:szCs w:val="56"/>
-    </w:rPr>
   </w:style>
   <w:style w:type="paragraph" w:styleId="Heading1">
-    <w:name w:val="Heading 1"/>
-    <w:basedOn w:val="Normal"/>
-    <w:next w:val="Normal"/>
+    <w:name w:val="heading 1"/>
+    <w:uiPriority w:val="9"/>
     <w:qFormat/>
+    <w:pPr>
+      <w:outlineLvl w:val="0"/>
+    </w:pPr>
     <w:rPr>
       <w:color w:val="2E74B5"/>
       <w:sz w:val="32"/>
@@ -1952,10 +3180,13 @@
     </w:rPr>
   </w:style>
   <w:style w:type="paragraph" w:styleId="Heading2">
-    <w:name w:val="Heading 2"/>
-    <w:basedOn w:val="Normal"/>
-    <w:next w:val="Normal"/>
+    <w:name w:val="heading 2"/>
+    <w:uiPriority w:val="9"/>
+    <w:unhideWhenUsed/>
     <w:qFormat/>
+    <w:pPr>
+      <w:outlineLvl w:val="1"/>
+    </w:pPr>
     <w:rPr>
       <w:color w:val="2E74B5"/>
       <w:sz w:val="26"/>
@@ -1963,10 +3194,14 @@
     </w:rPr>
   </w:style>
   <w:style w:type="paragraph" w:styleId="Heading3">
-    <w:name w:val="Heading 3"/>
-    <w:basedOn w:val="Normal"/>
-    <w:next w:val="Normal"/>
+    <w:name w:val="heading 3"/>
+    <w:uiPriority w:val="9"/>
+    <w:semiHidden/>
+    <w:unhideWhenUsed/>
     <w:qFormat/>
+    <w:pPr>
+      <w:outlineLvl w:val="2"/>
+    </w:pPr>
     <w:rPr>
       <w:color w:val="1F4D78"/>
       <w:sz w:val="24"/>
@@ -1974,10 +3209,14 @@
     </w:rPr>
   </w:style>
   <w:style w:type="paragraph" w:styleId="Heading4">
-    <w:name w:val="Heading 4"/>
-    <w:basedOn w:val="Normal"/>
-    <w:next w:val="Normal"/>
+    <w:name w:val="heading 4"/>
+    <w:uiPriority w:val="9"/>
+    <w:semiHidden/>
+    <w:unhideWhenUsed/>
     <w:qFormat/>
+    <w:pPr>
+      <w:outlineLvl w:val="3"/>
+    </w:pPr>
     <w:rPr>
       <w:i/>
       <w:iCs/>
@@ -1985,27 +3224,69 @@
     </w:rPr>
   </w:style>
   <w:style w:type="paragraph" w:styleId="Heading5">
-    <w:name w:val="Heading 5"/>
-    <w:basedOn w:val="Normal"/>
-    <w:next w:val="Normal"/>
+    <w:name w:val="heading 5"/>
+    <w:uiPriority w:val="9"/>
+    <w:semiHidden/>
+    <w:unhideWhenUsed/>
     <w:qFormat/>
+    <w:pPr>
+      <w:outlineLvl w:val="4"/>
+    </w:pPr>
     <w:rPr>
       <w:color w:val="2E74B5"/>
     </w:rPr>
   </w:style>
   <w:style w:type="paragraph" w:styleId="Heading6">
-    <w:name w:val="Heading 6"/>
-    <w:basedOn w:val="Normal"/>
-    <w:next w:val="Normal"/>
+    <w:name w:val="heading 6"/>
+    <w:uiPriority w:val="9"/>
+    <w:semiHidden/>
+    <w:unhideWhenUsed/>
     <w:qFormat/>
+    <w:pPr>
+      <w:outlineLvl w:val="5"/>
+    </w:pPr>
     <w:rPr>
       <w:color w:val="1F4D78"/>
     </w:rPr>
   </w:style>
-  <w:style w:type="paragraph" w:styleId="Strong">
-    <w:name w:val="Strong"/>
-    <w:basedOn w:val="Normal"/>
-    <w:next w:val="Normal"/>
+  <w:style w:type="character" w:default="1" w:styleId="DefaultParagraphFont">
+    <w:name w:val="Default Paragraph Font"/>
+    <w:uiPriority w:val="1"/>
+    <w:semiHidden/>
+    <w:unhideWhenUsed/>
+  </w:style>
+  <w:style w:type="table" w:default="1" w:styleId="TableNormal">
+    <w:name w:val="Normal Table"/>
+    <w:uiPriority w:val="99"/>
+    <w:semiHidden/>
+    <w:unhideWhenUsed/>
+    <w:tblPr>
+      <w:tblInd w:w="0" w:type="dxa"/>
+      <w:tblCellMar>
+        <w:top w:w="0" w:type="dxa"/>
+        <w:left w:w="108" w:type="dxa"/>
+        <w:bottom w:w="0" w:type="dxa"/>
+        <w:right w:w="108" w:type="dxa"/>
+      </w:tblCellMar>
+    </w:tblPr>
+  </w:style>
+  <w:style w:type="numbering" w:default="1" w:styleId="NoList">
+    <w:name w:val="No List"/>
+    <w:uiPriority w:val="99"/>
+    <w:semiHidden/>
+    <w:unhideWhenUsed/>
+  </w:style>
+  <w:style w:type="paragraph" w:styleId="Title">
+    <w:name w:val="Title"/>
+    <w:uiPriority w:val="10"/>
+    <w:qFormat/>
+    <w:rPr>
+      <w:sz w:val="56"/>
+      <w:szCs w:val="56"/>
+    </w:rPr>
+  </w:style>
+  <w:style w:type="paragraph" w:customStyle="1" w:styleId="Strong1">
+    <w:name w:val="Strong1"/>
     <w:qFormat/>
     <w:rPr>
       <w:b/>
@@ -2014,12 +3295,10 @@
   </w:style>
   <w:style w:type="paragraph" w:styleId="ListParagraph">
     <w:name w:val="List Paragraph"/>
-    <w:basedOn w:val="Normal"/>
     <w:qFormat/>
   </w:style>
   <w:style w:type="character" w:styleId="Hyperlink">
     <w:name w:val="Hyperlink"/>
-    <w:basedOn w:val="DefaultParagraphFont"/>
     <w:uiPriority w:val="99"/>
     <w:unhideWhenUsed/>
     <w:rPr>
@@ -2029,7 +3308,6 @@
   </w:style>
   <w:style w:type="character" w:styleId="FootnoteReference">
     <w:name w:val="footnote reference"/>
-    <w:basedOn w:val="DefaultParagraphFont"/>
     <w:uiPriority w:val="99"/>
     <w:semiHidden/>
     <w:unhideWhenUsed/>
@@ -2039,22 +3317,17 @@
   </w:style>
   <w:style w:type="paragraph" w:styleId="FootnoteText">
     <w:name w:val="footnote text"/>
-    <w:basedOn w:val="Normal"/>
     <w:link w:val="FootnoteTextChar"/>
     <w:uiPriority w:val="99"/>
     <w:semiHidden/>
     <w:unhideWhenUsed/>
-    <w:pPr>
-      <w:spacing w:after="0" w:line="240" w:lineRule="auto"/>
-    </w:pPr>
     <w:rPr>
       <w:sz w:val="20"/>
       <w:szCs w:val="20"/>
     </w:rPr>
   </w:style>
-  <w:style w:type="character" w:styleId="FootnoteTextChar">
+  <w:style w:type="character" w:customStyle="1" w:styleId="FootnoteTextChar">
     <w:name w:val="Footnote Text Char"/>
-    <w:basedOn w:val="DefaultParagraphFont"/>
     <w:link w:val="FootnoteText"/>
     <w:uiPriority w:val="99"/>
     <w:semiHidden/>
@@ -2066,7 +3339,6 @@
   </w:style>
   <w:style w:type="character" w:styleId="EndnoteReference">
     <w:name w:val="endnote reference"/>
-    <w:basedOn w:val="DefaultParagraphFont"/>
     <w:uiPriority w:val="99"/>
     <w:semiHidden/>
     <w:unhideWhenUsed/>
@@ -2076,22 +3348,17 @@
   </w:style>
   <w:style w:type="paragraph" w:styleId="EndnoteText">
     <w:name w:val="endnote text"/>
-    <w:basedOn w:val="Normal"/>
     <w:link w:val="EndnoteTextChar"/>
     <w:uiPriority w:val="99"/>
     <w:semiHidden/>
     <w:unhideWhenUsed/>
-    <w:pPr>
-      <w:spacing w:after="0" w:line="240" w:lineRule="auto"/>
-    </w:pPr>
     <w:rPr>
       <w:sz w:val="20"/>
       <w:szCs w:val="20"/>
     </w:rPr>
   </w:style>
-  <w:style w:type="character" w:styleId="EndnoteTextChar">
+  <w:style w:type="character" w:customStyle="1" w:styleId="EndnoteTextChar">
     <w:name w:val="Endnote Text Char"/>
-    <w:basedOn w:val="DefaultParagraphFont"/>
     <w:link w:val="EndnoteText"/>
     <w:uiPriority w:val="99"/>
     <w:semiHidden/>
@@ -2101,5 +3368,362 @@
       <w:szCs w:val="20"/>
     </w:rPr>
   </w:style>
+  <w:style w:type="paragraph" w:styleId="Header">
+    <w:name w:val="header"/>
+    <w:basedOn w:val="Normal"/>
+    <w:link w:val="HeaderChar"/>
+    <w:uiPriority w:val="99"/>
+    <w:unhideWhenUsed/>
+    <w:rsid w:val="00A66CA4"/>
+    <w:pPr>
+      <w:tabs>
+        <w:tab w:val="center" w:pos="4513"/>
+        <w:tab w:val="right" w:pos="9026"/>
+      </w:tabs>
+    </w:pPr>
+  </w:style>
+  <w:style w:type="character" w:customStyle="1" w:styleId="HeaderChar">
+    <w:name w:val="Header Char"/>
+    <w:basedOn w:val="DefaultParagraphFont"/>
+    <w:link w:val="Header"/>
+    <w:uiPriority w:val="99"/>
+    <w:rsid w:val="00A66CA4"/>
+  </w:style>
+  <w:style w:type="paragraph" w:styleId="Footer">
+    <w:name w:val="footer"/>
+    <w:basedOn w:val="Normal"/>
+    <w:link w:val="FooterChar"/>
+    <w:uiPriority w:val="99"/>
+    <w:unhideWhenUsed/>
+    <w:rsid w:val="00A66CA4"/>
+    <w:pPr>
+      <w:tabs>
+        <w:tab w:val="center" w:pos="4513"/>
+        <w:tab w:val="right" w:pos="9026"/>
+      </w:tabs>
+    </w:pPr>
+  </w:style>
+  <w:style w:type="character" w:customStyle="1" w:styleId="FooterChar">
+    <w:name w:val="Footer Char"/>
+    <w:basedOn w:val="DefaultParagraphFont"/>
+    <w:link w:val="Footer"/>
+    <w:uiPriority w:val="99"/>
+    <w:rsid w:val="00A66CA4"/>
+  </w:style>
 </w:styles>
+</file>
+
+<file path=word/theme/theme1.xml><?xml version="1.0" encoding="utf-8"?>
+<a:theme xmlns:a="http://schemas.openxmlformats.org/drawingml/2006/main" name="Office Theme">
+  <a:themeElements>
+    <a:clrScheme name="Office">
+      <a:dk1>
+        <a:sysClr val="windowText" lastClr="000000"/>
+      </a:dk1>
+      <a:lt1>
+        <a:sysClr val="window" lastClr="FFFFFF"/>
+      </a:lt1>
+      <a:dk2>
+        <a:srgbClr val="0E2841"/>
+      </a:dk2>
+      <a:lt2>
+        <a:srgbClr val="E8E8E8"/>
+      </a:lt2>
+      <a:accent1>
+        <a:srgbClr val="156082"/>
+      </a:accent1>
+      <a:accent2>
+        <a:srgbClr val="E97132"/>
+      </a:accent2>
+      <a:accent3>
+        <a:srgbClr val="196B24"/>
+      </a:accent3>
+      <a:accent4>
+        <a:srgbClr val="0F9ED5"/>
+      </a:accent4>
+      <a:accent5>
+        <a:srgbClr val="A02B93"/>
+      </a:accent5>
+      <a:accent6>
+        <a:srgbClr val="4EA72E"/>
+      </a:accent6>
+      <a:hlink>
+        <a:srgbClr val="467886"/>
+      </a:hlink>
+      <a:folHlink>
+        <a:srgbClr val="96607D"/>
+      </a:folHlink>
+    </a:clrScheme>
+    <a:fontScheme name="Office">
+      <a:majorFont>
+        <a:latin typeface="Aptos Display" panose="02110004020202020204"/>
+        <a:ea typeface=""/>
+        <a:cs typeface=""/>
+        <a:font script="Jpan" typeface="游ゴシック Light"/>
+        <a:font script="Hang" typeface="맑은 고딕"/>
+        <a:font script="Hans" typeface="等线 Light"/>
+        <a:font script="Hant" typeface="新細明體"/>
+        <a:font script="Arab" typeface="Times New Roman"/>
+        <a:font script="Hebr" typeface="Times New Roman"/>
+        <a:font script="Thai" typeface="Angsana New"/>
+        <a:font script="Ethi" typeface="Nyala"/>
+        <a:font script="Beng" typeface="Vrinda"/>
+        <a:font script="Gujr" typeface="Shruti"/>
+        <a:font script="Khmr" typeface="MoolBoran"/>
+        <a:font script="Knda" typeface="Tunga"/>
+        <a:font script="Guru" typeface="Raavi"/>
+        <a:font script="Cans" typeface="Euphemia"/>
+        <a:font script="Cher" typeface="Plantagenet Cherokee"/>
+        <a:font script="Yiii" typeface="Microsoft Yi Baiti"/>
+        <a:font script="Tibt" typeface="Microsoft Himalaya"/>
+        <a:font script="Thaa" typeface="MV Boli"/>
+        <a:font script="Deva" typeface="Mangal"/>
+        <a:font script="Telu" typeface="Gautami"/>
+        <a:font script="Taml" typeface="Latha"/>
+        <a:font script="Syrc" typeface="Estrangelo Edessa"/>
+        <a:font script="Orya" typeface="Kalinga"/>
+        <a:font script="Mlym" typeface="Kartika"/>
+        <a:font script="Laoo" typeface="DokChampa"/>
+        <a:font script="Sinh" typeface="Iskoola Pota"/>
+        <a:font script="Mong" typeface="Mongolian Baiti"/>
+        <a:font script="Viet" typeface="Times New Roman"/>
+        <a:font script="Uigh" typeface="Microsoft Uighur"/>
+        <a:font script="Geor" typeface="Sylfaen"/>
+        <a:font script="Armn" typeface="Arial"/>
+        <a:font script="Bugi" typeface="Leelawadee UI"/>
+        <a:font script="Bopo" typeface="Microsoft JhengHei"/>
+        <a:font script="Java" typeface="Javanese Text"/>
+        <a:font script="Lisu" typeface="Segoe UI"/>
+        <a:font script="Mymr" typeface="Myanmar Text"/>
+        <a:font script="Nkoo" typeface="Ebrima"/>
+        <a:font script="Olck" typeface="Nirmala UI"/>
+        <a:font script="Osma" typeface="Ebrima"/>
+        <a:font script="Phag" typeface="Phagspa"/>
+        <a:font script="Syrn" typeface="Estrangelo Edessa"/>
+        <a:font script="Syrj" typeface="Estrangelo Edessa"/>
+        <a:font script="Syre" typeface="Estrangelo Edessa"/>
+        <a:font script="Sora" typeface="Nirmala UI"/>
+        <a:font script="Tale" typeface="Microsoft Tai Le"/>
+        <a:font script="Talu" typeface="Microsoft New Tai Lue"/>
+        <a:font script="Tfng" typeface="Ebrima"/>
+      </a:majorFont>
+      <a:minorFont>
+        <a:latin typeface="Aptos" panose="02110004020202020204"/>
+        <a:ea typeface=""/>
+        <a:cs typeface=""/>
+        <a:font script="Jpan" typeface="游明朝"/>
+        <a:font script="Hang" typeface="맑은 고딕"/>
+        <a:font script="Hans" typeface="等线"/>
+        <a:font script="Hant" typeface="新細明體"/>
+        <a:font script="Arab" typeface="Arial"/>
+        <a:font script="Hebr" typeface="Arial"/>
+        <a:font script="Thai" typeface="Cordia New"/>
+        <a:font script="Ethi" typeface="Nyala"/>
+        <a:font script="Beng" typeface="Vrinda"/>
+        <a:font script="Gujr" typeface="Shruti"/>
+        <a:font script="Khmr" typeface="DaunPenh"/>
+        <a:font script="Knda" typeface="Tunga"/>
+        <a:font script="Guru" typeface="Raavi"/>
+        <a:font script="Cans" typeface="Euphemia"/>
+        <a:font script="Cher" typeface="Plantagenet Cherokee"/>
+        <a:font script="Yiii" typeface="Microsoft Yi Baiti"/>
+        <a:font script="Tibt" typeface="Microsoft Himalaya"/>
+        <a:font script="Thaa" typeface="MV Boli"/>
+        <a:font script="Deva" typeface="Mangal"/>
+        <a:font script="Telu" typeface="Gautami"/>
+        <a:font script="Taml" typeface="Latha"/>
+        <a:font script="Syrc" typeface="Estrangelo Edessa"/>
+        <a:font script="Orya" typeface="Kalinga"/>
+        <a:font script="Mlym" typeface="Kartika"/>
+        <a:font script="Laoo" typeface="DokChampa"/>
+        <a:font script="Sinh" typeface="Iskoola Pota"/>
+        <a:font script="Mong" typeface="Mongolian Baiti"/>
+        <a:font script="Viet" typeface="Arial"/>
+        <a:font script="Uigh" typeface="Microsoft Uighur"/>
+        <a:font script="Geor" typeface="Sylfaen"/>
+        <a:font script="Armn" typeface="Arial"/>
+        <a:font script="Bugi" typeface="Leelawadee UI"/>
+        <a:font script="Bopo" typeface="Microsoft JhengHei"/>
+        <a:font script="Java" typeface="Javanese Text"/>
+        <a:font script="Lisu" typeface="Segoe UI"/>
+        <a:font script="Mymr" typeface="Myanmar Text"/>
+        <a:font script="Nkoo" typeface="Ebrima"/>
+        <a:font script="Olck" typeface="Nirmala UI"/>
+        <a:font script="Osma" typeface="Ebrima"/>
+        <a:font script="Phag" typeface="Phagspa"/>
+        <a:font script="Syrn" typeface="Estrangelo Edessa"/>
+        <a:font script="Syrj" typeface="Estrangelo Edessa"/>
+        <a:font script="Syre" typeface="Estrangelo Edessa"/>
+        <a:font script="Sora" typeface="Nirmala UI"/>
+        <a:font script="Tale" typeface="Microsoft Tai Le"/>
+        <a:font script="Talu" typeface="Microsoft New Tai Lue"/>
+        <a:font script="Tfng" typeface="Ebrima"/>
+      </a:minorFont>
+    </a:fontScheme>
+    <a:fmtScheme name="Office">
+      <a:fillStyleLst>
+        <a:solidFill>
+          <a:schemeClr val="phClr"/>
+        </a:solidFill>
+        <a:gradFill rotWithShape="1">
+          <a:gsLst>
+            <a:gs pos="0">
+              <a:schemeClr val="phClr">
+                <a:lumMod val="110000"/>
+                <a:satMod val="105000"/>
+                <a:tint val="67000"/>
+              </a:schemeClr>
+            </a:gs>
+            <a:gs pos="50000">
+              <a:schemeClr val="phClr">
+                <a:lumMod val="105000"/>
+                <a:satMod val="103000"/>
+                <a:tint val="73000"/>
+              </a:schemeClr>
+            </a:gs>
+            <a:gs pos="100000">
+              <a:schemeClr val="phClr">
+                <a:lumMod val="105000"/>
+                <a:satMod val="109000"/>
+                <a:tint val="81000"/>
+              </a:schemeClr>
+            </a:gs>
+          </a:gsLst>
+          <a:lin ang="5400000" scaled="0"/>
+        </a:gradFill>
+        <a:gradFill rotWithShape="1">
+          <a:gsLst>
+            <a:gs pos="0">
+              <a:schemeClr val="phClr">
+                <a:satMod val="103000"/>
+                <a:lumMod val="102000"/>
+                <a:tint val="94000"/>
+              </a:schemeClr>
+            </a:gs>
+            <a:gs pos="50000">
+              <a:schemeClr val="phClr">
+                <a:satMod val="110000"/>
+                <a:lumMod val="100000"/>
+                <a:shade val="100000"/>
+              </a:schemeClr>
+            </a:gs>
+            <a:gs pos="100000">
+              <a:schemeClr val="phClr">
+                <a:lumMod val="99000"/>
+                <a:satMod val="120000"/>
+                <a:shade val="78000"/>
+              </a:schemeClr>
+            </a:gs>
+          </a:gsLst>
+          <a:lin ang="5400000" scaled="0"/>
+        </a:gradFill>
+      </a:fillStyleLst>
+      <a:lnStyleLst>
+        <a:ln w="12700" cap="flat" cmpd="sng" algn="ctr">
+          <a:solidFill>
+            <a:schemeClr val="phClr"/>
+          </a:solidFill>
+          <a:prstDash val="solid"/>
+          <a:miter lim="800000"/>
+        </a:ln>
+        <a:ln w="19050" cap="flat" cmpd="sng" algn="ctr">
+          <a:solidFill>
+            <a:schemeClr val="phClr"/>
+          </a:solidFill>
+          <a:prstDash val="solid"/>
+          <a:miter lim="800000"/>
+        </a:ln>
+        <a:ln w="25400" cap="flat" cmpd="sng" algn="ctr">
+          <a:solidFill>
+            <a:schemeClr val="phClr"/>
+          </a:solidFill>
+          <a:prstDash val="solid"/>
+          <a:miter lim="800000"/>
+        </a:ln>
+      </a:lnStyleLst>
+      <a:effectStyleLst>
+        <a:effectStyle>
+          <a:effectLst/>
+        </a:effectStyle>
+        <a:effectStyle>
+          <a:effectLst/>
+        </a:effectStyle>
+        <a:effectStyle>
+          <a:effectLst>
+            <a:outerShdw blurRad="57150" dist="19050" dir="5400000" algn="ctr" rotWithShape="0">
+              <a:srgbClr val="000000">
+                <a:alpha val="63000"/>
+              </a:srgbClr>
+            </a:outerShdw>
+          </a:effectLst>
+        </a:effectStyle>
+      </a:effectStyleLst>
+      <a:bgFillStyleLst>
+        <a:solidFill>
+          <a:schemeClr val="phClr"/>
+        </a:solidFill>
+        <a:solidFill>
+          <a:schemeClr val="phClr">
+            <a:tint val="95000"/>
+            <a:satMod val="170000"/>
+          </a:schemeClr>
+        </a:solidFill>
+        <a:gradFill rotWithShape="1">
+          <a:gsLst>
+            <a:gs pos="0">
+              <a:schemeClr val="phClr">
+                <a:tint val="93000"/>
+                <a:satMod val="150000"/>
+                <a:shade val="98000"/>
+                <a:lumMod val="102000"/>
+              </a:schemeClr>
+            </a:gs>
+            <a:gs pos="50000">
+              <a:schemeClr val="phClr">
+                <a:tint val="98000"/>
+                <a:satMod val="130000"/>
+                <a:shade val="90000"/>
+                <a:lumMod val="103000"/>
+              </a:schemeClr>
+            </a:gs>
+            <a:gs pos="100000">
+              <a:schemeClr val="phClr">
+                <a:shade val="63000"/>
+                <a:satMod val="120000"/>
+              </a:schemeClr>
+            </a:gs>
+          </a:gsLst>
+          <a:lin ang="5400000" scaled="0"/>
+        </a:gradFill>
+      </a:bgFillStyleLst>
+    </a:fmtScheme>
+  </a:themeElements>
+  <a:objectDefaults>
+    <a:lnDef>
+      <a:spPr/>
+      <a:bodyPr/>
+      <a:lstStyle/>
+      <a:style>
+        <a:lnRef idx="2">
+          <a:schemeClr val="accent1"/>
+        </a:lnRef>
+        <a:fillRef idx="0">
+          <a:schemeClr val="accent1"/>
+        </a:fillRef>
+        <a:effectRef idx="1">
+          <a:schemeClr val="accent1"/>
+        </a:effectRef>
+        <a:fontRef idx="minor">
+          <a:schemeClr val="tx1"/>
+        </a:fontRef>
+      </a:style>
+    </a:lnDef>
+  </a:objectDefaults>
+  <a:extraClrSchemeLst/>
+  <a:extLst>
+    <a:ext uri="{05A4C25C-085E-4340-85A3-A5531E510DB2}">
+      <thm15:themeFamily xmlns:thm15="http://schemas.microsoft.com/office/thememl/2012/main" name="Office Theme" id="{2E142A2C-CD16-42D6-873A-C26D2A0506FA}" vid="{1BDDFF52-6CD6-40A5-AB3C-68EB2F1E4D0A}"/>
+    </a:ext>
+  </a:extLst>
+</a:theme>
 </file>
</xml_diff>